<commit_message>
Anexo C: matriz detallada de casos de prueba con respuesta esperada/obtenida, criterios y evidencia
Co-Authored-By: Claude Sonnet 5.5 <noreply@anthropic.com>
</commit_message>
<xml_diff>
--- a/anexos/3_Informe_Pruebas_Funcionales_Ada.docx
+++ b/anexos/3_Informe_Pruebas_Funcionales_Ada.docx
@@ -2165,6 +2165,3431 @@
           <w:sz w:val="30"/>
           <w:szCs w:val="30"/>
         </w:rPr>
+        <w:t xml:space="preserve">Matriz detallada de casos de prueba (Objetivo 3)</w:t>
+      </w:r>
+    </w:p>
+    <w:p>
+      <w:pPr>
+        <w:spacing w:after="160" w:line="288"/>
+        <w:jc w:val="both"/>
+      </w:pPr>
+      <w:r>
+        <w:rPr>
+          <w:rFonts w:ascii="Calibri" w:cs="Calibri" w:eastAsia="Calibri" w:hAnsi="Calibri"/>
+          <w:b w:val="false"/>
+          <w:bCs w:val="false"/>
+          <w:i w:val="false"/>
+          <w:iCs w:val="false"/>
+          <w:color w:val="222222"/>
+          <w:sz w:val="22"/>
+          <w:szCs w:val="22"/>
+        </w:rPr>
+        <w:t xml:space="preserve">Esta sección amplía la matriz del informe final. Para cada caso se registran la consulta realizada, la respuesta esperada (derivada de la información real almacenada en Moodle), la respuesta obtenida, el criterio de aceptación aplicado, el resultado, el tiempo de respuesta y la evidencia, que corresponde a las capturas de pantalla del Anexo D (Caso n).</w:t>
+      </w:r>
+    </w:p>
+    <w:p>
+      <w:pPr>
+        <w:pStyle w:val="Heading2"/>
+        <w:spacing w:after="140" w:before="320"/>
+      </w:pPr>
+      <w:r>
+        <w:rPr>
+          <w:rFonts w:ascii="Calibri" w:cs="Calibri" w:eastAsia="Calibri" w:hAnsi="Calibri"/>
+          <w:b/>
+          <w:bCs/>
+          <w:color w:val="4E95C2"/>
+          <w:sz w:val="24"/>
+          <w:szCs w:val="24"/>
+        </w:rPr>
+        <w:t xml:space="preserve">Criterios de aceptación por categoría</w:t>
+      </w:r>
+    </w:p>
+    <w:tbl>
+      <w:tblPr>
+        <w:tblW w:w="5000" w:type="pct"/>
+        <w:tblBorders>
+          <w:top w:val="single" w:sz="4" w:space="0" w:color="C9D2D6"/>
+          <w:left w:val="single" w:sz="4" w:space="0" w:color="C9D2D6"/>
+          <w:bottom w:val="single" w:sz="4" w:space="0" w:color="C9D2D6"/>
+          <w:right w:val="single" w:sz="4" w:space="0" w:color="C9D2D6"/>
+          <w:insideH w:val="single" w:sz="2" w:space="0" w:color="C9D2D6"/>
+          <w:insideV w:val="single" w:sz="2" w:space="0" w:color="C9D2D6"/>
+        </w:tblBorders>
+        <w:tblCellMar>
+          <w:left w:w="10" w:type="dxa"/>
+          <w:right w:w="10" w:type="dxa"/>
+        </w:tblCellMar>
+        <w:tblLook w:val="04A0" w:firstRow="1" w:lastRow="0" w:firstColumn="1" w:lastColumn="0" w:noHBand="0" w:noVBand="1"/>
+      </w:tblPr>
+      <w:tblGrid>
+        <w:gridCol w:w="900"/>
+        <w:gridCol w:w="2200"/>
+        <w:gridCol w:w="5900"/>
+      </w:tblGrid>
+      <w:tr>
+        <w:trPr>
+          <w:tblHeader/>
+        </w:trPr>
+        <w:tc>
+          <w:tcPr>
+            <w:tcW w:w="900" w:type="dxa"/>
+            <w:shd w:val="clear" w:color="auto" w:fill="24425E"/>
+            <w:tcMar>
+              <w:top w:w="100" w:type="dxa"/>
+              <w:left w:w="120" w:type="dxa"/>
+              <w:bottom w:w="100" w:type="dxa"/>
+              <w:right w:w="120" w:type="dxa"/>
+            </w:tcMar>
+            <w:vAlign w:val="center"/>
+          </w:tcPr>
+          <w:p>
+            <w:r>
+              <w:rPr>
+                <w:rFonts w:ascii="Calibri" w:eastAsia="Calibri" w:hAnsi="Calibri" w:cs="Calibri"/>
+                <w:b/>
+                <w:bCs/>
+                <w:color w:val="FFFFFF"/>
+                <w:sz w:val="20"/>
+                <w:szCs w:val="20"/>
+              </w:rPr>
+              <w:t xml:space="preserve">Código</w:t>
+            </w:r>
+          </w:p>
+        </w:tc>
+        <w:tc>
+          <w:tcPr>
+            <w:tcW w:w="2200" w:type="dxa"/>
+            <w:shd w:val="clear" w:color="auto" w:fill="24425E"/>
+            <w:tcMar>
+              <w:top w:w="100" w:type="dxa"/>
+              <w:left w:w="120" w:type="dxa"/>
+              <w:bottom w:w="100" w:type="dxa"/>
+              <w:right w:w="120" w:type="dxa"/>
+            </w:tcMar>
+            <w:vAlign w:val="center"/>
+          </w:tcPr>
+          <w:p>
+            <w:r>
+              <w:rPr>
+                <w:rFonts w:ascii="Calibri" w:eastAsia="Calibri" w:hAnsi="Calibri" w:cs="Calibri"/>
+                <w:b/>
+                <w:bCs/>
+                <w:color w:val="FFFFFF"/>
+                <w:sz w:val="20"/>
+                <w:szCs w:val="20"/>
+              </w:rPr>
+              <w:t xml:space="preserve">Categoría</w:t>
+            </w:r>
+          </w:p>
+        </w:tc>
+        <w:tc>
+          <w:tcPr>
+            <w:tcW w:w="5900" w:type="dxa"/>
+            <w:shd w:val="clear" w:color="auto" w:fill="24425E"/>
+            <w:tcMar>
+              <w:top w:w="100" w:type="dxa"/>
+              <w:left w:w="120" w:type="dxa"/>
+              <w:bottom w:w="100" w:type="dxa"/>
+              <w:right w:w="120" w:type="dxa"/>
+            </w:tcMar>
+            <w:vAlign w:val="center"/>
+          </w:tcPr>
+          <w:p>
+            <w:r>
+              <w:rPr>
+                <w:rFonts w:ascii="Calibri" w:eastAsia="Calibri" w:hAnsi="Calibri" w:cs="Calibri"/>
+                <w:b/>
+                <w:bCs/>
+                <w:color w:val="FFFFFF"/>
+                <w:sz w:val="20"/>
+                <w:szCs w:val="20"/>
+              </w:rPr>
+              <w:t xml:space="preserve">Criterio de aceptación</w:t>
+            </w:r>
+          </w:p>
+        </w:tc>
+      </w:tr>
+      <w:tr>
+        <w:trPr>
+          <w:cantSplit/>
+        </w:trPr>
+        <w:tc>
+          <w:tcPr>
+            <w:tcW w:w="900" w:type="dxa"/>
+            <w:shd w:val="clear" w:color="auto" w:fill="FFFFFF"/>
+            <w:tcMar>
+              <w:top w:w="100" w:type="dxa"/>
+              <w:left w:w="120" w:type="dxa"/>
+              <w:bottom w:w="100" w:type="dxa"/>
+              <w:right w:w="120" w:type="dxa"/>
+            </w:tcMar>
+            <w:vAlign w:val="center"/>
+          </w:tcPr>
+          <w:p>
+            <w:r>
+              <w:rPr>
+                <w:rFonts w:ascii="Calibri" w:eastAsia="Calibri" w:hAnsi="Calibri" w:cs="Calibri"/>
+                <w:b/>
+                <w:bCs/>
+                <w:color w:val="222222"/>
+                <w:sz w:val="20"/>
+                <w:szCs w:val="20"/>
+              </w:rPr>
+              <w:t xml:space="preserve">C1</w:t>
+            </w:r>
+          </w:p>
+        </w:tc>
+        <w:tc>
+          <w:tcPr>
+            <w:tcW w:w="2200" w:type="dxa"/>
+            <w:shd w:val="clear" w:color="auto" w:fill="FFFFFF"/>
+            <w:tcMar>
+              <w:top w:w="100" w:type="dxa"/>
+              <w:left w:w="120" w:type="dxa"/>
+              <w:bottom w:w="100" w:type="dxa"/>
+              <w:right w:w="120" w:type="dxa"/>
+            </w:tcMar>
+            <w:vAlign w:val="center"/>
+          </w:tcPr>
+          <w:p>
+            <w:r>
+              <w:rPr>
+                <w:rFonts w:ascii="Calibri" w:eastAsia="Calibri" w:hAnsi="Calibri" w:cs="Calibri"/>
+                <w:color w:val="222222"/>
+                <w:sz w:val="20"/>
+                <w:szCs w:val="20"/>
+              </w:rPr>
+              <w:t xml:space="preserve">Saludo genérico</w:t>
+            </w:r>
+          </w:p>
+        </w:tc>
+        <w:tc>
+          <w:tcPr>
+            <w:tcW w:w="5900" w:type="dxa"/>
+            <w:shd w:val="clear" w:color="auto" w:fill="FFFFFF"/>
+            <w:tcMar>
+              <w:top w:w="100" w:type="dxa"/>
+              <w:left w:w="120" w:type="dxa"/>
+              <w:bottom w:w="100" w:type="dxa"/>
+              <w:right w:w="120" w:type="dxa"/>
+            </w:tcMar>
+            <w:vAlign w:val="center"/>
+          </w:tcPr>
+          <w:p>
+            <w:r>
+              <w:rPr>
+                <w:rFonts w:ascii="Calibri" w:eastAsia="Calibri" w:hAnsi="Calibri" w:cs="Calibri"/>
+                <w:color w:val="222222"/>
+                <w:sz w:val="20"/>
+                <w:szCs w:val="20"/>
+              </w:rPr>
+              <w:t xml:space="preserve">Responde con el saludo de presentación de Ada de forma inmediata y sin incluir datos específicos de cursos.</w:t>
+            </w:r>
+          </w:p>
+        </w:tc>
+      </w:tr>
+      <w:tr>
+        <w:trPr>
+          <w:cantSplit/>
+        </w:trPr>
+        <w:tc>
+          <w:tcPr>
+            <w:tcW w:w="900" w:type="dxa"/>
+            <w:shd w:val="clear" w:color="auto" w:fill="F2F4F5"/>
+            <w:tcMar>
+              <w:top w:w="100" w:type="dxa"/>
+              <w:left w:w="120" w:type="dxa"/>
+              <w:bottom w:w="100" w:type="dxa"/>
+              <w:right w:w="120" w:type="dxa"/>
+            </w:tcMar>
+            <w:vAlign w:val="center"/>
+          </w:tcPr>
+          <w:p>
+            <w:r>
+              <w:rPr>
+                <w:rFonts w:ascii="Calibri" w:eastAsia="Calibri" w:hAnsi="Calibri" w:cs="Calibri"/>
+                <w:b/>
+                <w:bCs/>
+                <w:color w:val="222222"/>
+                <w:sz w:val="20"/>
+                <w:szCs w:val="20"/>
+              </w:rPr>
+              <w:t xml:space="preserve">C2</w:t>
+            </w:r>
+          </w:p>
+        </w:tc>
+        <w:tc>
+          <w:tcPr>
+            <w:tcW w:w="2200" w:type="dxa"/>
+            <w:shd w:val="clear" w:color="auto" w:fill="F2F4F5"/>
+            <w:tcMar>
+              <w:top w:w="100" w:type="dxa"/>
+              <w:left w:w="120" w:type="dxa"/>
+              <w:bottom w:w="100" w:type="dxa"/>
+              <w:right w:w="120" w:type="dxa"/>
+            </w:tcMar>
+            <w:vAlign w:val="center"/>
+          </w:tcPr>
+          <w:p>
+            <w:r>
+              <w:rPr>
+                <w:rFonts w:ascii="Calibri" w:eastAsia="Calibri" w:hAnsi="Calibri" w:cs="Calibri"/>
+                <w:color w:val="222222"/>
+                <w:sz w:val="20"/>
+                <w:szCs w:val="20"/>
+              </w:rPr>
+              <w:t xml:space="preserve">Listado de cursos</w:t>
+            </w:r>
+          </w:p>
+        </w:tc>
+        <w:tc>
+          <w:tcPr>
+            <w:tcW w:w="5900" w:type="dxa"/>
+            <w:shd w:val="clear" w:color="auto" w:fill="F2F4F5"/>
+            <w:tcMar>
+              <w:top w:w="100" w:type="dxa"/>
+              <w:left w:w="120" w:type="dxa"/>
+              <w:bottom w:w="100" w:type="dxa"/>
+              <w:right w:w="120" w:type="dxa"/>
+            </w:tcMar>
+            <w:vAlign w:val="center"/>
+          </w:tcPr>
+          <w:p>
+            <w:r>
+              <w:rPr>
+                <w:rFonts w:ascii="Calibri" w:eastAsia="Calibri" w:hAnsi="Calibri" w:cs="Calibri"/>
+                <w:color w:val="222222"/>
+                <w:sz w:val="20"/>
+                <w:szCs w:val="20"/>
+              </w:rPr>
+              <w:t xml:space="preserve">Menciona todos los cursos disponibles en Moodle, con su nombre exacto, y no agrega cursos inexistentes.</w:t>
+            </w:r>
+          </w:p>
+        </w:tc>
+      </w:tr>
+      <w:tr>
+        <w:trPr>
+          <w:cantSplit/>
+        </w:trPr>
+        <w:tc>
+          <w:tcPr>
+            <w:tcW w:w="900" w:type="dxa"/>
+            <w:shd w:val="clear" w:color="auto" w:fill="FFFFFF"/>
+            <w:tcMar>
+              <w:top w:w="100" w:type="dxa"/>
+              <w:left w:w="120" w:type="dxa"/>
+              <w:bottom w:w="100" w:type="dxa"/>
+              <w:right w:w="120" w:type="dxa"/>
+            </w:tcMar>
+            <w:vAlign w:val="center"/>
+          </w:tcPr>
+          <w:p>
+            <w:r>
+              <w:rPr>
+                <w:rFonts w:ascii="Calibri" w:eastAsia="Calibri" w:hAnsi="Calibri" w:cs="Calibri"/>
+                <w:b/>
+                <w:bCs/>
+                <w:color w:val="222222"/>
+                <w:sz w:val="20"/>
+                <w:szCs w:val="20"/>
+              </w:rPr>
+              <w:t xml:space="preserve">C3</w:t>
+            </w:r>
+          </w:p>
+        </w:tc>
+        <w:tc>
+          <w:tcPr>
+            <w:tcW w:w="2200" w:type="dxa"/>
+            <w:shd w:val="clear" w:color="auto" w:fill="FFFFFF"/>
+            <w:tcMar>
+              <w:top w:w="100" w:type="dxa"/>
+              <w:left w:w="120" w:type="dxa"/>
+              <w:bottom w:w="100" w:type="dxa"/>
+              <w:right w:w="120" w:type="dxa"/>
+            </w:tcMar>
+            <w:vAlign w:val="center"/>
+          </w:tcPr>
+          <w:p>
+            <w:r>
+              <w:rPr>
+                <w:rFonts w:ascii="Calibri" w:eastAsia="Calibri" w:hAnsi="Calibri" w:cs="Calibri"/>
+                <w:color w:val="222222"/>
+                <w:sz w:val="20"/>
+                <w:szCs w:val="20"/>
+              </w:rPr>
+              <w:t xml:space="preserve">Detalle de unidades</w:t>
+            </w:r>
+          </w:p>
+        </w:tc>
+        <w:tc>
+          <w:tcPr>
+            <w:tcW w:w="5900" w:type="dxa"/>
+            <w:shd w:val="clear" w:color="auto" w:fill="FFFFFF"/>
+            <w:tcMar>
+              <w:top w:w="100" w:type="dxa"/>
+              <w:left w:w="120" w:type="dxa"/>
+              <w:bottom w:w="100" w:type="dxa"/>
+              <w:right w:w="120" w:type="dxa"/>
+            </w:tcMar>
+            <w:vAlign w:val="center"/>
+          </w:tcPr>
+          <w:p>
+            <w:r>
+              <w:rPr>
+                <w:rFonts w:ascii="Calibri" w:eastAsia="Calibri" w:hAnsi="Calibri" w:cs="Calibri"/>
+                <w:color w:val="222222"/>
+                <w:sz w:val="20"/>
+                <w:szCs w:val="20"/>
+              </w:rPr>
+              <w:t xml:space="preserve">Indica el número correcto de unidades y, para cada una, su nombre, porcentaje y contenidos, coincidentes con Moodle.</w:t>
+            </w:r>
+          </w:p>
+        </w:tc>
+      </w:tr>
+      <w:tr>
+        <w:trPr>
+          <w:cantSplit/>
+        </w:trPr>
+        <w:tc>
+          <w:tcPr>
+            <w:tcW w:w="900" w:type="dxa"/>
+            <w:shd w:val="clear" w:color="auto" w:fill="F2F4F5"/>
+            <w:tcMar>
+              <w:top w:w="100" w:type="dxa"/>
+              <w:left w:w="120" w:type="dxa"/>
+              <w:bottom w:w="100" w:type="dxa"/>
+              <w:right w:w="120" w:type="dxa"/>
+            </w:tcMar>
+            <w:vAlign w:val="center"/>
+          </w:tcPr>
+          <w:p>
+            <w:r>
+              <w:rPr>
+                <w:rFonts w:ascii="Calibri" w:eastAsia="Calibri" w:hAnsi="Calibri" w:cs="Calibri"/>
+                <w:b/>
+                <w:bCs/>
+                <w:color w:val="222222"/>
+                <w:sz w:val="20"/>
+                <w:szCs w:val="20"/>
+              </w:rPr>
+              <w:t xml:space="preserve">C4</w:t>
+            </w:r>
+          </w:p>
+        </w:tc>
+        <w:tc>
+          <w:tcPr>
+            <w:tcW w:w="2200" w:type="dxa"/>
+            <w:shd w:val="clear" w:color="auto" w:fill="F2F4F5"/>
+            <w:tcMar>
+              <w:top w:w="100" w:type="dxa"/>
+              <w:left w:w="120" w:type="dxa"/>
+              <w:bottom w:w="100" w:type="dxa"/>
+              <w:right w:w="120" w:type="dxa"/>
+            </w:tcMar>
+            <w:vAlign w:val="center"/>
+          </w:tcPr>
+          <w:p>
+            <w:r>
+              <w:rPr>
+                <w:rFonts w:ascii="Calibri" w:eastAsia="Calibri" w:hAnsi="Calibri" w:cs="Calibri"/>
+                <w:color w:val="222222"/>
+                <w:sz w:val="20"/>
+                <w:szCs w:val="20"/>
+              </w:rPr>
+              <w:t xml:space="preserve">Fuera de alcance</w:t>
+            </w:r>
+          </w:p>
+        </w:tc>
+        <w:tc>
+          <w:tcPr>
+            <w:tcW w:w="5900" w:type="dxa"/>
+            <w:shd w:val="clear" w:color="auto" w:fill="F2F4F5"/>
+            <w:tcMar>
+              <w:top w:w="100" w:type="dxa"/>
+              <w:left w:w="120" w:type="dxa"/>
+              <w:bottom w:w="100" w:type="dxa"/>
+              <w:right w:w="120" w:type="dxa"/>
+            </w:tcMar>
+            <w:vAlign w:val="center"/>
+          </w:tcPr>
+          <w:p>
+            <w:r>
+              <w:rPr>
+                <w:rFonts w:ascii="Calibri" w:eastAsia="Calibri" w:hAnsi="Calibri" w:cs="Calibri"/>
+                <w:color w:val="222222"/>
+                <w:sz w:val="20"/>
+                <w:szCs w:val="20"/>
+              </w:rPr>
+              <w:t xml:space="preserve">Rechaza cordialmente la solicitud sin resolverla y redirige al contenido de los cursos de la plataforma.</w:t>
+            </w:r>
+          </w:p>
+        </w:tc>
+      </w:tr>
+      <w:tr>
+        <w:trPr>
+          <w:cantSplit/>
+        </w:trPr>
+        <w:tc>
+          <w:tcPr>
+            <w:tcW w:w="900" w:type="dxa"/>
+            <w:shd w:val="clear" w:color="auto" w:fill="FFFFFF"/>
+            <w:tcMar>
+              <w:top w:w="100" w:type="dxa"/>
+              <w:left w:w="120" w:type="dxa"/>
+              <w:bottom w:w="100" w:type="dxa"/>
+              <w:right w:w="120" w:type="dxa"/>
+            </w:tcMar>
+            <w:vAlign w:val="center"/>
+          </w:tcPr>
+          <w:p>
+            <w:r>
+              <w:rPr>
+                <w:rFonts w:ascii="Calibri" w:eastAsia="Calibri" w:hAnsi="Calibri" w:cs="Calibri"/>
+                <w:b/>
+                <w:bCs/>
+                <w:color w:val="222222"/>
+                <w:sz w:val="20"/>
+                <w:szCs w:val="20"/>
+              </w:rPr>
+              <w:t xml:space="preserve">C5</w:t>
+            </w:r>
+          </w:p>
+        </w:tc>
+        <w:tc>
+          <w:tcPr>
+            <w:tcW w:w="2200" w:type="dxa"/>
+            <w:shd w:val="clear" w:color="auto" w:fill="FFFFFF"/>
+            <w:tcMar>
+              <w:top w:w="100" w:type="dxa"/>
+              <w:left w:w="120" w:type="dxa"/>
+              <w:bottom w:w="100" w:type="dxa"/>
+              <w:right w:w="120" w:type="dxa"/>
+            </w:tcMar>
+            <w:vAlign w:val="center"/>
+          </w:tcPr>
+          <w:p>
+            <w:r>
+              <w:rPr>
+                <w:rFonts w:ascii="Calibri" w:eastAsia="Calibri" w:hAnsi="Calibri" w:cs="Calibri"/>
+                <w:color w:val="222222"/>
+                <w:sz w:val="20"/>
+                <w:szCs w:val="20"/>
+              </w:rPr>
+              <w:t xml:space="preserve">Pregunta abierta / subjetiva</w:t>
+            </w:r>
+          </w:p>
+        </w:tc>
+        <w:tc>
+          <w:tcPr>
+            <w:tcW w:w="5900" w:type="dxa"/>
+            <w:shd w:val="clear" w:color="auto" w:fill="FFFFFF"/>
+            <w:tcMar>
+              <w:top w:w="100" w:type="dxa"/>
+              <w:left w:w="120" w:type="dxa"/>
+              <w:bottom w:w="100" w:type="dxa"/>
+              <w:right w:w="120" w:type="dxa"/>
+            </w:tcMar>
+            <w:vAlign w:val="center"/>
+          </w:tcPr>
+          <w:p>
+            <w:r>
+              <w:rPr>
+                <w:rFonts w:ascii="Calibri" w:eastAsia="Calibri" w:hAnsi="Calibri" w:cs="Calibri"/>
+                <w:color w:val="222222"/>
+                <w:sz w:val="20"/>
+                <w:szCs w:val="20"/>
+              </w:rPr>
+              <w:t xml:space="preserve">Responde de forma coherente y útil sobre los cursos, sin inventar datos (nombres, cifras o unidades) ni contradecir lo registrado en Moodle.</w:t>
+            </w:r>
+          </w:p>
+        </w:tc>
+      </w:tr>
+    </w:tbl>
+    <w:p>
+      <w:pPr>
+        <w:pStyle w:val="Heading2"/>
+        <w:spacing w:after="140" w:before="320"/>
+      </w:pPr>
+      <w:r>
+        <w:rPr>
+          <w:rFonts w:ascii="Calibri" w:cs="Calibri" w:eastAsia="Calibri" w:hAnsi="Calibri"/>
+          <w:b/>
+          <w:bCs/>
+          <w:color w:val="4E95C2"/>
+          <w:sz w:val="24"/>
+          <w:szCs w:val="24"/>
+        </w:rPr>
+        <w:t xml:space="preserve">Matriz de casos</w:t>
+      </w:r>
+    </w:p>
+    <w:tbl>
+      <w:tblPr>
+        <w:tblW w:w="5000" w:type="pct"/>
+        <w:tblBorders>
+          <w:top w:val="single" w:sz="4" w:space="0" w:color="C9D2D6"/>
+          <w:left w:val="single" w:sz="4" w:space="0" w:color="C9D2D6"/>
+          <w:bottom w:val="single" w:sz="4" w:space="0" w:color="C9D2D6"/>
+          <w:right w:val="single" w:sz="4" w:space="0" w:color="C9D2D6"/>
+          <w:insideH w:val="single" w:sz="2" w:space="0" w:color="C9D2D6"/>
+          <w:insideV w:val="single" w:sz="2" w:space="0" w:color="C9D2D6"/>
+        </w:tblBorders>
+        <w:tblCellMar>
+          <w:left w:w="10" w:type="dxa"/>
+          <w:right w:w="10" w:type="dxa"/>
+        </w:tblCellMar>
+        <w:tblLook w:val="04A0" w:firstRow="1" w:lastRow="0" w:firstColumn="1" w:lastColumn="0" w:noHBand="0" w:noVBand="1"/>
+      </w:tblPr>
+      <w:tblGrid>
+        <w:gridCol w:w="700"/>
+        <w:gridCol w:w="1600"/>
+        <w:gridCol w:w="1850"/>
+        <w:gridCol w:w="3250"/>
+        <w:gridCol w:w="1600"/>
+      </w:tblGrid>
+      <w:tr>
+        <w:trPr>
+          <w:tblHeader/>
+        </w:trPr>
+        <w:tc>
+          <w:tcPr>
+            <w:tcW w:w="700" w:type="dxa"/>
+            <w:shd w:val="clear" w:color="auto" w:fill="24425E"/>
+            <w:tcMar>
+              <w:top w:w="100" w:type="dxa"/>
+              <w:left w:w="120" w:type="dxa"/>
+              <w:bottom w:w="100" w:type="dxa"/>
+              <w:right w:w="120" w:type="dxa"/>
+            </w:tcMar>
+            <w:vAlign w:val="center"/>
+          </w:tcPr>
+          <w:p>
+            <w:r>
+              <w:rPr>
+                <w:rFonts w:ascii="Calibri" w:eastAsia="Calibri" w:hAnsi="Calibri" w:cs="Calibri"/>
+                <w:b/>
+                <w:bCs/>
+                <w:color w:val="FFFFFF"/>
+                <w:sz w:val="20"/>
+                <w:szCs w:val="20"/>
+              </w:rPr>
+              <w:t xml:space="preserve">Caso</w:t>
+            </w:r>
+          </w:p>
+        </w:tc>
+        <w:tc>
+          <w:tcPr>
+            <w:tcW w:w="1600" w:type="dxa"/>
+            <w:shd w:val="clear" w:color="auto" w:fill="24425E"/>
+            <w:tcMar>
+              <w:top w:w="100" w:type="dxa"/>
+              <w:left w:w="120" w:type="dxa"/>
+              <w:bottom w:w="100" w:type="dxa"/>
+              <w:right w:w="120" w:type="dxa"/>
+            </w:tcMar>
+            <w:vAlign w:val="center"/>
+          </w:tcPr>
+          <w:p>
+            <w:r>
+              <w:rPr>
+                <w:rFonts w:ascii="Calibri" w:eastAsia="Calibri" w:hAnsi="Calibri" w:cs="Calibri"/>
+                <w:b/>
+                <w:bCs/>
+                <w:color w:val="FFFFFF"/>
+                <w:sz w:val="20"/>
+                <w:szCs w:val="20"/>
+              </w:rPr>
+              <w:t xml:space="preserve">Consulta</w:t>
+            </w:r>
+          </w:p>
+        </w:tc>
+        <w:tc>
+          <w:tcPr>
+            <w:tcW w:w="1850" w:type="dxa"/>
+            <w:shd w:val="clear" w:color="auto" w:fill="24425E"/>
+            <w:tcMar>
+              <w:top w:w="100" w:type="dxa"/>
+              <w:left w:w="120" w:type="dxa"/>
+              <w:bottom w:w="100" w:type="dxa"/>
+              <w:right w:w="120" w:type="dxa"/>
+            </w:tcMar>
+            <w:vAlign w:val="center"/>
+          </w:tcPr>
+          <w:p>
+            <w:r>
+              <w:rPr>
+                <w:rFonts w:ascii="Calibri" w:eastAsia="Calibri" w:hAnsi="Calibri" w:cs="Calibri"/>
+                <w:b/>
+                <w:bCs/>
+                <w:color w:val="FFFFFF"/>
+                <w:sz w:val="20"/>
+                <w:szCs w:val="20"/>
+              </w:rPr>
+              <w:t xml:space="preserve">Respuesta esperada</w:t>
+            </w:r>
+          </w:p>
+        </w:tc>
+        <w:tc>
+          <w:tcPr>
+            <w:tcW w:w="3250" w:type="dxa"/>
+            <w:shd w:val="clear" w:color="auto" w:fill="24425E"/>
+            <w:tcMar>
+              <w:top w:w="100" w:type="dxa"/>
+              <w:left w:w="120" w:type="dxa"/>
+              <w:bottom w:w="100" w:type="dxa"/>
+              <w:right w:w="120" w:type="dxa"/>
+            </w:tcMar>
+            <w:vAlign w:val="center"/>
+          </w:tcPr>
+          <w:p>
+            <w:r>
+              <w:rPr>
+                <w:rFonts w:ascii="Calibri" w:eastAsia="Calibri" w:hAnsi="Calibri" w:cs="Calibri"/>
+                <w:b/>
+                <w:bCs/>
+                <w:color w:val="FFFFFF"/>
+                <w:sz w:val="20"/>
+                <w:szCs w:val="20"/>
+              </w:rPr>
+              <w:t xml:space="preserve">Respuesta obtenida</w:t>
+            </w:r>
+          </w:p>
+        </w:tc>
+        <w:tc>
+          <w:tcPr>
+            <w:tcW w:w="1600" w:type="dxa"/>
+            <w:shd w:val="clear" w:color="auto" w:fill="24425E"/>
+            <w:tcMar>
+              <w:top w:w="100" w:type="dxa"/>
+              <w:left w:w="120" w:type="dxa"/>
+              <w:bottom w:w="100" w:type="dxa"/>
+              <w:right w:w="120" w:type="dxa"/>
+            </w:tcMar>
+            <w:vAlign w:val="center"/>
+          </w:tcPr>
+          <w:p>
+            <w:r>
+              <w:rPr>
+                <w:rFonts w:ascii="Calibri" w:eastAsia="Calibri" w:hAnsi="Calibri" w:cs="Calibri"/>
+                <w:b/>
+                <w:bCs/>
+                <w:color w:val="FFFFFF"/>
+                <w:sz w:val="20"/>
+                <w:szCs w:val="20"/>
+              </w:rPr>
+              <w:t xml:space="preserve">Criterio · resultado · tiempo · evidencia</w:t>
+            </w:r>
+          </w:p>
+        </w:tc>
+      </w:tr>
+      <w:tr>
+        <w:trPr>
+          <w:cantSplit/>
+        </w:trPr>
+        <w:tc>
+          <w:tcPr>
+            <w:tcW w:w="700" w:type="dxa"/>
+            <w:shd w:val="clear" w:color="auto" w:fill="FFFFFF"/>
+            <w:tcMar>
+              <w:top w:w="100" w:type="dxa"/>
+              <w:left w:w="120" w:type="dxa"/>
+              <w:bottom w:w="100" w:type="dxa"/>
+              <w:right w:w="120" w:type="dxa"/>
+            </w:tcMar>
+            <w:vAlign w:val="center"/>
+          </w:tcPr>
+          <w:p>
+            <w:r>
+              <w:rPr>
+                <w:rFonts w:ascii="Calibri" w:eastAsia="Calibri" w:hAnsi="Calibri" w:cs="Calibri"/>
+                <w:b/>
+                <w:bCs/>
+                <w:color w:val="222222"/>
+                <w:sz w:val="20"/>
+                <w:szCs w:val="20"/>
+              </w:rPr>
+              <w:t xml:space="preserve">1</w:t>
+            </w:r>
+          </w:p>
+        </w:tc>
+        <w:tc>
+          <w:tcPr>
+            <w:tcW w:w="1600" w:type="dxa"/>
+            <w:shd w:val="clear" w:color="auto" w:fill="FFFFFF"/>
+            <w:tcMar>
+              <w:top w:w="100" w:type="dxa"/>
+              <w:left w:w="120" w:type="dxa"/>
+              <w:bottom w:w="100" w:type="dxa"/>
+              <w:right w:w="120" w:type="dxa"/>
+            </w:tcMar>
+            <w:vAlign w:val="center"/>
+          </w:tcPr>
+          <w:p>
+            <w:r>
+              <w:rPr>
+                <w:rFonts w:ascii="Calibri" w:eastAsia="Calibri" w:hAnsi="Calibri" w:cs="Calibri"/>
+                <w:color w:val="222222"/>
+                <w:sz w:val="20"/>
+                <w:szCs w:val="20"/>
+              </w:rPr>
+              <w:t xml:space="preserve">hola</w:t>
+            </w:r>
+          </w:p>
+        </w:tc>
+        <w:tc>
+          <w:tcPr>
+            <w:tcW w:w="1850" w:type="dxa"/>
+            <w:shd w:val="clear" w:color="auto" w:fill="FFFFFF"/>
+            <w:tcMar>
+              <w:top w:w="100" w:type="dxa"/>
+              <w:left w:w="120" w:type="dxa"/>
+              <w:bottom w:w="100" w:type="dxa"/>
+              <w:right w:w="120" w:type="dxa"/>
+            </w:tcMar>
+            <w:vAlign w:val="center"/>
+          </w:tcPr>
+          <w:p>
+            <w:r>
+              <w:rPr>
+                <w:rFonts w:ascii="Calibri" w:eastAsia="Calibri" w:hAnsi="Calibri" w:cs="Calibri"/>
+                <w:color w:val="222222"/>
+                <w:sz w:val="20"/>
+                <w:szCs w:val="20"/>
+              </w:rPr>
+              <w:t xml:space="preserve">Saludo de presentación de Ada, inmediato, sin datos de cursos.</w:t>
+            </w:r>
+          </w:p>
+        </w:tc>
+        <w:tc>
+          <w:tcPr>
+            <w:tcW w:w="3250" w:type="dxa"/>
+            <w:shd w:val="clear" w:color="auto" w:fill="FFFFFF"/>
+            <w:tcMar>
+              <w:top w:w="100" w:type="dxa"/>
+              <w:left w:w="120" w:type="dxa"/>
+              <w:bottom w:w="100" w:type="dxa"/>
+              <w:right w:w="120" w:type="dxa"/>
+            </w:tcMar>
+            <w:vAlign w:val="center"/>
+          </w:tcPr>
+          <w:p>
+            <w:r>
+              <w:rPr>
+                <w:rFonts w:ascii="Calibri" w:eastAsia="Calibri" w:hAnsi="Calibri" w:cs="Calibri"/>
+                <w:color w:val="222222"/>
+                <w:sz w:val="20"/>
+                <w:szCs w:val="20"/>
+              </w:rPr>
+              <w:t xml:space="preserve">«¡Hola! Qué bueno verte por aquí. Soy Ada, y estoy para ayudarte a moverte por tus cursos y resolver tus dudas. ¿Por dónde quieres empezar?» (respuesta fija, sin invocar al modelo).</w:t>
+            </w:r>
+          </w:p>
+        </w:tc>
+        <w:tc>
+          <w:tcPr>
+            <w:tcW w:w="1600" w:type="dxa"/>
+            <w:shd w:val="clear" w:color="auto" w:fill="FFFFFF"/>
+            <w:tcMar>
+              <w:top w:w="100" w:type="dxa"/>
+              <w:left w:w="120" w:type="dxa"/>
+              <w:bottom w:w="100" w:type="dxa"/>
+              <w:right w:w="120" w:type="dxa"/>
+            </w:tcMar>
+            <w:vAlign w:val="center"/>
+          </w:tcPr>
+          <w:p>
+            <w:r>
+              <w:rPr>
+                <w:rFonts w:ascii="Calibri" w:eastAsia="Calibri" w:hAnsi="Calibri" w:cs="Calibri"/>
+                <w:color w:val="222222"/>
+                <w:sz w:val="20"/>
+                <w:szCs w:val="20"/>
+              </w:rPr>
+              <w:t xml:space="preserve">C1: Correcto · &lt; 1 s · Anexo D, Caso 1</w:t>
+            </w:r>
+          </w:p>
+        </w:tc>
+      </w:tr>
+      <w:tr>
+        <w:trPr>
+          <w:cantSplit/>
+        </w:trPr>
+        <w:tc>
+          <w:tcPr>
+            <w:tcW w:w="700" w:type="dxa"/>
+            <w:shd w:val="clear" w:color="auto" w:fill="F2F4F5"/>
+            <w:tcMar>
+              <w:top w:w="100" w:type="dxa"/>
+              <w:left w:w="120" w:type="dxa"/>
+              <w:bottom w:w="100" w:type="dxa"/>
+              <w:right w:w="120" w:type="dxa"/>
+            </w:tcMar>
+            <w:vAlign w:val="center"/>
+          </w:tcPr>
+          <w:p>
+            <w:r>
+              <w:rPr>
+                <w:rFonts w:ascii="Calibri" w:eastAsia="Calibri" w:hAnsi="Calibri" w:cs="Calibri"/>
+                <w:b/>
+                <w:bCs/>
+                <w:color w:val="222222"/>
+                <w:sz w:val="20"/>
+                <w:szCs w:val="20"/>
+              </w:rPr>
+              <w:t xml:space="preserve">2</w:t>
+            </w:r>
+          </w:p>
+        </w:tc>
+        <w:tc>
+          <w:tcPr>
+            <w:tcW w:w="1600" w:type="dxa"/>
+            <w:shd w:val="clear" w:color="auto" w:fill="F2F4F5"/>
+            <w:tcMar>
+              <w:top w:w="100" w:type="dxa"/>
+              <w:left w:w="120" w:type="dxa"/>
+              <w:bottom w:w="100" w:type="dxa"/>
+              <w:right w:w="120" w:type="dxa"/>
+            </w:tcMar>
+            <w:vAlign w:val="center"/>
+          </w:tcPr>
+          <w:p>
+            <w:r>
+              <w:rPr>
+                <w:rFonts w:ascii="Calibri" w:eastAsia="Calibri" w:hAnsi="Calibri" w:cs="Calibri"/>
+                <w:color w:val="222222"/>
+                <w:sz w:val="20"/>
+                <w:szCs w:val="20"/>
+              </w:rPr>
+              <w:t xml:space="preserve">buenos días</w:t>
+            </w:r>
+          </w:p>
+        </w:tc>
+        <w:tc>
+          <w:tcPr>
+            <w:tcW w:w="1850" w:type="dxa"/>
+            <w:shd w:val="clear" w:color="auto" w:fill="F2F4F5"/>
+            <w:tcMar>
+              <w:top w:w="100" w:type="dxa"/>
+              <w:left w:w="120" w:type="dxa"/>
+              <w:bottom w:w="100" w:type="dxa"/>
+              <w:right w:w="120" w:type="dxa"/>
+            </w:tcMar>
+            <w:vAlign w:val="center"/>
+          </w:tcPr>
+          <w:p>
+            <w:r>
+              <w:rPr>
+                <w:rFonts w:ascii="Calibri" w:eastAsia="Calibri" w:hAnsi="Calibri" w:cs="Calibri"/>
+                <w:color w:val="222222"/>
+                <w:sz w:val="20"/>
+                <w:szCs w:val="20"/>
+              </w:rPr>
+              <w:t xml:space="preserve">Saludo de presentación de Ada, inmediato, sin datos de cursos.</w:t>
+            </w:r>
+          </w:p>
+        </w:tc>
+        <w:tc>
+          <w:tcPr>
+            <w:tcW w:w="3250" w:type="dxa"/>
+            <w:shd w:val="clear" w:color="auto" w:fill="F2F4F5"/>
+            <w:tcMar>
+              <w:top w:w="100" w:type="dxa"/>
+              <w:left w:w="120" w:type="dxa"/>
+              <w:bottom w:w="100" w:type="dxa"/>
+              <w:right w:w="120" w:type="dxa"/>
+            </w:tcMar>
+            <w:vAlign w:val="center"/>
+          </w:tcPr>
+          <w:p>
+            <w:r>
+              <w:rPr>
+                <w:rFonts w:ascii="Calibri" w:eastAsia="Calibri" w:hAnsi="Calibri" w:cs="Calibri"/>
+                <w:color w:val="222222"/>
+                <w:sz w:val="20"/>
+                <w:szCs w:val="20"/>
+              </w:rPr>
+              <w:t xml:space="preserve">«¡Hola! Soy Ada, tu asistente académica de la Plataforma Escuela Rural. Puedo contarte qué cursos hay disponibles o ayudarte con dudas sobre ellos. ¿En qué te ayudo hoy?» (respuesta fija).</w:t>
+            </w:r>
+          </w:p>
+        </w:tc>
+        <w:tc>
+          <w:tcPr>
+            <w:tcW w:w="1600" w:type="dxa"/>
+            <w:shd w:val="clear" w:color="auto" w:fill="F2F4F5"/>
+            <w:tcMar>
+              <w:top w:w="100" w:type="dxa"/>
+              <w:left w:w="120" w:type="dxa"/>
+              <w:bottom w:w="100" w:type="dxa"/>
+              <w:right w:w="120" w:type="dxa"/>
+            </w:tcMar>
+            <w:vAlign w:val="center"/>
+          </w:tcPr>
+          <w:p>
+            <w:r>
+              <w:rPr>
+                <w:rFonts w:ascii="Calibri" w:eastAsia="Calibri" w:hAnsi="Calibri" w:cs="Calibri"/>
+                <w:color w:val="222222"/>
+                <w:sz w:val="20"/>
+                <w:szCs w:val="20"/>
+              </w:rPr>
+              <w:t xml:space="preserve">C1: Correcto · &lt; 1 s · Anexo D, Caso 2</w:t>
+            </w:r>
+          </w:p>
+        </w:tc>
+      </w:tr>
+      <w:tr>
+        <w:trPr>
+          <w:cantSplit/>
+        </w:trPr>
+        <w:tc>
+          <w:tcPr>
+            <w:tcW w:w="700" w:type="dxa"/>
+            <w:shd w:val="clear" w:color="auto" w:fill="FFFFFF"/>
+            <w:tcMar>
+              <w:top w:w="100" w:type="dxa"/>
+              <w:left w:w="120" w:type="dxa"/>
+              <w:bottom w:w="100" w:type="dxa"/>
+              <w:right w:w="120" w:type="dxa"/>
+            </w:tcMar>
+            <w:vAlign w:val="center"/>
+          </w:tcPr>
+          <w:p>
+            <w:r>
+              <w:rPr>
+                <w:rFonts w:ascii="Calibri" w:eastAsia="Calibri" w:hAnsi="Calibri" w:cs="Calibri"/>
+                <w:b/>
+                <w:bCs/>
+                <w:color w:val="222222"/>
+                <w:sz w:val="20"/>
+                <w:szCs w:val="20"/>
+              </w:rPr>
+              <w:t xml:space="preserve">3</w:t>
+            </w:r>
+          </w:p>
+        </w:tc>
+        <w:tc>
+          <w:tcPr>
+            <w:tcW w:w="1600" w:type="dxa"/>
+            <w:shd w:val="clear" w:color="auto" w:fill="FFFFFF"/>
+            <w:tcMar>
+              <w:top w:w="100" w:type="dxa"/>
+              <w:left w:w="120" w:type="dxa"/>
+              <w:bottom w:w="100" w:type="dxa"/>
+              <w:right w:w="120" w:type="dxa"/>
+            </w:tcMar>
+            <w:vAlign w:val="center"/>
+          </w:tcPr>
+          <w:p>
+            <w:r>
+              <w:rPr>
+                <w:rFonts w:ascii="Calibri" w:eastAsia="Calibri" w:hAnsi="Calibri" w:cs="Calibri"/>
+                <w:color w:val="222222"/>
+                <w:sz w:val="20"/>
+                <w:szCs w:val="20"/>
+              </w:rPr>
+              <w:t xml:space="preserve">Hey</w:t>
+            </w:r>
+          </w:p>
+        </w:tc>
+        <w:tc>
+          <w:tcPr>
+            <w:tcW w:w="1850" w:type="dxa"/>
+            <w:shd w:val="clear" w:color="auto" w:fill="FFFFFF"/>
+            <w:tcMar>
+              <w:top w:w="100" w:type="dxa"/>
+              <w:left w:w="120" w:type="dxa"/>
+              <w:bottom w:w="100" w:type="dxa"/>
+              <w:right w:w="120" w:type="dxa"/>
+            </w:tcMar>
+            <w:vAlign w:val="center"/>
+          </w:tcPr>
+          <w:p>
+            <w:r>
+              <w:rPr>
+                <w:rFonts w:ascii="Calibri" w:eastAsia="Calibri" w:hAnsi="Calibri" w:cs="Calibri"/>
+                <w:color w:val="222222"/>
+                <w:sz w:val="20"/>
+                <w:szCs w:val="20"/>
+              </w:rPr>
+              <w:t xml:space="preserve">Saludo de presentación de Ada, inmediato, sin datos de cursos.</w:t>
+            </w:r>
+          </w:p>
+        </w:tc>
+        <w:tc>
+          <w:tcPr>
+            <w:tcW w:w="3250" w:type="dxa"/>
+            <w:shd w:val="clear" w:color="auto" w:fill="FFFFFF"/>
+            <w:tcMar>
+              <w:top w:w="100" w:type="dxa"/>
+              <w:left w:w="120" w:type="dxa"/>
+              <w:bottom w:w="100" w:type="dxa"/>
+              <w:right w:w="120" w:type="dxa"/>
+            </w:tcMar>
+            <w:vAlign w:val="center"/>
+          </w:tcPr>
+          <w:p>
+            <w:r>
+              <w:rPr>
+                <w:rFonts w:ascii="Calibri" w:eastAsia="Calibri" w:hAnsi="Calibri" w:cs="Calibri"/>
+                <w:color w:val="222222"/>
+                <w:sz w:val="20"/>
+                <w:szCs w:val="20"/>
+              </w:rPr>
+              <w:t xml:space="preserve">«¡Hola! Qué bueno verte por aquí. Soy Ada, y estoy para ayudarte a moverte por tus cursos y resolver tus dudas. ¿Por dónde quieres empezar?» (respuesta fija).</w:t>
+            </w:r>
+          </w:p>
+        </w:tc>
+        <w:tc>
+          <w:tcPr>
+            <w:tcW w:w="1600" w:type="dxa"/>
+            <w:shd w:val="clear" w:color="auto" w:fill="FFFFFF"/>
+            <w:tcMar>
+              <w:top w:w="100" w:type="dxa"/>
+              <w:left w:w="120" w:type="dxa"/>
+              <w:bottom w:w="100" w:type="dxa"/>
+              <w:right w:w="120" w:type="dxa"/>
+            </w:tcMar>
+            <w:vAlign w:val="center"/>
+          </w:tcPr>
+          <w:p>
+            <w:r>
+              <w:rPr>
+                <w:rFonts w:ascii="Calibri" w:eastAsia="Calibri" w:hAnsi="Calibri" w:cs="Calibri"/>
+                <w:color w:val="222222"/>
+                <w:sz w:val="20"/>
+                <w:szCs w:val="20"/>
+              </w:rPr>
+              <w:t xml:space="preserve">C1: Correcto · &lt; 1 s · Anexo D, Caso 3</w:t>
+            </w:r>
+          </w:p>
+        </w:tc>
+      </w:tr>
+      <w:tr>
+        <w:trPr>
+          <w:cantSplit/>
+        </w:trPr>
+        <w:tc>
+          <w:tcPr>
+            <w:tcW w:w="700" w:type="dxa"/>
+            <w:shd w:val="clear" w:color="auto" w:fill="F2F4F5"/>
+            <w:tcMar>
+              <w:top w:w="100" w:type="dxa"/>
+              <w:left w:w="120" w:type="dxa"/>
+              <w:bottom w:w="100" w:type="dxa"/>
+              <w:right w:w="120" w:type="dxa"/>
+            </w:tcMar>
+            <w:vAlign w:val="center"/>
+          </w:tcPr>
+          <w:p>
+            <w:r>
+              <w:rPr>
+                <w:rFonts w:ascii="Calibri" w:eastAsia="Calibri" w:hAnsi="Calibri" w:cs="Calibri"/>
+                <w:b/>
+                <w:bCs/>
+                <w:color w:val="222222"/>
+                <w:sz w:val="20"/>
+                <w:szCs w:val="20"/>
+              </w:rPr>
+              <w:t xml:space="preserve">4</w:t>
+            </w:r>
+          </w:p>
+        </w:tc>
+        <w:tc>
+          <w:tcPr>
+            <w:tcW w:w="1600" w:type="dxa"/>
+            <w:shd w:val="clear" w:color="auto" w:fill="F2F4F5"/>
+            <w:tcMar>
+              <w:top w:w="100" w:type="dxa"/>
+              <w:left w:w="120" w:type="dxa"/>
+              <w:bottom w:w="100" w:type="dxa"/>
+              <w:right w:w="120" w:type="dxa"/>
+            </w:tcMar>
+            <w:vAlign w:val="center"/>
+          </w:tcPr>
+          <w:p>
+            <w:r>
+              <w:rPr>
+                <w:rFonts w:ascii="Calibri" w:eastAsia="Calibri" w:hAnsi="Calibri" w:cs="Calibri"/>
+                <w:color w:val="222222"/>
+                <w:sz w:val="20"/>
+                <w:szCs w:val="20"/>
+              </w:rPr>
+              <w:t xml:space="preserve">¿Cuáles son los cursos disponibles?</w:t>
+            </w:r>
+          </w:p>
+        </w:tc>
+        <w:tc>
+          <w:tcPr>
+            <w:tcW w:w="1850" w:type="dxa"/>
+            <w:shd w:val="clear" w:color="auto" w:fill="F2F4F5"/>
+            <w:tcMar>
+              <w:top w:w="100" w:type="dxa"/>
+              <w:left w:w="120" w:type="dxa"/>
+              <w:bottom w:w="100" w:type="dxa"/>
+              <w:right w:w="120" w:type="dxa"/>
+            </w:tcMar>
+            <w:vAlign w:val="center"/>
+          </w:tcPr>
+          <w:p>
+            <w:r>
+              <w:rPr>
+                <w:rFonts w:ascii="Calibri" w:eastAsia="Calibri" w:hAnsi="Calibri" w:cs="Calibri"/>
+                <w:color w:val="222222"/>
+                <w:sz w:val="20"/>
+                <w:szCs w:val="20"/>
+              </w:rPr>
+              <w:t xml:space="preserve">Los 2 cursos de Moodle: Ciencias Naturales — Saber 11 y Lectura Crítica — Saber 11.</w:t>
+            </w:r>
+          </w:p>
+        </w:tc>
+        <w:tc>
+          <w:tcPr>
+            <w:tcW w:w="3250" w:type="dxa"/>
+            <w:shd w:val="clear" w:color="auto" w:fill="F2F4F5"/>
+            <w:tcMar>
+              <w:top w:w="100" w:type="dxa"/>
+              <w:left w:w="120" w:type="dxa"/>
+              <w:bottom w:w="100" w:type="dxa"/>
+              <w:right w:w="120" w:type="dxa"/>
+            </w:tcMar>
+            <w:vAlign w:val="center"/>
+          </w:tcPr>
+          <w:p>
+            <w:r>
+              <w:rPr>
+                <w:rFonts w:ascii="Calibri" w:eastAsia="Calibri" w:hAnsi="Calibri" w:cs="Calibri"/>
+                <w:color w:val="222222"/>
+                <w:sz w:val="20"/>
+                <w:szCs w:val="20"/>
+              </w:rPr>
+              <w:t xml:space="preserve">«Tenemos 2 cursos disponibles: Ciencias Naturales — Saber 11 y Lectura Crítica — Saber 11. ¿Sobre cuál te gustaría saber más?» (construida con datos del bridge).</w:t>
+            </w:r>
+          </w:p>
+        </w:tc>
+        <w:tc>
+          <w:tcPr>
+            <w:tcW w:w="1600" w:type="dxa"/>
+            <w:shd w:val="clear" w:color="auto" w:fill="F2F4F5"/>
+            <w:tcMar>
+              <w:top w:w="100" w:type="dxa"/>
+              <w:left w:w="120" w:type="dxa"/>
+              <w:bottom w:w="100" w:type="dxa"/>
+              <w:right w:w="120" w:type="dxa"/>
+            </w:tcMar>
+            <w:vAlign w:val="center"/>
+          </w:tcPr>
+          <w:p>
+            <w:r>
+              <w:rPr>
+                <w:rFonts w:ascii="Calibri" w:eastAsia="Calibri" w:hAnsi="Calibri" w:cs="Calibri"/>
+                <w:color w:val="222222"/>
+                <w:sz w:val="20"/>
+                <w:szCs w:val="20"/>
+              </w:rPr>
+              <w:t xml:space="preserve">C2: Correcto · &lt; 1 s · Anexo D, Caso 4</w:t>
+            </w:r>
+          </w:p>
+        </w:tc>
+      </w:tr>
+      <w:tr>
+        <w:trPr>
+          <w:cantSplit/>
+        </w:trPr>
+        <w:tc>
+          <w:tcPr>
+            <w:tcW w:w="700" w:type="dxa"/>
+            <w:shd w:val="clear" w:color="auto" w:fill="FFFFFF"/>
+            <w:tcMar>
+              <w:top w:w="100" w:type="dxa"/>
+              <w:left w:w="120" w:type="dxa"/>
+              <w:bottom w:w="100" w:type="dxa"/>
+              <w:right w:w="120" w:type="dxa"/>
+            </w:tcMar>
+            <w:vAlign w:val="center"/>
+          </w:tcPr>
+          <w:p>
+            <w:r>
+              <w:rPr>
+                <w:rFonts w:ascii="Calibri" w:eastAsia="Calibri" w:hAnsi="Calibri" w:cs="Calibri"/>
+                <w:b/>
+                <w:bCs/>
+                <w:color w:val="222222"/>
+                <w:sz w:val="20"/>
+                <w:szCs w:val="20"/>
+              </w:rPr>
+              <w:t xml:space="preserve">5</w:t>
+            </w:r>
+          </w:p>
+        </w:tc>
+        <w:tc>
+          <w:tcPr>
+            <w:tcW w:w="1600" w:type="dxa"/>
+            <w:shd w:val="clear" w:color="auto" w:fill="FFFFFF"/>
+            <w:tcMar>
+              <w:top w:w="100" w:type="dxa"/>
+              <w:left w:w="120" w:type="dxa"/>
+              <w:bottom w:w="100" w:type="dxa"/>
+              <w:right w:w="120" w:type="dxa"/>
+            </w:tcMar>
+            <w:vAlign w:val="center"/>
+          </w:tcPr>
+          <w:p>
+            <w:r>
+              <w:rPr>
+                <w:rFonts w:ascii="Calibri" w:eastAsia="Calibri" w:hAnsi="Calibri" w:cs="Calibri"/>
+                <w:color w:val="222222"/>
+                <w:sz w:val="20"/>
+                <w:szCs w:val="20"/>
+              </w:rPr>
+              <w:t xml:space="preserve">¿Qué cursos hay?</w:t>
+            </w:r>
+          </w:p>
+        </w:tc>
+        <w:tc>
+          <w:tcPr>
+            <w:tcW w:w="1850" w:type="dxa"/>
+            <w:shd w:val="clear" w:color="auto" w:fill="FFFFFF"/>
+            <w:tcMar>
+              <w:top w:w="100" w:type="dxa"/>
+              <w:left w:w="120" w:type="dxa"/>
+              <w:bottom w:w="100" w:type="dxa"/>
+              <w:right w:w="120" w:type="dxa"/>
+            </w:tcMar>
+            <w:vAlign w:val="center"/>
+          </w:tcPr>
+          <w:p>
+            <w:r>
+              <w:rPr>
+                <w:rFonts w:ascii="Calibri" w:eastAsia="Calibri" w:hAnsi="Calibri" w:cs="Calibri"/>
+                <w:color w:val="222222"/>
+                <w:sz w:val="20"/>
+                <w:szCs w:val="20"/>
+              </w:rPr>
+              <w:t xml:space="preserve">Los 2 cursos de Moodle: Ciencias Naturales — Saber 11 y Lectura Crítica — Saber 11.</w:t>
+            </w:r>
+          </w:p>
+        </w:tc>
+        <w:tc>
+          <w:tcPr>
+            <w:tcW w:w="3250" w:type="dxa"/>
+            <w:shd w:val="clear" w:color="auto" w:fill="FFFFFF"/>
+            <w:tcMar>
+              <w:top w:w="100" w:type="dxa"/>
+              <w:left w:w="120" w:type="dxa"/>
+              <w:bottom w:w="100" w:type="dxa"/>
+              <w:right w:w="120" w:type="dxa"/>
+            </w:tcMar>
+            <w:vAlign w:val="center"/>
+          </w:tcPr>
+          <w:p>
+            <w:r>
+              <w:rPr>
+                <w:rFonts w:ascii="Calibri" w:eastAsia="Calibri" w:hAnsi="Calibri" w:cs="Calibri"/>
+                <w:color w:val="222222"/>
+                <w:sz w:val="20"/>
+                <w:szCs w:val="20"/>
+              </w:rPr>
+              <w:t xml:space="preserve">Misma respuesta que el caso 4.</w:t>
+            </w:r>
+          </w:p>
+        </w:tc>
+        <w:tc>
+          <w:tcPr>
+            <w:tcW w:w="1600" w:type="dxa"/>
+            <w:shd w:val="clear" w:color="auto" w:fill="FFFFFF"/>
+            <w:tcMar>
+              <w:top w:w="100" w:type="dxa"/>
+              <w:left w:w="120" w:type="dxa"/>
+              <w:bottom w:w="100" w:type="dxa"/>
+              <w:right w:w="120" w:type="dxa"/>
+            </w:tcMar>
+            <w:vAlign w:val="center"/>
+          </w:tcPr>
+          <w:p>
+            <w:r>
+              <w:rPr>
+                <w:rFonts w:ascii="Calibri" w:eastAsia="Calibri" w:hAnsi="Calibri" w:cs="Calibri"/>
+                <w:color w:val="222222"/>
+                <w:sz w:val="20"/>
+                <w:szCs w:val="20"/>
+              </w:rPr>
+              <w:t xml:space="preserve">C2: Correcto · &lt; 1 s · Anexo D, Caso 5</w:t>
+            </w:r>
+          </w:p>
+        </w:tc>
+      </w:tr>
+      <w:tr>
+        <w:trPr>
+          <w:cantSplit/>
+        </w:trPr>
+        <w:tc>
+          <w:tcPr>
+            <w:tcW w:w="700" w:type="dxa"/>
+            <w:shd w:val="clear" w:color="auto" w:fill="F2F4F5"/>
+            <w:tcMar>
+              <w:top w:w="100" w:type="dxa"/>
+              <w:left w:w="120" w:type="dxa"/>
+              <w:bottom w:w="100" w:type="dxa"/>
+              <w:right w:w="120" w:type="dxa"/>
+            </w:tcMar>
+            <w:vAlign w:val="center"/>
+          </w:tcPr>
+          <w:p>
+            <w:r>
+              <w:rPr>
+                <w:rFonts w:ascii="Calibri" w:eastAsia="Calibri" w:hAnsi="Calibri" w:cs="Calibri"/>
+                <w:b/>
+                <w:bCs/>
+                <w:color w:val="222222"/>
+                <w:sz w:val="20"/>
+                <w:szCs w:val="20"/>
+              </w:rPr>
+              <w:t xml:space="preserve">6</w:t>
+            </w:r>
+          </w:p>
+        </w:tc>
+        <w:tc>
+          <w:tcPr>
+            <w:tcW w:w="1600" w:type="dxa"/>
+            <w:shd w:val="clear" w:color="auto" w:fill="F2F4F5"/>
+            <w:tcMar>
+              <w:top w:w="100" w:type="dxa"/>
+              <w:left w:w="120" w:type="dxa"/>
+              <w:bottom w:w="100" w:type="dxa"/>
+              <w:right w:w="120" w:type="dxa"/>
+            </w:tcMar>
+            <w:vAlign w:val="center"/>
+          </w:tcPr>
+          <w:p>
+            <w:r>
+              <w:rPr>
+                <w:rFonts w:ascii="Calibri" w:eastAsia="Calibri" w:hAnsi="Calibri" w:cs="Calibri"/>
+                <w:color w:val="222222"/>
+                <w:sz w:val="20"/>
+                <w:szCs w:val="20"/>
+              </w:rPr>
+              <w:t xml:space="preserve">Cuéntame qué cursos tienen</w:t>
+            </w:r>
+          </w:p>
+        </w:tc>
+        <w:tc>
+          <w:tcPr>
+            <w:tcW w:w="1850" w:type="dxa"/>
+            <w:shd w:val="clear" w:color="auto" w:fill="F2F4F5"/>
+            <w:tcMar>
+              <w:top w:w="100" w:type="dxa"/>
+              <w:left w:w="120" w:type="dxa"/>
+              <w:bottom w:w="100" w:type="dxa"/>
+              <w:right w:w="120" w:type="dxa"/>
+            </w:tcMar>
+            <w:vAlign w:val="center"/>
+          </w:tcPr>
+          <w:p>
+            <w:r>
+              <w:rPr>
+                <w:rFonts w:ascii="Calibri" w:eastAsia="Calibri" w:hAnsi="Calibri" w:cs="Calibri"/>
+                <w:color w:val="222222"/>
+                <w:sz w:val="20"/>
+                <w:szCs w:val="20"/>
+              </w:rPr>
+              <w:t xml:space="preserve">Los 2 cursos de Moodle: Ciencias Naturales — Saber 11 y Lectura Crítica — Saber 11.</w:t>
+            </w:r>
+          </w:p>
+        </w:tc>
+        <w:tc>
+          <w:tcPr>
+            <w:tcW w:w="3250" w:type="dxa"/>
+            <w:shd w:val="clear" w:color="auto" w:fill="F2F4F5"/>
+            <w:tcMar>
+              <w:top w:w="100" w:type="dxa"/>
+              <w:left w:w="120" w:type="dxa"/>
+              <w:bottom w:w="100" w:type="dxa"/>
+              <w:right w:w="120" w:type="dxa"/>
+            </w:tcMar>
+            <w:vAlign w:val="center"/>
+          </w:tcPr>
+          <w:p>
+            <w:r>
+              <w:rPr>
+                <w:rFonts w:ascii="Calibri" w:eastAsia="Calibri" w:hAnsi="Calibri" w:cs="Calibri"/>
+                <w:color w:val="222222"/>
+                <w:sz w:val="20"/>
+                <w:szCs w:val="20"/>
+              </w:rPr>
+              <w:t xml:space="preserve">Misma respuesta que el caso 4.</w:t>
+            </w:r>
+          </w:p>
+        </w:tc>
+        <w:tc>
+          <w:tcPr>
+            <w:tcW w:w="1600" w:type="dxa"/>
+            <w:shd w:val="clear" w:color="auto" w:fill="F2F4F5"/>
+            <w:tcMar>
+              <w:top w:w="100" w:type="dxa"/>
+              <w:left w:w="120" w:type="dxa"/>
+              <w:bottom w:w="100" w:type="dxa"/>
+              <w:right w:w="120" w:type="dxa"/>
+            </w:tcMar>
+            <w:vAlign w:val="center"/>
+          </w:tcPr>
+          <w:p>
+            <w:r>
+              <w:rPr>
+                <w:rFonts w:ascii="Calibri" w:eastAsia="Calibri" w:hAnsi="Calibri" w:cs="Calibri"/>
+                <w:color w:val="222222"/>
+                <w:sz w:val="20"/>
+                <w:szCs w:val="20"/>
+              </w:rPr>
+              <w:t xml:space="preserve">C2: Correcto · &lt; 1 s · Anexo D, Caso 6</w:t>
+            </w:r>
+          </w:p>
+        </w:tc>
+      </w:tr>
+      <w:tr>
+        <w:trPr>
+          <w:cantSplit/>
+        </w:trPr>
+        <w:tc>
+          <w:tcPr>
+            <w:tcW w:w="700" w:type="dxa"/>
+            <w:shd w:val="clear" w:color="auto" w:fill="FFFFFF"/>
+            <w:tcMar>
+              <w:top w:w="100" w:type="dxa"/>
+              <w:left w:w="120" w:type="dxa"/>
+              <w:bottom w:w="100" w:type="dxa"/>
+              <w:right w:w="120" w:type="dxa"/>
+            </w:tcMar>
+            <w:vAlign w:val="center"/>
+          </w:tcPr>
+          <w:p>
+            <w:r>
+              <w:rPr>
+                <w:rFonts w:ascii="Calibri" w:eastAsia="Calibri" w:hAnsi="Calibri" w:cs="Calibri"/>
+                <w:b/>
+                <w:bCs/>
+                <w:color w:val="222222"/>
+                <w:sz w:val="20"/>
+                <w:szCs w:val="20"/>
+              </w:rPr>
+              <w:t xml:space="preserve">7</w:t>
+            </w:r>
+          </w:p>
+        </w:tc>
+        <w:tc>
+          <w:tcPr>
+            <w:tcW w:w="1600" w:type="dxa"/>
+            <w:shd w:val="clear" w:color="auto" w:fill="FFFFFF"/>
+            <w:tcMar>
+              <w:top w:w="100" w:type="dxa"/>
+              <w:left w:w="120" w:type="dxa"/>
+              <w:bottom w:w="100" w:type="dxa"/>
+              <w:right w:w="120" w:type="dxa"/>
+            </w:tcMar>
+            <w:vAlign w:val="center"/>
+          </w:tcPr>
+          <w:p>
+            <w:r>
+              <w:rPr>
+                <w:rFonts w:ascii="Calibri" w:eastAsia="Calibri" w:hAnsi="Calibri" w:cs="Calibri"/>
+                <w:color w:val="222222"/>
+                <w:sz w:val="20"/>
+                <w:szCs w:val="20"/>
+              </w:rPr>
+              <w:t xml:space="preserve">¿Cuántas unidades tiene Ciencias Naturales?</w:t>
+            </w:r>
+          </w:p>
+        </w:tc>
+        <w:tc>
+          <w:tcPr>
+            <w:tcW w:w="1850" w:type="dxa"/>
+            <w:shd w:val="clear" w:color="auto" w:fill="FFFFFF"/>
+            <w:tcMar>
+              <w:top w:w="100" w:type="dxa"/>
+              <w:left w:w="120" w:type="dxa"/>
+              <w:bottom w:w="100" w:type="dxa"/>
+              <w:right w:w="120" w:type="dxa"/>
+            </w:tcMar>
+            <w:vAlign w:val="center"/>
+          </w:tcPr>
+          <w:p>
+            <w:r>
+              <w:rPr>
+                <w:rFonts w:ascii="Calibri" w:eastAsia="Calibri" w:hAnsi="Calibri" w:cs="Calibri"/>
+                <w:color w:val="222222"/>
+                <w:sz w:val="20"/>
+                <w:szCs w:val="20"/>
+              </w:rPr>
+              <w:t xml:space="preserve">4 unidades: Biología: Entorno Vivo (35 %), Química: Materia y Transformaciones (30 %), Física: Fuerzas y Energía (30 %) y Ciencias de la Tierra y CTS (25 %), con sus contenidos.</w:t>
+            </w:r>
+          </w:p>
+        </w:tc>
+        <w:tc>
+          <w:tcPr>
+            <w:tcW w:w="3250" w:type="dxa"/>
+            <w:shd w:val="clear" w:color="auto" w:fill="FFFFFF"/>
+            <w:tcMar>
+              <w:top w:w="100" w:type="dxa"/>
+              <w:left w:w="120" w:type="dxa"/>
+              <w:bottom w:w="100" w:type="dxa"/>
+              <w:right w:w="120" w:type="dxa"/>
+            </w:tcMar>
+            <w:vAlign w:val="center"/>
+          </w:tcPr>
+          <w:p>
+            <w:r>
+              <w:rPr>
+                <w:rFonts w:ascii="Calibri" w:eastAsia="Calibri" w:hAnsi="Calibri" w:cs="Calibri"/>
+                <w:color w:val="222222"/>
+                <w:sz w:val="20"/>
+                <w:szCs w:val="20"/>
+              </w:rPr>
+              <w:t xml:space="preserve">«El curso Ciencias Naturales — Saber 11 tiene 4 unidades:» 1. Biología: Entorno Vivo (35 %): célula, genética, evolución, ecosistemas y fisiología humana. 2. Química: Materia y Transformaciones (30 %): átomo, tabla periódica, enlace químico, reacciones, soluciones y química orgánica. 3. Física: Fuerzas y Energía (30 %): mecánica, leyes de Newton, energía, termodinámica y ondas. 4. Ciencias de la Tierra y CTS (25 %). La captura muestra las tres primeras unidades; la cuarta queda debajo del área visible del chat.</w:t>
+            </w:r>
+          </w:p>
+        </w:tc>
+        <w:tc>
+          <w:tcPr>
+            <w:tcW w:w="1600" w:type="dxa"/>
+            <w:shd w:val="clear" w:color="auto" w:fill="FFFFFF"/>
+            <w:tcMar>
+              <w:top w:w="100" w:type="dxa"/>
+              <w:left w:w="120" w:type="dxa"/>
+              <w:bottom w:w="100" w:type="dxa"/>
+              <w:right w:w="120" w:type="dxa"/>
+            </w:tcMar>
+            <w:vAlign w:val="center"/>
+          </w:tcPr>
+          <w:p>
+            <w:r>
+              <w:rPr>
+                <w:rFonts w:ascii="Calibri" w:eastAsia="Calibri" w:hAnsi="Calibri" w:cs="Calibri"/>
+                <w:color w:val="222222"/>
+                <w:sz w:val="20"/>
+                <w:szCs w:val="20"/>
+              </w:rPr>
+              <w:t xml:space="preserve">C3: Correcto · &lt; 1 s · Anexo D, Caso 7</w:t>
+            </w:r>
+          </w:p>
+        </w:tc>
+      </w:tr>
+      <w:tr>
+        <w:trPr>
+          <w:cantSplit/>
+        </w:trPr>
+        <w:tc>
+          <w:tcPr>
+            <w:tcW w:w="700" w:type="dxa"/>
+            <w:shd w:val="clear" w:color="auto" w:fill="F2F4F5"/>
+            <w:tcMar>
+              <w:top w:w="100" w:type="dxa"/>
+              <w:left w:w="120" w:type="dxa"/>
+              <w:bottom w:w="100" w:type="dxa"/>
+              <w:right w:w="120" w:type="dxa"/>
+            </w:tcMar>
+            <w:vAlign w:val="center"/>
+          </w:tcPr>
+          <w:p>
+            <w:r>
+              <w:rPr>
+                <w:rFonts w:ascii="Calibri" w:eastAsia="Calibri" w:hAnsi="Calibri" w:cs="Calibri"/>
+                <w:b/>
+                <w:bCs/>
+                <w:color w:val="222222"/>
+                <w:sz w:val="20"/>
+                <w:szCs w:val="20"/>
+              </w:rPr>
+              <w:t xml:space="preserve">8</w:t>
+            </w:r>
+          </w:p>
+        </w:tc>
+        <w:tc>
+          <w:tcPr>
+            <w:tcW w:w="1600" w:type="dxa"/>
+            <w:shd w:val="clear" w:color="auto" w:fill="F2F4F5"/>
+            <w:tcMar>
+              <w:top w:w="100" w:type="dxa"/>
+              <w:left w:w="120" w:type="dxa"/>
+              <w:bottom w:w="100" w:type="dxa"/>
+              <w:right w:w="120" w:type="dxa"/>
+            </w:tcMar>
+            <w:vAlign w:val="center"/>
+          </w:tcPr>
+          <w:p>
+            <w:r>
+              <w:rPr>
+                <w:rFonts w:ascii="Calibri" w:eastAsia="Calibri" w:hAnsi="Calibri" w:cs="Calibri"/>
+                <w:color w:val="222222"/>
+                <w:sz w:val="20"/>
+                <w:szCs w:val="20"/>
+              </w:rPr>
+              <w:t xml:space="preserve">Descríbeme el curso de Lectura Crítica, cuántas unidades tiene y qué contenidos</w:t>
+            </w:r>
+          </w:p>
+        </w:tc>
+        <w:tc>
+          <w:tcPr>
+            <w:tcW w:w="1850" w:type="dxa"/>
+            <w:shd w:val="clear" w:color="auto" w:fill="F2F4F5"/>
+            <w:tcMar>
+              <w:top w:w="100" w:type="dxa"/>
+              <w:left w:w="120" w:type="dxa"/>
+              <w:bottom w:w="100" w:type="dxa"/>
+              <w:right w:w="120" w:type="dxa"/>
+            </w:tcMar>
+            <w:vAlign w:val="center"/>
+          </w:tcPr>
+          <w:p>
+            <w:r>
+              <w:rPr>
+                <w:rFonts w:ascii="Calibri" w:eastAsia="Calibri" w:hAnsi="Calibri" w:cs="Calibri"/>
+                <w:color w:val="222222"/>
+                <w:sz w:val="20"/>
+                <w:szCs w:val="20"/>
+              </w:rPr>
+              <w:t xml:space="preserve">4 unidades: Comprensión Textual (35 %), Argumentación y Retórica (30 %), Literatura y Contexto (20 %) y Pensamiento Crítico (15 %), con sus contenidos.</w:t>
+            </w:r>
+          </w:p>
+        </w:tc>
+        <w:tc>
+          <w:tcPr>
+            <w:tcW w:w="3250" w:type="dxa"/>
+            <w:shd w:val="clear" w:color="auto" w:fill="F2F4F5"/>
+            <w:tcMar>
+              <w:top w:w="100" w:type="dxa"/>
+              <w:left w:w="120" w:type="dxa"/>
+              <w:bottom w:w="100" w:type="dxa"/>
+              <w:right w:w="120" w:type="dxa"/>
+            </w:tcMar>
+            <w:vAlign w:val="center"/>
+          </w:tcPr>
+          <w:p>
+            <w:r>
+              <w:rPr>
+                <w:rFonts w:ascii="Calibri" w:eastAsia="Calibri" w:hAnsi="Calibri" w:cs="Calibri"/>
+                <w:color w:val="222222"/>
+                <w:sz w:val="20"/>
+                <w:szCs w:val="20"/>
+              </w:rPr>
+              <w:t xml:space="preserve">«El curso Lectura Crítica — Saber 11 tiene 4 unidades:» 1. Comprensión Textual (35 %): niveles de lectura, tipos de texto, coherencia, cohesión y textos discontinuos. 2. Argumentación y Retórica (30 %). 3. Literatura y Contexto (20 %). 4. Pensamiento Crítico (15 %). La captura muestra las primeras unidades; el resto queda debajo del área visible.</w:t>
+            </w:r>
+          </w:p>
+        </w:tc>
+        <w:tc>
+          <w:tcPr>
+            <w:tcW w:w="1600" w:type="dxa"/>
+            <w:shd w:val="clear" w:color="auto" w:fill="F2F4F5"/>
+            <w:tcMar>
+              <w:top w:w="100" w:type="dxa"/>
+              <w:left w:w="120" w:type="dxa"/>
+              <w:bottom w:w="100" w:type="dxa"/>
+              <w:right w:w="120" w:type="dxa"/>
+            </w:tcMar>
+            <w:vAlign w:val="center"/>
+          </w:tcPr>
+          <w:p>
+            <w:r>
+              <w:rPr>
+                <w:rFonts w:ascii="Calibri" w:eastAsia="Calibri" w:hAnsi="Calibri" w:cs="Calibri"/>
+                <w:color w:val="222222"/>
+                <w:sz w:val="20"/>
+                <w:szCs w:val="20"/>
+              </w:rPr>
+              <w:t xml:space="preserve">C3: Correcto · &lt; 1 s · Anexo D, Caso 8</w:t>
+            </w:r>
+          </w:p>
+        </w:tc>
+      </w:tr>
+      <w:tr>
+        <w:trPr>
+          <w:cantSplit/>
+        </w:trPr>
+        <w:tc>
+          <w:tcPr>
+            <w:tcW w:w="700" w:type="dxa"/>
+            <w:shd w:val="clear" w:color="auto" w:fill="FFFFFF"/>
+            <w:tcMar>
+              <w:top w:w="100" w:type="dxa"/>
+              <w:left w:w="120" w:type="dxa"/>
+              <w:bottom w:w="100" w:type="dxa"/>
+              <w:right w:w="120" w:type="dxa"/>
+            </w:tcMar>
+            <w:vAlign w:val="center"/>
+          </w:tcPr>
+          <w:p>
+            <w:r>
+              <w:rPr>
+                <w:rFonts w:ascii="Calibri" w:eastAsia="Calibri" w:hAnsi="Calibri" w:cs="Calibri"/>
+                <w:b/>
+                <w:bCs/>
+                <w:color w:val="222222"/>
+                <w:sz w:val="20"/>
+                <w:szCs w:val="20"/>
+              </w:rPr>
+              <w:t xml:space="preserve">9</w:t>
+            </w:r>
+          </w:p>
+        </w:tc>
+        <w:tc>
+          <w:tcPr>
+            <w:tcW w:w="1600" w:type="dxa"/>
+            <w:shd w:val="clear" w:color="auto" w:fill="FFFFFF"/>
+            <w:tcMar>
+              <w:top w:w="100" w:type="dxa"/>
+              <w:left w:w="120" w:type="dxa"/>
+              <w:bottom w:w="100" w:type="dxa"/>
+              <w:right w:w="120" w:type="dxa"/>
+            </w:tcMar>
+            <w:vAlign w:val="center"/>
+          </w:tcPr>
+          <w:p>
+            <w:r>
+              <w:rPr>
+                <w:rFonts w:ascii="Calibri" w:eastAsia="Calibri" w:hAnsi="Calibri" w:cs="Calibri"/>
+                <w:color w:val="222222"/>
+                <w:sz w:val="20"/>
+                <w:szCs w:val="20"/>
+              </w:rPr>
+              <w:t xml:space="preserve">¿Qué unidades tiene el curso de Ciencias Naturales?</w:t>
+            </w:r>
+          </w:p>
+        </w:tc>
+        <w:tc>
+          <w:tcPr>
+            <w:tcW w:w="1850" w:type="dxa"/>
+            <w:shd w:val="clear" w:color="auto" w:fill="FFFFFF"/>
+            <w:tcMar>
+              <w:top w:w="100" w:type="dxa"/>
+              <w:left w:w="120" w:type="dxa"/>
+              <w:bottom w:w="100" w:type="dxa"/>
+              <w:right w:w="120" w:type="dxa"/>
+            </w:tcMar>
+            <w:vAlign w:val="center"/>
+          </w:tcPr>
+          <w:p>
+            <w:r>
+              <w:rPr>
+                <w:rFonts w:ascii="Calibri" w:eastAsia="Calibri" w:hAnsi="Calibri" w:cs="Calibri"/>
+                <w:color w:val="222222"/>
+                <w:sz w:val="20"/>
+                <w:szCs w:val="20"/>
+              </w:rPr>
+              <w:t xml:space="preserve">4 unidades: Biología: Entorno Vivo (35 %), Química: Materia y Transformaciones (30 %), Física: Fuerzas y Energía (30 %) y Ciencias de la Tierra y CTS (25 %), con sus contenidos.</w:t>
+            </w:r>
+          </w:p>
+        </w:tc>
+        <w:tc>
+          <w:tcPr>
+            <w:tcW w:w="3250" w:type="dxa"/>
+            <w:shd w:val="clear" w:color="auto" w:fill="FFFFFF"/>
+            <w:tcMar>
+              <w:top w:w="100" w:type="dxa"/>
+              <w:left w:w="120" w:type="dxa"/>
+              <w:bottom w:w="100" w:type="dxa"/>
+              <w:right w:w="120" w:type="dxa"/>
+            </w:tcMar>
+            <w:vAlign w:val="center"/>
+          </w:tcPr>
+          <w:p>
+            <w:r>
+              <w:rPr>
+                <w:rFonts w:ascii="Calibri" w:eastAsia="Calibri" w:hAnsi="Calibri" w:cs="Calibri"/>
+                <w:color w:val="222222"/>
+                <w:sz w:val="20"/>
+                <w:szCs w:val="20"/>
+              </w:rPr>
+              <w:t xml:space="preserve">Misma respuesta que el caso 7.</w:t>
+            </w:r>
+          </w:p>
+        </w:tc>
+        <w:tc>
+          <w:tcPr>
+            <w:tcW w:w="1600" w:type="dxa"/>
+            <w:shd w:val="clear" w:color="auto" w:fill="FFFFFF"/>
+            <w:tcMar>
+              <w:top w:w="100" w:type="dxa"/>
+              <w:left w:w="120" w:type="dxa"/>
+              <w:bottom w:w="100" w:type="dxa"/>
+              <w:right w:w="120" w:type="dxa"/>
+            </w:tcMar>
+            <w:vAlign w:val="center"/>
+          </w:tcPr>
+          <w:p>
+            <w:r>
+              <w:rPr>
+                <w:rFonts w:ascii="Calibri" w:eastAsia="Calibri" w:hAnsi="Calibri" w:cs="Calibri"/>
+                <w:color w:val="222222"/>
+                <w:sz w:val="20"/>
+                <w:szCs w:val="20"/>
+              </w:rPr>
+              <w:t xml:space="preserve">C3: Correcto · &lt; 1 s · Anexo D, Caso 9</w:t>
+            </w:r>
+          </w:p>
+        </w:tc>
+      </w:tr>
+      <w:tr>
+        <w:trPr>
+          <w:cantSplit/>
+        </w:trPr>
+        <w:tc>
+          <w:tcPr>
+            <w:tcW w:w="700" w:type="dxa"/>
+            <w:shd w:val="clear" w:color="auto" w:fill="F2F4F5"/>
+            <w:tcMar>
+              <w:top w:w="100" w:type="dxa"/>
+              <w:left w:w="120" w:type="dxa"/>
+              <w:bottom w:w="100" w:type="dxa"/>
+              <w:right w:w="120" w:type="dxa"/>
+            </w:tcMar>
+            <w:vAlign w:val="center"/>
+          </w:tcPr>
+          <w:p>
+            <w:r>
+              <w:rPr>
+                <w:rFonts w:ascii="Calibri" w:eastAsia="Calibri" w:hAnsi="Calibri" w:cs="Calibri"/>
+                <w:b/>
+                <w:bCs/>
+                <w:color w:val="222222"/>
+                <w:sz w:val="20"/>
+                <w:szCs w:val="20"/>
+              </w:rPr>
+              <w:t xml:space="preserve">10</w:t>
+            </w:r>
+          </w:p>
+        </w:tc>
+        <w:tc>
+          <w:tcPr>
+            <w:tcW w:w="1600" w:type="dxa"/>
+            <w:shd w:val="clear" w:color="auto" w:fill="F2F4F5"/>
+            <w:tcMar>
+              <w:top w:w="100" w:type="dxa"/>
+              <w:left w:w="120" w:type="dxa"/>
+              <w:bottom w:w="100" w:type="dxa"/>
+              <w:right w:w="120" w:type="dxa"/>
+            </w:tcMar>
+            <w:vAlign w:val="center"/>
+          </w:tcPr>
+          <w:p>
+            <w:r>
+              <w:rPr>
+                <w:rFonts w:ascii="Calibri" w:eastAsia="Calibri" w:hAnsi="Calibri" w:cs="Calibri"/>
+                <w:color w:val="222222"/>
+                <w:sz w:val="20"/>
+                <w:szCs w:val="20"/>
+              </w:rPr>
+              <w:t xml:space="preserve">¿Me das una receta de pizza?</w:t>
+            </w:r>
+          </w:p>
+        </w:tc>
+        <w:tc>
+          <w:tcPr>
+            <w:tcW w:w="1850" w:type="dxa"/>
+            <w:shd w:val="clear" w:color="auto" w:fill="F2F4F5"/>
+            <w:tcMar>
+              <w:top w:w="100" w:type="dxa"/>
+              <w:left w:w="120" w:type="dxa"/>
+              <w:bottom w:w="100" w:type="dxa"/>
+              <w:right w:w="120" w:type="dxa"/>
+            </w:tcMar>
+            <w:vAlign w:val="center"/>
+          </w:tcPr>
+          <w:p>
+            <w:r>
+              <w:rPr>
+                <w:rFonts w:ascii="Calibri" w:eastAsia="Calibri" w:hAnsi="Calibri" w:cs="Calibri"/>
+                <w:color w:val="222222"/>
+                <w:sz w:val="20"/>
+                <w:szCs w:val="20"/>
+              </w:rPr>
+              <w:t xml:space="preserve">Rechazo cordial y redirección a los cursos, sin resolver la solicitud.</w:t>
+            </w:r>
+          </w:p>
+        </w:tc>
+        <w:tc>
+          <w:tcPr>
+            <w:tcW w:w="3250" w:type="dxa"/>
+            <w:shd w:val="clear" w:color="auto" w:fill="F2F4F5"/>
+            <w:tcMar>
+              <w:top w:w="100" w:type="dxa"/>
+              <w:left w:w="120" w:type="dxa"/>
+              <w:bottom w:w="100" w:type="dxa"/>
+              <w:right w:w="120" w:type="dxa"/>
+            </w:tcMar>
+            <w:vAlign w:val="center"/>
+          </w:tcPr>
+          <w:p>
+            <w:r>
+              <w:rPr>
+                <w:rFonts w:ascii="Calibri" w:eastAsia="Calibri" w:hAnsi="Calibri" w:cs="Calibri"/>
+                <w:color w:val="222222"/>
+                <w:sz w:val="20"/>
+                <w:szCs w:val="20"/>
+              </w:rPr>
+              <w:t xml:space="preserve">«Lo siento, pero no puedo ayudarte con recetas de pizza. ¿Hay algo más sobre los cursos que necesitas saber? ¿Quieres información sobre el curso Ciencias Naturales — Saber 11 o Lectura Crítica — Saber 11?»</w:t>
+            </w:r>
+          </w:p>
+        </w:tc>
+        <w:tc>
+          <w:tcPr>
+            <w:tcW w:w="1600" w:type="dxa"/>
+            <w:shd w:val="clear" w:color="auto" w:fill="F2F4F5"/>
+            <w:tcMar>
+              <w:top w:w="100" w:type="dxa"/>
+              <w:left w:w="120" w:type="dxa"/>
+              <w:bottom w:w="100" w:type="dxa"/>
+              <w:right w:w="120" w:type="dxa"/>
+            </w:tcMar>
+            <w:vAlign w:val="center"/>
+          </w:tcPr>
+          <w:p>
+            <w:r>
+              <w:rPr>
+                <w:rFonts w:ascii="Calibri" w:eastAsia="Calibri" w:hAnsi="Calibri" w:cs="Calibri"/>
+                <w:color w:val="222222"/>
+                <w:sz w:val="20"/>
+                <w:szCs w:val="20"/>
+              </w:rPr>
+              <w:t xml:space="preserve">C4: Correcto · 1:23 · Anexo D, Caso 10</w:t>
+            </w:r>
+          </w:p>
+        </w:tc>
+      </w:tr>
+      <w:tr>
+        <w:trPr>
+          <w:cantSplit/>
+        </w:trPr>
+        <w:tc>
+          <w:tcPr>
+            <w:tcW w:w="700" w:type="dxa"/>
+            <w:shd w:val="clear" w:color="auto" w:fill="FFFFFF"/>
+            <w:tcMar>
+              <w:top w:w="100" w:type="dxa"/>
+              <w:left w:w="120" w:type="dxa"/>
+              <w:bottom w:w="100" w:type="dxa"/>
+              <w:right w:w="120" w:type="dxa"/>
+            </w:tcMar>
+            <w:vAlign w:val="center"/>
+          </w:tcPr>
+          <w:p>
+            <w:r>
+              <w:rPr>
+                <w:rFonts w:ascii="Calibri" w:eastAsia="Calibri" w:hAnsi="Calibri" w:cs="Calibri"/>
+                <w:b/>
+                <w:bCs/>
+                <w:color w:val="222222"/>
+                <w:sz w:val="20"/>
+                <w:szCs w:val="20"/>
+              </w:rPr>
+              <w:t xml:space="preserve">11</w:t>
+            </w:r>
+          </w:p>
+        </w:tc>
+        <w:tc>
+          <w:tcPr>
+            <w:tcW w:w="1600" w:type="dxa"/>
+            <w:shd w:val="clear" w:color="auto" w:fill="FFFFFF"/>
+            <w:tcMar>
+              <w:top w:w="100" w:type="dxa"/>
+              <w:left w:w="120" w:type="dxa"/>
+              <w:bottom w:w="100" w:type="dxa"/>
+              <w:right w:w="120" w:type="dxa"/>
+            </w:tcMar>
+            <w:vAlign w:val="center"/>
+          </w:tcPr>
+          <w:p>
+            <w:r>
+              <w:rPr>
+                <w:rFonts w:ascii="Calibri" w:eastAsia="Calibri" w:hAnsi="Calibri" w:cs="Calibri"/>
+                <w:color w:val="222222"/>
+                <w:sz w:val="20"/>
+                <w:szCs w:val="20"/>
+              </w:rPr>
+              <w:t xml:space="preserve">¿Cuál es la capital de Francia?</w:t>
+            </w:r>
+          </w:p>
+        </w:tc>
+        <w:tc>
+          <w:tcPr>
+            <w:tcW w:w="1850" w:type="dxa"/>
+            <w:shd w:val="clear" w:color="auto" w:fill="FFFFFF"/>
+            <w:tcMar>
+              <w:top w:w="100" w:type="dxa"/>
+              <w:left w:w="120" w:type="dxa"/>
+              <w:bottom w:w="100" w:type="dxa"/>
+              <w:right w:w="120" w:type="dxa"/>
+            </w:tcMar>
+            <w:vAlign w:val="center"/>
+          </w:tcPr>
+          <w:p>
+            <w:r>
+              <w:rPr>
+                <w:rFonts w:ascii="Calibri" w:eastAsia="Calibri" w:hAnsi="Calibri" w:cs="Calibri"/>
+                <w:color w:val="222222"/>
+                <w:sz w:val="20"/>
+                <w:szCs w:val="20"/>
+              </w:rPr>
+              <w:t xml:space="preserve">Rechazo cordial y redirección a los cursos, sin resolver la solicitud.</w:t>
+            </w:r>
+          </w:p>
+        </w:tc>
+        <w:tc>
+          <w:tcPr>
+            <w:tcW w:w="3250" w:type="dxa"/>
+            <w:shd w:val="clear" w:color="auto" w:fill="FFFFFF"/>
+            <w:tcMar>
+              <w:top w:w="100" w:type="dxa"/>
+              <w:left w:w="120" w:type="dxa"/>
+              <w:bottom w:w="100" w:type="dxa"/>
+              <w:right w:w="120" w:type="dxa"/>
+            </w:tcMar>
+            <w:vAlign w:val="center"/>
+          </w:tcPr>
+          <w:p>
+            <w:r>
+              <w:rPr>
+                <w:rFonts w:ascii="Calibri" w:eastAsia="Calibri" w:hAnsi="Calibri" w:cs="Calibri"/>
+                <w:color w:val="222222"/>
+                <w:sz w:val="20"/>
+                <w:szCs w:val="20"/>
+              </w:rPr>
+              <w:t xml:space="preserve">«Lo siento, pero no puedo ayudarte con preguntas fuera del contexto de los cursos disponibles en la plataforma. ¿Quieres saber qué cursos tenemos disponibles o necesitas ayuda con algo relacionado a ellos?»</w:t>
+            </w:r>
+          </w:p>
+        </w:tc>
+        <w:tc>
+          <w:tcPr>
+            <w:tcW w:w="1600" w:type="dxa"/>
+            <w:shd w:val="clear" w:color="auto" w:fill="FFFFFF"/>
+            <w:tcMar>
+              <w:top w:w="100" w:type="dxa"/>
+              <w:left w:w="120" w:type="dxa"/>
+              <w:bottom w:w="100" w:type="dxa"/>
+              <w:right w:w="120" w:type="dxa"/>
+            </w:tcMar>
+            <w:vAlign w:val="center"/>
+          </w:tcPr>
+          <w:p>
+            <w:r>
+              <w:rPr>
+                <w:rFonts w:ascii="Calibri" w:eastAsia="Calibri" w:hAnsi="Calibri" w:cs="Calibri"/>
+                <w:color w:val="222222"/>
+                <w:sz w:val="20"/>
+                <w:szCs w:val="20"/>
+              </w:rPr>
+              <w:t xml:space="preserve">C4: Correcto · 1:02 · Anexo D, Caso 11</w:t>
+            </w:r>
+          </w:p>
+        </w:tc>
+      </w:tr>
+      <w:tr>
+        <w:trPr>
+          <w:cantSplit/>
+        </w:trPr>
+        <w:tc>
+          <w:tcPr>
+            <w:tcW w:w="700" w:type="dxa"/>
+            <w:shd w:val="clear" w:color="auto" w:fill="F2F4F5"/>
+            <w:tcMar>
+              <w:top w:w="100" w:type="dxa"/>
+              <w:left w:w="120" w:type="dxa"/>
+              <w:bottom w:w="100" w:type="dxa"/>
+              <w:right w:w="120" w:type="dxa"/>
+            </w:tcMar>
+            <w:vAlign w:val="center"/>
+          </w:tcPr>
+          <w:p>
+            <w:r>
+              <w:rPr>
+                <w:rFonts w:ascii="Calibri" w:eastAsia="Calibri" w:hAnsi="Calibri" w:cs="Calibri"/>
+                <w:b/>
+                <w:bCs/>
+                <w:color w:val="222222"/>
+                <w:sz w:val="20"/>
+                <w:szCs w:val="20"/>
+              </w:rPr>
+              <w:t xml:space="preserve">12</w:t>
+            </w:r>
+          </w:p>
+        </w:tc>
+        <w:tc>
+          <w:tcPr>
+            <w:tcW w:w="1600" w:type="dxa"/>
+            <w:shd w:val="clear" w:color="auto" w:fill="F2F4F5"/>
+            <w:tcMar>
+              <w:top w:w="100" w:type="dxa"/>
+              <w:left w:w="120" w:type="dxa"/>
+              <w:bottom w:w="100" w:type="dxa"/>
+              <w:right w:w="120" w:type="dxa"/>
+            </w:tcMar>
+            <w:vAlign w:val="center"/>
+          </w:tcPr>
+          <w:p>
+            <w:r>
+              <w:rPr>
+                <w:rFonts w:ascii="Calibri" w:eastAsia="Calibri" w:hAnsi="Calibri" w:cs="Calibri"/>
+                <w:color w:val="222222"/>
+                <w:sz w:val="20"/>
+                <w:szCs w:val="20"/>
+              </w:rPr>
+              <w:t xml:space="preserve">Ayúdame con mi tarea de matemáticas</w:t>
+            </w:r>
+          </w:p>
+        </w:tc>
+        <w:tc>
+          <w:tcPr>
+            <w:tcW w:w="1850" w:type="dxa"/>
+            <w:shd w:val="clear" w:color="auto" w:fill="F2F4F5"/>
+            <w:tcMar>
+              <w:top w:w="100" w:type="dxa"/>
+              <w:left w:w="120" w:type="dxa"/>
+              <w:bottom w:w="100" w:type="dxa"/>
+              <w:right w:w="120" w:type="dxa"/>
+            </w:tcMar>
+            <w:vAlign w:val="center"/>
+          </w:tcPr>
+          <w:p>
+            <w:r>
+              <w:rPr>
+                <w:rFonts w:ascii="Calibri" w:eastAsia="Calibri" w:hAnsi="Calibri" w:cs="Calibri"/>
+                <w:color w:val="222222"/>
+                <w:sz w:val="20"/>
+                <w:szCs w:val="20"/>
+              </w:rPr>
+              <w:t xml:space="preserve">Rechazo cordial y redirección a los cursos, sin resolver la solicitud.</w:t>
+            </w:r>
+          </w:p>
+        </w:tc>
+        <w:tc>
+          <w:tcPr>
+            <w:tcW w:w="3250" w:type="dxa"/>
+            <w:shd w:val="clear" w:color="auto" w:fill="F2F4F5"/>
+            <w:tcMar>
+              <w:top w:w="100" w:type="dxa"/>
+              <w:left w:w="120" w:type="dxa"/>
+              <w:bottom w:w="100" w:type="dxa"/>
+              <w:right w:w="120" w:type="dxa"/>
+            </w:tcMar>
+            <w:vAlign w:val="center"/>
+          </w:tcPr>
+          <w:p>
+            <w:r>
+              <w:rPr>
+                <w:rFonts w:ascii="Calibri" w:eastAsia="Calibri" w:hAnsi="Calibri" w:cs="Calibri"/>
+                <w:color w:val="222222"/>
+                <w:sz w:val="20"/>
+                <w:szCs w:val="20"/>
+              </w:rPr>
+              <w:t xml:space="preserve">«Lo siento, pero la plataforma es para cursos académicos como Ciencias Naturales — Saber 11 y Lectura Crítica — Saber 11, no para matemáticas. ¿Quieres saber más sobre alguno de estos cursos o necesitas ayuda con algo específico en ellos?»</w:t>
+            </w:r>
+          </w:p>
+        </w:tc>
+        <w:tc>
+          <w:tcPr>
+            <w:tcW w:w="1600" w:type="dxa"/>
+            <w:shd w:val="clear" w:color="auto" w:fill="F2F4F5"/>
+            <w:tcMar>
+              <w:top w:w="100" w:type="dxa"/>
+              <w:left w:w="120" w:type="dxa"/>
+              <w:bottom w:w="100" w:type="dxa"/>
+              <w:right w:w="120" w:type="dxa"/>
+            </w:tcMar>
+            <w:vAlign w:val="center"/>
+          </w:tcPr>
+          <w:p>
+            <w:r>
+              <w:rPr>
+                <w:rFonts w:ascii="Calibri" w:eastAsia="Calibri" w:hAnsi="Calibri" w:cs="Calibri"/>
+                <w:color w:val="222222"/>
+                <w:sz w:val="20"/>
+                <w:szCs w:val="20"/>
+              </w:rPr>
+              <w:t xml:space="preserve">C4: Correcto · 1:12 · Anexo D, Caso 12</w:t>
+            </w:r>
+          </w:p>
+        </w:tc>
+      </w:tr>
+      <w:tr>
+        <w:trPr>
+          <w:cantSplit/>
+        </w:trPr>
+        <w:tc>
+          <w:tcPr>
+            <w:tcW w:w="700" w:type="dxa"/>
+            <w:shd w:val="clear" w:color="auto" w:fill="FFFFFF"/>
+            <w:tcMar>
+              <w:top w:w="100" w:type="dxa"/>
+              <w:left w:w="120" w:type="dxa"/>
+              <w:bottom w:w="100" w:type="dxa"/>
+              <w:right w:w="120" w:type="dxa"/>
+            </w:tcMar>
+            <w:vAlign w:val="center"/>
+          </w:tcPr>
+          <w:p>
+            <w:r>
+              <w:rPr>
+                <w:rFonts w:ascii="Calibri" w:eastAsia="Calibri" w:hAnsi="Calibri" w:cs="Calibri"/>
+                <w:b/>
+                <w:bCs/>
+                <w:color w:val="222222"/>
+                <w:sz w:val="20"/>
+                <w:szCs w:val="20"/>
+              </w:rPr>
+              <w:t xml:space="preserve">13</w:t>
+            </w:r>
+          </w:p>
+        </w:tc>
+        <w:tc>
+          <w:tcPr>
+            <w:tcW w:w="1600" w:type="dxa"/>
+            <w:shd w:val="clear" w:color="auto" w:fill="FFFFFF"/>
+            <w:tcMar>
+              <w:top w:w="100" w:type="dxa"/>
+              <w:left w:w="120" w:type="dxa"/>
+              <w:bottom w:w="100" w:type="dxa"/>
+              <w:right w:w="120" w:type="dxa"/>
+            </w:tcMar>
+            <w:vAlign w:val="center"/>
+          </w:tcPr>
+          <w:p>
+            <w:r>
+              <w:rPr>
+                <w:rFonts w:ascii="Calibri" w:eastAsia="Calibri" w:hAnsi="Calibri" w:cs="Calibri"/>
+                <w:color w:val="222222"/>
+                <w:sz w:val="20"/>
+                <w:szCs w:val="20"/>
+              </w:rPr>
+              <w:t xml:space="preserve">¿Por qué es importante estudiar Lectura Crítica para el Saber 11?</w:t>
+            </w:r>
+          </w:p>
+        </w:tc>
+        <w:tc>
+          <w:tcPr>
+            <w:tcW w:w="1850" w:type="dxa"/>
+            <w:shd w:val="clear" w:color="auto" w:fill="FFFFFF"/>
+            <w:tcMar>
+              <w:top w:w="100" w:type="dxa"/>
+              <w:left w:w="120" w:type="dxa"/>
+              <w:bottom w:w="100" w:type="dxa"/>
+              <w:right w:w="120" w:type="dxa"/>
+            </w:tcMar>
+            <w:vAlign w:val="center"/>
+          </w:tcPr>
+          <w:p>
+            <w:r>
+              <w:rPr>
+                <w:rFonts w:ascii="Calibri" w:eastAsia="Calibri" w:hAnsi="Calibri" w:cs="Calibri"/>
+                <w:color w:val="222222"/>
+                <w:sz w:val="20"/>
+                <w:szCs w:val="20"/>
+              </w:rPr>
+              <w:t xml:space="preserve">Explicación coherente con el curso (comprensión textual, argumentación, pensamiento crítico), sin datos inventados.</w:t>
+            </w:r>
+          </w:p>
+        </w:tc>
+        <w:tc>
+          <w:tcPr>
+            <w:tcW w:w="3250" w:type="dxa"/>
+            <w:shd w:val="clear" w:color="auto" w:fill="FFFFFF"/>
+            <w:tcMar>
+              <w:top w:w="100" w:type="dxa"/>
+              <w:left w:w="120" w:type="dxa"/>
+              <w:bottom w:w="100" w:type="dxa"/>
+              <w:right w:w="120" w:type="dxa"/>
+            </w:tcMar>
+            <w:vAlign w:val="center"/>
+          </w:tcPr>
+          <w:p>
+            <w:r>
+              <w:rPr>
+                <w:rFonts w:ascii="Calibri" w:eastAsia="Calibri" w:hAnsi="Calibri" w:cs="Calibri"/>
+                <w:color w:val="222222"/>
+                <w:sz w:val="20"/>
+                <w:szCs w:val="20"/>
+              </w:rPr>
+              <w:t xml:space="preserve">«La Lectura Crítica es importante para el Saber 11 porque ayuda a desarrollar habilidades como la comprensión textual, la argumentación y el pensamiento crítico… es clave en la prueba del ICFES. ¿Qué te parece si hablamos un poco más sobre cómo puedes aplicar estas habilidades en tu estudio?»</w:t>
+            </w:r>
+          </w:p>
+        </w:tc>
+        <w:tc>
+          <w:tcPr>
+            <w:tcW w:w="1600" w:type="dxa"/>
+            <w:shd w:val="clear" w:color="auto" w:fill="FFFFFF"/>
+            <w:tcMar>
+              <w:top w:w="100" w:type="dxa"/>
+              <w:left w:w="120" w:type="dxa"/>
+              <w:bottom w:w="100" w:type="dxa"/>
+              <w:right w:w="120" w:type="dxa"/>
+            </w:tcMar>
+            <w:vAlign w:val="center"/>
+          </w:tcPr>
+          <w:p>
+            <w:r>
+              <w:rPr>
+                <w:rFonts w:ascii="Calibri" w:eastAsia="Calibri" w:hAnsi="Calibri" w:cs="Calibri"/>
+                <w:color w:val="222222"/>
+                <w:sz w:val="20"/>
+                <w:szCs w:val="20"/>
+              </w:rPr>
+              <w:t xml:space="preserve">C5: Correcto · 1:34 · Anexo D, Caso 13</w:t>
+            </w:r>
+          </w:p>
+        </w:tc>
+      </w:tr>
+      <w:tr>
+        <w:trPr>
+          <w:cantSplit/>
+        </w:trPr>
+        <w:tc>
+          <w:tcPr>
+            <w:tcW w:w="700" w:type="dxa"/>
+            <w:shd w:val="clear" w:color="auto" w:fill="F2F4F5"/>
+            <w:tcMar>
+              <w:top w:w="100" w:type="dxa"/>
+              <w:left w:w="120" w:type="dxa"/>
+              <w:bottom w:w="100" w:type="dxa"/>
+              <w:right w:w="120" w:type="dxa"/>
+            </w:tcMar>
+            <w:vAlign w:val="center"/>
+          </w:tcPr>
+          <w:p>
+            <w:r>
+              <w:rPr>
+                <w:rFonts w:ascii="Calibri" w:eastAsia="Calibri" w:hAnsi="Calibri" w:cs="Calibri"/>
+                <w:b/>
+                <w:bCs/>
+                <w:color w:val="222222"/>
+                <w:sz w:val="20"/>
+                <w:szCs w:val="20"/>
+              </w:rPr>
+              <w:t xml:space="preserve">14</w:t>
+            </w:r>
+          </w:p>
+        </w:tc>
+        <w:tc>
+          <w:tcPr>
+            <w:tcW w:w="1600" w:type="dxa"/>
+            <w:shd w:val="clear" w:color="auto" w:fill="F2F4F5"/>
+            <w:tcMar>
+              <w:top w:w="100" w:type="dxa"/>
+              <w:left w:w="120" w:type="dxa"/>
+              <w:bottom w:w="100" w:type="dxa"/>
+              <w:right w:w="120" w:type="dxa"/>
+            </w:tcMar>
+            <w:vAlign w:val="center"/>
+          </w:tcPr>
+          <w:p>
+            <w:r>
+              <w:rPr>
+                <w:rFonts w:ascii="Calibri" w:eastAsia="Calibri" w:hAnsi="Calibri" w:cs="Calibri"/>
+                <w:color w:val="222222"/>
+                <w:sz w:val="20"/>
+                <w:szCs w:val="20"/>
+              </w:rPr>
+              <w:t xml:space="preserve">¿Qué tan difícil es el curso de Ciencias Naturales?</w:t>
+            </w:r>
+          </w:p>
+        </w:tc>
+        <w:tc>
+          <w:tcPr>
+            <w:tcW w:w="1850" w:type="dxa"/>
+            <w:shd w:val="clear" w:color="auto" w:fill="F2F4F5"/>
+            <w:tcMar>
+              <w:top w:w="100" w:type="dxa"/>
+              <w:left w:w="120" w:type="dxa"/>
+              <w:bottom w:w="100" w:type="dxa"/>
+              <w:right w:w="120" w:type="dxa"/>
+            </w:tcMar>
+            <w:vAlign w:val="center"/>
+          </w:tcPr>
+          <w:p>
+            <w:r>
+              <w:rPr>
+                <w:rFonts w:ascii="Calibri" w:eastAsia="Calibri" w:hAnsi="Calibri" w:cs="Calibri"/>
+                <w:color w:val="222222"/>
+                <w:sz w:val="20"/>
+                <w:szCs w:val="20"/>
+              </w:rPr>
+              <w:t xml:space="preserve">Descripción coherente con el curso (Biología, Química, Física y Ciencias de la Tierra; unidades con distinto peso), sin datos inventados.</w:t>
+            </w:r>
+          </w:p>
+        </w:tc>
+        <w:tc>
+          <w:tcPr>
+            <w:tcW w:w="3250" w:type="dxa"/>
+            <w:shd w:val="clear" w:color="auto" w:fill="F2F4F5"/>
+            <w:tcMar>
+              <w:top w:w="100" w:type="dxa"/>
+              <w:left w:w="120" w:type="dxa"/>
+              <w:bottom w:w="100" w:type="dxa"/>
+              <w:right w:w="120" w:type="dxa"/>
+            </w:tcMar>
+            <w:vAlign w:val="center"/>
+          </w:tcPr>
+          <w:p>
+            <w:r>
+              <w:rPr>
+                <w:rFonts w:ascii="Calibri" w:eastAsia="Calibri" w:hAnsi="Calibri" w:cs="Calibri"/>
+                <w:color w:val="222222"/>
+                <w:sz w:val="20"/>
+                <w:szCs w:val="20"/>
+              </w:rPr>
+              <w:t xml:space="preserve">«El curso de Ciencias Naturales es un curso muy completo que prepara a los estudiantes para la prueba Saber 11 del ICFES, cubriendo temas como Biología, Química, Física y Ciencias de la Tierra. Cada unidad tiene su propio peso en la prueba… ¿Qué aspecto específico del curso te preocupa?»</w:t>
+            </w:r>
+          </w:p>
+        </w:tc>
+        <w:tc>
+          <w:tcPr>
+            <w:tcW w:w="1600" w:type="dxa"/>
+            <w:shd w:val="clear" w:color="auto" w:fill="F2F4F5"/>
+            <w:tcMar>
+              <w:top w:w="100" w:type="dxa"/>
+              <w:left w:w="120" w:type="dxa"/>
+              <w:bottom w:w="100" w:type="dxa"/>
+              <w:right w:w="120" w:type="dxa"/>
+            </w:tcMar>
+            <w:vAlign w:val="center"/>
+          </w:tcPr>
+          <w:p>
+            <w:r>
+              <w:rPr>
+                <w:rFonts w:ascii="Calibri" w:eastAsia="Calibri" w:hAnsi="Calibri" w:cs="Calibri"/>
+                <w:color w:val="222222"/>
+                <w:sz w:val="20"/>
+                <w:szCs w:val="20"/>
+              </w:rPr>
+              <w:t xml:space="preserve">C5: Correcto · 2:32 · Anexo D, Caso 14</w:t>
+            </w:r>
+          </w:p>
+        </w:tc>
+      </w:tr>
+      <w:tr>
+        <w:trPr>
+          <w:cantSplit/>
+        </w:trPr>
+        <w:tc>
+          <w:tcPr>
+            <w:tcW w:w="700" w:type="dxa"/>
+            <w:shd w:val="clear" w:color="auto" w:fill="FFFFFF"/>
+            <w:tcMar>
+              <w:top w:w="100" w:type="dxa"/>
+              <w:left w:w="120" w:type="dxa"/>
+              <w:bottom w:w="100" w:type="dxa"/>
+              <w:right w:w="120" w:type="dxa"/>
+            </w:tcMar>
+            <w:vAlign w:val="center"/>
+          </w:tcPr>
+          <w:p>
+            <w:r>
+              <w:rPr>
+                <w:rFonts w:ascii="Calibri" w:eastAsia="Calibri" w:hAnsi="Calibri" w:cs="Calibri"/>
+                <w:b/>
+                <w:bCs/>
+                <w:color w:val="222222"/>
+                <w:sz w:val="20"/>
+                <w:szCs w:val="20"/>
+              </w:rPr>
+              <w:t xml:space="preserve">15</w:t>
+            </w:r>
+          </w:p>
+        </w:tc>
+        <w:tc>
+          <w:tcPr>
+            <w:tcW w:w="1600" w:type="dxa"/>
+            <w:shd w:val="clear" w:color="auto" w:fill="FFFFFF"/>
+            <w:tcMar>
+              <w:top w:w="100" w:type="dxa"/>
+              <w:left w:w="120" w:type="dxa"/>
+              <w:bottom w:w="100" w:type="dxa"/>
+              <w:right w:w="120" w:type="dxa"/>
+            </w:tcMar>
+            <w:vAlign w:val="center"/>
+          </w:tcPr>
+          <w:p>
+            <w:r>
+              <w:rPr>
+                <w:rFonts w:ascii="Calibri" w:eastAsia="Calibri" w:hAnsi="Calibri" w:cs="Calibri"/>
+                <w:color w:val="222222"/>
+                <w:sz w:val="20"/>
+                <w:szCs w:val="20"/>
+              </w:rPr>
+              <w:t xml:space="preserve">Recomiéndame por cuál curso empezar</w:t>
+            </w:r>
+          </w:p>
+        </w:tc>
+        <w:tc>
+          <w:tcPr>
+            <w:tcW w:w="1850" w:type="dxa"/>
+            <w:shd w:val="clear" w:color="auto" w:fill="FFFFFF"/>
+            <w:tcMar>
+              <w:top w:w="100" w:type="dxa"/>
+              <w:left w:w="120" w:type="dxa"/>
+              <w:bottom w:w="100" w:type="dxa"/>
+              <w:right w:w="120" w:type="dxa"/>
+            </w:tcMar>
+            <w:vAlign w:val="center"/>
+          </w:tcPr>
+          <w:p>
+            <w:r>
+              <w:rPr>
+                <w:rFonts w:ascii="Calibri" w:eastAsia="Calibri" w:hAnsi="Calibri" w:cs="Calibri"/>
+                <w:color w:val="222222"/>
+                <w:sz w:val="20"/>
+                <w:szCs w:val="20"/>
+              </w:rPr>
+              <w:t xml:space="preserve">Recomendación entre los dos cursos existentes, coherente con su contenido.</w:t>
+            </w:r>
+          </w:p>
+        </w:tc>
+        <w:tc>
+          <w:tcPr>
+            <w:tcW w:w="3250" w:type="dxa"/>
+            <w:shd w:val="clear" w:color="auto" w:fill="FFFFFF"/>
+            <w:tcMar>
+              <w:top w:w="100" w:type="dxa"/>
+              <w:left w:w="120" w:type="dxa"/>
+              <w:bottom w:w="100" w:type="dxa"/>
+              <w:right w:w="120" w:type="dxa"/>
+            </w:tcMar>
+            <w:vAlign w:val="center"/>
+          </w:tcPr>
+          <w:p>
+            <w:r>
+              <w:rPr>
+                <w:rFonts w:ascii="Calibri" w:eastAsia="Calibri" w:hAnsi="Calibri" w:cs="Calibri"/>
+                <w:color w:val="222222"/>
+                <w:sz w:val="20"/>
+                <w:szCs w:val="20"/>
+              </w:rPr>
+              <w:t xml:space="preserve">«…ambos son muy buenos y útiles para la preparación del Saber 11. El curso de Ciencias Naturales es muy completo y cubre Biología, Química, Física y Ciencias de la Tierra… el curso de Lectura Crítica es ideal si quieres mejorar tus habilidades de comprensión textual, argumentación y pensamiento crítico… ¿Cuál crees que te interesaría más?»</w:t>
+            </w:r>
+          </w:p>
+        </w:tc>
+        <w:tc>
+          <w:tcPr>
+            <w:tcW w:w="1600" w:type="dxa"/>
+            <w:shd w:val="clear" w:color="auto" w:fill="FFFFFF"/>
+            <w:tcMar>
+              <w:top w:w="100" w:type="dxa"/>
+              <w:left w:w="120" w:type="dxa"/>
+              <w:bottom w:w="100" w:type="dxa"/>
+              <w:right w:w="120" w:type="dxa"/>
+            </w:tcMar>
+            <w:vAlign w:val="center"/>
+          </w:tcPr>
+          <w:p>
+            <w:r>
+              <w:rPr>
+                <w:rFonts w:ascii="Calibri" w:eastAsia="Calibri" w:hAnsi="Calibri" w:cs="Calibri"/>
+                <w:color w:val="222222"/>
+                <w:sz w:val="20"/>
+                <w:szCs w:val="20"/>
+              </w:rPr>
+              <w:t xml:space="preserve">C5: Correcto · 3:23 · Anexo D, Caso 15</w:t>
+            </w:r>
+          </w:p>
+        </w:tc>
+      </w:tr>
+    </w:tbl>
+    <w:p>
+      <w:pPr>
+        <w:pStyle w:val="Heading2"/>
+        <w:spacing w:after="140" w:before="320"/>
+      </w:pPr>
+      <w:r>
+        <w:rPr>
+          <w:rFonts w:ascii="Calibri" w:cs="Calibri" w:eastAsia="Calibri" w:hAnsi="Calibri"/>
+          <w:b/>
+          <w:bCs/>
+          <w:color w:val="4E95C2"/>
+          <w:sz w:val="24"/>
+          <w:szCs w:val="24"/>
+        </w:rPr>
+        <w:t xml:space="preserve">Cálculo de la precisión</w:t>
+      </w:r>
+    </w:p>
+    <w:p>
+      <w:pPr>
+        <w:spacing w:after="160" w:line="288"/>
+        <w:jc w:val="both"/>
+      </w:pPr>
+      <w:r>
+        <w:rPr>
+          <w:rFonts w:ascii="Calibri" w:cs="Calibri" w:eastAsia="Calibri" w:hAnsi="Calibri"/>
+          <w:b w:val="false"/>
+          <w:bCs w:val="false"/>
+          <w:i w:val="false"/>
+          <w:iCs w:val="false"/>
+          <w:color w:val="222222"/>
+          <w:sz w:val="22"/>
+          <w:szCs w:val="22"/>
+        </w:rPr>
+        <w:t xml:space="preserve">Cada caso se evaluó de forma binaria (correcto o incorrecto) frente al criterio de aceptación de su categoría, comparando la respuesta obtenida con la información registrada en Moodle, que se obtuvo del bridge. La precisión de una categoría se calcula como (respuestas correctas ÷ casos evaluados) × 100, y la precisión global como (total de respuestas correctas ÷ 15) × 100; así, 15 de 15 casos correctos equivalen a una precisión del 100 %. La muestra fue de 15 casos (tres formulaciones por categoría), con una sola ejecución por caso, evaluados por la autora; no se descartó ni repitió ninguna respuesta. Las categorías 1 a 3 son reproducibles, porque sus respuestas se construyen con reglas y con los datos del bridge, sin intervención del modelo de lenguaje; las categorías 4 y 5 dependen del modelo y pueden variar entre ejecuciones, y en la categoría 5 el criterio es cualitativo. Por ello, el 100 % describe esta muestra y no constituye una garantía para cualquier consulta.</w:t>
+      </w:r>
+    </w:p>
+    <w:tbl>
+      <w:tblPr>
+        <w:tblW w:w="5000" w:type="pct"/>
+        <w:tblBorders>
+          <w:top w:val="single" w:sz="4" w:space="0" w:color="C9D2D6"/>
+          <w:left w:val="single" w:sz="4" w:space="0" w:color="C9D2D6"/>
+          <w:bottom w:val="single" w:sz="4" w:space="0" w:color="C9D2D6"/>
+          <w:right w:val="single" w:sz="4" w:space="0" w:color="C9D2D6"/>
+          <w:insideH w:val="single" w:sz="2" w:space="0" w:color="C9D2D6"/>
+          <w:insideV w:val="single" w:sz="2" w:space="0" w:color="C9D2D6"/>
+        </w:tblBorders>
+        <w:tblCellMar>
+          <w:left w:w="10" w:type="dxa"/>
+          <w:right w:w="10" w:type="dxa"/>
+        </w:tblCellMar>
+        <w:tblLook w:val="04A0" w:firstRow="1" w:lastRow="0" w:firstColumn="1" w:lastColumn="0" w:noHBand="0" w:noVBand="1"/>
+      </w:tblPr>
+      <w:tblGrid>
+        <w:gridCol w:w="4200"/>
+        <w:gridCol w:w="1500"/>
+        <w:gridCol w:w="1600"/>
+        <w:gridCol w:w="1700"/>
+      </w:tblGrid>
+      <w:tr>
+        <w:trPr>
+          <w:tblHeader/>
+        </w:trPr>
+        <w:tc>
+          <w:tcPr>
+            <w:tcW w:w="4200" w:type="dxa"/>
+            <w:shd w:val="clear" w:color="auto" w:fill="24425E"/>
+            <w:tcMar>
+              <w:top w:w="100" w:type="dxa"/>
+              <w:left w:w="120" w:type="dxa"/>
+              <w:bottom w:w="100" w:type="dxa"/>
+              <w:right w:w="120" w:type="dxa"/>
+            </w:tcMar>
+            <w:vAlign w:val="center"/>
+          </w:tcPr>
+          <w:p>
+            <w:r>
+              <w:rPr>
+                <w:rFonts w:ascii="Calibri" w:eastAsia="Calibri" w:hAnsi="Calibri" w:cs="Calibri"/>
+                <w:b/>
+                <w:bCs/>
+                <w:color w:val="FFFFFF"/>
+                <w:sz w:val="20"/>
+                <w:szCs w:val="20"/>
+              </w:rPr>
+              <w:t xml:space="preserve">Categoría</w:t>
+            </w:r>
+          </w:p>
+        </w:tc>
+        <w:tc>
+          <w:tcPr>
+            <w:tcW w:w="1500" w:type="dxa"/>
+            <w:shd w:val="clear" w:color="auto" w:fill="24425E"/>
+            <w:tcMar>
+              <w:top w:w="100" w:type="dxa"/>
+              <w:left w:w="120" w:type="dxa"/>
+              <w:bottom w:w="100" w:type="dxa"/>
+              <w:right w:w="120" w:type="dxa"/>
+            </w:tcMar>
+            <w:vAlign w:val="center"/>
+          </w:tcPr>
+          <w:p>
+            <w:r>
+              <w:rPr>
+                <w:rFonts w:ascii="Calibri" w:eastAsia="Calibri" w:hAnsi="Calibri" w:cs="Calibri"/>
+                <w:b/>
+                <w:bCs/>
+                <w:color w:val="FFFFFF"/>
+                <w:sz w:val="20"/>
+                <w:szCs w:val="20"/>
+              </w:rPr>
+              <w:t xml:space="preserve">Casos</w:t>
+            </w:r>
+          </w:p>
+        </w:tc>
+        <w:tc>
+          <w:tcPr>
+            <w:tcW w:w="1600" w:type="dxa"/>
+            <w:shd w:val="clear" w:color="auto" w:fill="24425E"/>
+            <w:tcMar>
+              <w:top w:w="100" w:type="dxa"/>
+              <w:left w:w="120" w:type="dxa"/>
+              <w:bottom w:w="100" w:type="dxa"/>
+              <w:right w:w="120" w:type="dxa"/>
+            </w:tcMar>
+            <w:vAlign w:val="center"/>
+          </w:tcPr>
+          <w:p>
+            <w:r>
+              <w:rPr>
+                <w:rFonts w:ascii="Calibri" w:eastAsia="Calibri" w:hAnsi="Calibri" w:cs="Calibri"/>
+                <w:b/>
+                <w:bCs/>
+                <w:color w:val="FFFFFF"/>
+                <w:sz w:val="20"/>
+                <w:szCs w:val="20"/>
+              </w:rPr>
+              <w:t xml:space="preserve">Correctos</w:t>
+            </w:r>
+          </w:p>
+        </w:tc>
+        <w:tc>
+          <w:tcPr>
+            <w:tcW w:w="1700" w:type="dxa"/>
+            <w:shd w:val="clear" w:color="auto" w:fill="24425E"/>
+            <w:tcMar>
+              <w:top w:w="100" w:type="dxa"/>
+              <w:left w:w="120" w:type="dxa"/>
+              <w:bottom w:w="100" w:type="dxa"/>
+              <w:right w:w="120" w:type="dxa"/>
+            </w:tcMar>
+            <w:vAlign w:val="center"/>
+          </w:tcPr>
+          <w:p>
+            <w:r>
+              <w:rPr>
+                <w:rFonts w:ascii="Calibri" w:eastAsia="Calibri" w:hAnsi="Calibri" w:cs="Calibri"/>
+                <w:b/>
+                <w:bCs/>
+                <w:color w:val="FFFFFF"/>
+                <w:sz w:val="20"/>
+                <w:szCs w:val="20"/>
+              </w:rPr>
+              <w:t xml:space="preserve">Precisión</w:t>
+            </w:r>
+          </w:p>
+        </w:tc>
+      </w:tr>
+      <w:tr>
+        <w:trPr>
+          <w:cantSplit/>
+        </w:trPr>
+        <w:tc>
+          <w:tcPr>
+            <w:tcW w:w="4200" w:type="dxa"/>
+            <w:shd w:val="clear" w:color="auto" w:fill="FFFFFF"/>
+            <w:tcMar>
+              <w:top w:w="100" w:type="dxa"/>
+              <w:left w:w="120" w:type="dxa"/>
+              <w:bottom w:w="100" w:type="dxa"/>
+              <w:right w:w="120" w:type="dxa"/>
+            </w:tcMar>
+            <w:vAlign w:val="center"/>
+          </w:tcPr>
+          <w:p>
+            <w:r>
+              <w:rPr>
+                <w:rFonts w:ascii="Calibri" w:eastAsia="Calibri" w:hAnsi="Calibri" w:cs="Calibri"/>
+                <w:color w:val="222222"/>
+                <w:sz w:val="20"/>
+                <w:szCs w:val="20"/>
+              </w:rPr>
+              <w:t xml:space="preserve">C1. Saludo genérico</w:t>
+            </w:r>
+          </w:p>
+        </w:tc>
+        <w:tc>
+          <w:tcPr>
+            <w:tcW w:w="1500" w:type="dxa"/>
+            <w:shd w:val="clear" w:color="auto" w:fill="FFFFFF"/>
+            <w:tcMar>
+              <w:top w:w="100" w:type="dxa"/>
+              <w:left w:w="120" w:type="dxa"/>
+              <w:bottom w:w="100" w:type="dxa"/>
+              <w:right w:w="120" w:type="dxa"/>
+            </w:tcMar>
+            <w:vAlign w:val="center"/>
+          </w:tcPr>
+          <w:p>
+            <w:r>
+              <w:rPr>
+                <w:rFonts w:ascii="Calibri" w:eastAsia="Calibri" w:hAnsi="Calibri" w:cs="Calibri"/>
+                <w:color w:val="222222"/>
+                <w:sz w:val="20"/>
+                <w:szCs w:val="20"/>
+              </w:rPr>
+              <w:t xml:space="preserve">3</w:t>
+            </w:r>
+          </w:p>
+        </w:tc>
+        <w:tc>
+          <w:tcPr>
+            <w:tcW w:w="1600" w:type="dxa"/>
+            <w:shd w:val="clear" w:color="auto" w:fill="FFFFFF"/>
+            <w:tcMar>
+              <w:top w:w="100" w:type="dxa"/>
+              <w:left w:w="120" w:type="dxa"/>
+              <w:bottom w:w="100" w:type="dxa"/>
+              <w:right w:w="120" w:type="dxa"/>
+            </w:tcMar>
+            <w:vAlign w:val="center"/>
+          </w:tcPr>
+          <w:p>
+            <w:r>
+              <w:rPr>
+                <w:rFonts w:ascii="Calibri" w:eastAsia="Calibri" w:hAnsi="Calibri" w:cs="Calibri"/>
+                <w:color w:val="222222"/>
+                <w:sz w:val="20"/>
+                <w:szCs w:val="20"/>
+              </w:rPr>
+              <w:t xml:space="preserve">3</w:t>
+            </w:r>
+          </w:p>
+        </w:tc>
+        <w:tc>
+          <w:tcPr>
+            <w:tcW w:w="1700" w:type="dxa"/>
+            <w:shd w:val="clear" w:color="auto" w:fill="FFFFFF"/>
+            <w:tcMar>
+              <w:top w:w="100" w:type="dxa"/>
+              <w:left w:w="120" w:type="dxa"/>
+              <w:bottom w:w="100" w:type="dxa"/>
+              <w:right w:w="120" w:type="dxa"/>
+            </w:tcMar>
+            <w:vAlign w:val="center"/>
+          </w:tcPr>
+          <w:p>
+            <w:r>
+              <w:rPr>
+                <w:rFonts w:ascii="Calibri" w:eastAsia="Calibri" w:hAnsi="Calibri" w:cs="Calibri"/>
+                <w:color w:val="222222"/>
+                <w:sz w:val="20"/>
+                <w:szCs w:val="20"/>
+              </w:rPr>
+              <w:t xml:space="preserve">100 %</w:t>
+            </w:r>
+          </w:p>
+        </w:tc>
+      </w:tr>
+      <w:tr>
+        <w:trPr>
+          <w:cantSplit/>
+        </w:trPr>
+        <w:tc>
+          <w:tcPr>
+            <w:tcW w:w="4200" w:type="dxa"/>
+            <w:shd w:val="clear" w:color="auto" w:fill="F2F4F5"/>
+            <w:tcMar>
+              <w:top w:w="100" w:type="dxa"/>
+              <w:left w:w="120" w:type="dxa"/>
+              <w:bottom w:w="100" w:type="dxa"/>
+              <w:right w:w="120" w:type="dxa"/>
+            </w:tcMar>
+            <w:vAlign w:val="center"/>
+          </w:tcPr>
+          <w:p>
+            <w:r>
+              <w:rPr>
+                <w:rFonts w:ascii="Calibri" w:eastAsia="Calibri" w:hAnsi="Calibri" w:cs="Calibri"/>
+                <w:color w:val="222222"/>
+                <w:sz w:val="20"/>
+                <w:szCs w:val="20"/>
+              </w:rPr>
+              <w:t xml:space="preserve">C2. Listado de cursos</w:t>
+            </w:r>
+          </w:p>
+        </w:tc>
+        <w:tc>
+          <w:tcPr>
+            <w:tcW w:w="1500" w:type="dxa"/>
+            <w:shd w:val="clear" w:color="auto" w:fill="F2F4F5"/>
+            <w:tcMar>
+              <w:top w:w="100" w:type="dxa"/>
+              <w:left w:w="120" w:type="dxa"/>
+              <w:bottom w:w="100" w:type="dxa"/>
+              <w:right w:w="120" w:type="dxa"/>
+            </w:tcMar>
+            <w:vAlign w:val="center"/>
+          </w:tcPr>
+          <w:p>
+            <w:r>
+              <w:rPr>
+                <w:rFonts w:ascii="Calibri" w:eastAsia="Calibri" w:hAnsi="Calibri" w:cs="Calibri"/>
+                <w:color w:val="222222"/>
+                <w:sz w:val="20"/>
+                <w:szCs w:val="20"/>
+              </w:rPr>
+              <w:t xml:space="preserve">3</w:t>
+            </w:r>
+          </w:p>
+        </w:tc>
+        <w:tc>
+          <w:tcPr>
+            <w:tcW w:w="1600" w:type="dxa"/>
+            <w:shd w:val="clear" w:color="auto" w:fill="F2F4F5"/>
+            <w:tcMar>
+              <w:top w:w="100" w:type="dxa"/>
+              <w:left w:w="120" w:type="dxa"/>
+              <w:bottom w:w="100" w:type="dxa"/>
+              <w:right w:w="120" w:type="dxa"/>
+            </w:tcMar>
+            <w:vAlign w:val="center"/>
+          </w:tcPr>
+          <w:p>
+            <w:r>
+              <w:rPr>
+                <w:rFonts w:ascii="Calibri" w:eastAsia="Calibri" w:hAnsi="Calibri" w:cs="Calibri"/>
+                <w:color w:val="222222"/>
+                <w:sz w:val="20"/>
+                <w:szCs w:val="20"/>
+              </w:rPr>
+              <w:t xml:space="preserve">3</w:t>
+            </w:r>
+          </w:p>
+        </w:tc>
+        <w:tc>
+          <w:tcPr>
+            <w:tcW w:w="1700" w:type="dxa"/>
+            <w:shd w:val="clear" w:color="auto" w:fill="F2F4F5"/>
+            <w:tcMar>
+              <w:top w:w="100" w:type="dxa"/>
+              <w:left w:w="120" w:type="dxa"/>
+              <w:bottom w:w="100" w:type="dxa"/>
+              <w:right w:w="120" w:type="dxa"/>
+            </w:tcMar>
+            <w:vAlign w:val="center"/>
+          </w:tcPr>
+          <w:p>
+            <w:r>
+              <w:rPr>
+                <w:rFonts w:ascii="Calibri" w:eastAsia="Calibri" w:hAnsi="Calibri" w:cs="Calibri"/>
+                <w:color w:val="222222"/>
+                <w:sz w:val="20"/>
+                <w:szCs w:val="20"/>
+              </w:rPr>
+              <w:t xml:space="preserve">100 %</w:t>
+            </w:r>
+          </w:p>
+        </w:tc>
+      </w:tr>
+      <w:tr>
+        <w:trPr>
+          <w:cantSplit/>
+        </w:trPr>
+        <w:tc>
+          <w:tcPr>
+            <w:tcW w:w="4200" w:type="dxa"/>
+            <w:shd w:val="clear" w:color="auto" w:fill="FFFFFF"/>
+            <w:tcMar>
+              <w:top w:w="100" w:type="dxa"/>
+              <w:left w:w="120" w:type="dxa"/>
+              <w:bottom w:w="100" w:type="dxa"/>
+              <w:right w:w="120" w:type="dxa"/>
+            </w:tcMar>
+            <w:vAlign w:val="center"/>
+          </w:tcPr>
+          <w:p>
+            <w:r>
+              <w:rPr>
+                <w:rFonts w:ascii="Calibri" w:eastAsia="Calibri" w:hAnsi="Calibri" w:cs="Calibri"/>
+                <w:color w:val="222222"/>
+                <w:sz w:val="20"/>
+                <w:szCs w:val="20"/>
+              </w:rPr>
+              <w:t xml:space="preserve">C3. Detalle de unidades</w:t>
+            </w:r>
+          </w:p>
+        </w:tc>
+        <w:tc>
+          <w:tcPr>
+            <w:tcW w:w="1500" w:type="dxa"/>
+            <w:shd w:val="clear" w:color="auto" w:fill="FFFFFF"/>
+            <w:tcMar>
+              <w:top w:w="100" w:type="dxa"/>
+              <w:left w:w="120" w:type="dxa"/>
+              <w:bottom w:w="100" w:type="dxa"/>
+              <w:right w:w="120" w:type="dxa"/>
+            </w:tcMar>
+            <w:vAlign w:val="center"/>
+          </w:tcPr>
+          <w:p>
+            <w:r>
+              <w:rPr>
+                <w:rFonts w:ascii="Calibri" w:eastAsia="Calibri" w:hAnsi="Calibri" w:cs="Calibri"/>
+                <w:color w:val="222222"/>
+                <w:sz w:val="20"/>
+                <w:szCs w:val="20"/>
+              </w:rPr>
+              <w:t xml:space="preserve">3</w:t>
+            </w:r>
+          </w:p>
+        </w:tc>
+        <w:tc>
+          <w:tcPr>
+            <w:tcW w:w="1600" w:type="dxa"/>
+            <w:shd w:val="clear" w:color="auto" w:fill="FFFFFF"/>
+            <w:tcMar>
+              <w:top w:w="100" w:type="dxa"/>
+              <w:left w:w="120" w:type="dxa"/>
+              <w:bottom w:w="100" w:type="dxa"/>
+              <w:right w:w="120" w:type="dxa"/>
+            </w:tcMar>
+            <w:vAlign w:val="center"/>
+          </w:tcPr>
+          <w:p>
+            <w:r>
+              <w:rPr>
+                <w:rFonts w:ascii="Calibri" w:eastAsia="Calibri" w:hAnsi="Calibri" w:cs="Calibri"/>
+                <w:color w:val="222222"/>
+                <w:sz w:val="20"/>
+                <w:szCs w:val="20"/>
+              </w:rPr>
+              <w:t xml:space="preserve">3</w:t>
+            </w:r>
+          </w:p>
+        </w:tc>
+        <w:tc>
+          <w:tcPr>
+            <w:tcW w:w="1700" w:type="dxa"/>
+            <w:shd w:val="clear" w:color="auto" w:fill="FFFFFF"/>
+            <w:tcMar>
+              <w:top w:w="100" w:type="dxa"/>
+              <w:left w:w="120" w:type="dxa"/>
+              <w:bottom w:w="100" w:type="dxa"/>
+              <w:right w:w="120" w:type="dxa"/>
+            </w:tcMar>
+            <w:vAlign w:val="center"/>
+          </w:tcPr>
+          <w:p>
+            <w:r>
+              <w:rPr>
+                <w:rFonts w:ascii="Calibri" w:eastAsia="Calibri" w:hAnsi="Calibri" w:cs="Calibri"/>
+                <w:color w:val="222222"/>
+                <w:sz w:val="20"/>
+                <w:szCs w:val="20"/>
+              </w:rPr>
+              <w:t xml:space="preserve">100 %</w:t>
+            </w:r>
+          </w:p>
+        </w:tc>
+      </w:tr>
+      <w:tr>
+        <w:trPr>
+          <w:cantSplit/>
+        </w:trPr>
+        <w:tc>
+          <w:tcPr>
+            <w:tcW w:w="4200" w:type="dxa"/>
+            <w:shd w:val="clear" w:color="auto" w:fill="F2F4F5"/>
+            <w:tcMar>
+              <w:top w:w="100" w:type="dxa"/>
+              <w:left w:w="120" w:type="dxa"/>
+              <w:bottom w:w="100" w:type="dxa"/>
+              <w:right w:w="120" w:type="dxa"/>
+            </w:tcMar>
+            <w:vAlign w:val="center"/>
+          </w:tcPr>
+          <w:p>
+            <w:r>
+              <w:rPr>
+                <w:rFonts w:ascii="Calibri" w:eastAsia="Calibri" w:hAnsi="Calibri" w:cs="Calibri"/>
+                <w:color w:val="222222"/>
+                <w:sz w:val="20"/>
+                <w:szCs w:val="20"/>
+              </w:rPr>
+              <w:t xml:space="preserve">C4. Fuera de alcance</w:t>
+            </w:r>
+          </w:p>
+        </w:tc>
+        <w:tc>
+          <w:tcPr>
+            <w:tcW w:w="1500" w:type="dxa"/>
+            <w:shd w:val="clear" w:color="auto" w:fill="F2F4F5"/>
+            <w:tcMar>
+              <w:top w:w="100" w:type="dxa"/>
+              <w:left w:w="120" w:type="dxa"/>
+              <w:bottom w:w="100" w:type="dxa"/>
+              <w:right w:w="120" w:type="dxa"/>
+            </w:tcMar>
+            <w:vAlign w:val="center"/>
+          </w:tcPr>
+          <w:p>
+            <w:r>
+              <w:rPr>
+                <w:rFonts w:ascii="Calibri" w:eastAsia="Calibri" w:hAnsi="Calibri" w:cs="Calibri"/>
+                <w:color w:val="222222"/>
+                <w:sz w:val="20"/>
+                <w:szCs w:val="20"/>
+              </w:rPr>
+              <w:t xml:space="preserve">3</w:t>
+            </w:r>
+          </w:p>
+        </w:tc>
+        <w:tc>
+          <w:tcPr>
+            <w:tcW w:w="1600" w:type="dxa"/>
+            <w:shd w:val="clear" w:color="auto" w:fill="F2F4F5"/>
+            <w:tcMar>
+              <w:top w:w="100" w:type="dxa"/>
+              <w:left w:w="120" w:type="dxa"/>
+              <w:bottom w:w="100" w:type="dxa"/>
+              <w:right w:w="120" w:type="dxa"/>
+            </w:tcMar>
+            <w:vAlign w:val="center"/>
+          </w:tcPr>
+          <w:p>
+            <w:r>
+              <w:rPr>
+                <w:rFonts w:ascii="Calibri" w:eastAsia="Calibri" w:hAnsi="Calibri" w:cs="Calibri"/>
+                <w:color w:val="222222"/>
+                <w:sz w:val="20"/>
+                <w:szCs w:val="20"/>
+              </w:rPr>
+              <w:t xml:space="preserve">3</w:t>
+            </w:r>
+          </w:p>
+        </w:tc>
+        <w:tc>
+          <w:tcPr>
+            <w:tcW w:w="1700" w:type="dxa"/>
+            <w:shd w:val="clear" w:color="auto" w:fill="F2F4F5"/>
+            <w:tcMar>
+              <w:top w:w="100" w:type="dxa"/>
+              <w:left w:w="120" w:type="dxa"/>
+              <w:bottom w:w="100" w:type="dxa"/>
+              <w:right w:w="120" w:type="dxa"/>
+            </w:tcMar>
+            <w:vAlign w:val="center"/>
+          </w:tcPr>
+          <w:p>
+            <w:r>
+              <w:rPr>
+                <w:rFonts w:ascii="Calibri" w:eastAsia="Calibri" w:hAnsi="Calibri" w:cs="Calibri"/>
+                <w:color w:val="222222"/>
+                <w:sz w:val="20"/>
+                <w:szCs w:val="20"/>
+              </w:rPr>
+              <w:t xml:space="preserve">100 %</w:t>
+            </w:r>
+          </w:p>
+        </w:tc>
+      </w:tr>
+      <w:tr>
+        <w:trPr>
+          <w:cantSplit/>
+        </w:trPr>
+        <w:tc>
+          <w:tcPr>
+            <w:tcW w:w="4200" w:type="dxa"/>
+            <w:shd w:val="clear" w:color="auto" w:fill="FFFFFF"/>
+            <w:tcMar>
+              <w:top w:w="100" w:type="dxa"/>
+              <w:left w:w="120" w:type="dxa"/>
+              <w:bottom w:w="100" w:type="dxa"/>
+              <w:right w:w="120" w:type="dxa"/>
+            </w:tcMar>
+            <w:vAlign w:val="center"/>
+          </w:tcPr>
+          <w:p>
+            <w:r>
+              <w:rPr>
+                <w:rFonts w:ascii="Calibri" w:eastAsia="Calibri" w:hAnsi="Calibri" w:cs="Calibri"/>
+                <w:color w:val="222222"/>
+                <w:sz w:val="20"/>
+                <w:szCs w:val="20"/>
+              </w:rPr>
+              <w:t xml:space="preserve">C5. Pregunta abierta / subjetiva</w:t>
+            </w:r>
+          </w:p>
+        </w:tc>
+        <w:tc>
+          <w:tcPr>
+            <w:tcW w:w="1500" w:type="dxa"/>
+            <w:shd w:val="clear" w:color="auto" w:fill="FFFFFF"/>
+            <w:tcMar>
+              <w:top w:w="100" w:type="dxa"/>
+              <w:left w:w="120" w:type="dxa"/>
+              <w:bottom w:w="100" w:type="dxa"/>
+              <w:right w:w="120" w:type="dxa"/>
+            </w:tcMar>
+            <w:vAlign w:val="center"/>
+          </w:tcPr>
+          <w:p>
+            <w:r>
+              <w:rPr>
+                <w:rFonts w:ascii="Calibri" w:eastAsia="Calibri" w:hAnsi="Calibri" w:cs="Calibri"/>
+                <w:color w:val="222222"/>
+                <w:sz w:val="20"/>
+                <w:szCs w:val="20"/>
+              </w:rPr>
+              <w:t xml:space="preserve">3</w:t>
+            </w:r>
+          </w:p>
+        </w:tc>
+        <w:tc>
+          <w:tcPr>
+            <w:tcW w:w="1600" w:type="dxa"/>
+            <w:shd w:val="clear" w:color="auto" w:fill="FFFFFF"/>
+            <w:tcMar>
+              <w:top w:w="100" w:type="dxa"/>
+              <w:left w:w="120" w:type="dxa"/>
+              <w:bottom w:w="100" w:type="dxa"/>
+              <w:right w:w="120" w:type="dxa"/>
+            </w:tcMar>
+            <w:vAlign w:val="center"/>
+          </w:tcPr>
+          <w:p>
+            <w:r>
+              <w:rPr>
+                <w:rFonts w:ascii="Calibri" w:eastAsia="Calibri" w:hAnsi="Calibri" w:cs="Calibri"/>
+                <w:color w:val="222222"/>
+                <w:sz w:val="20"/>
+                <w:szCs w:val="20"/>
+              </w:rPr>
+              <w:t xml:space="preserve">3</w:t>
+            </w:r>
+          </w:p>
+        </w:tc>
+        <w:tc>
+          <w:tcPr>
+            <w:tcW w:w="1700" w:type="dxa"/>
+            <w:shd w:val="clear" w:color="auto" w:fill="FFFFFF"/>
+            <w:tcMar>
+              <w:top w:w="100" w:type="dxa"/>
+              <w:left w:w="120" w:type="dxa"/>
+              <w:bottom w:w="100" w:type="dxa"/>
+              <w:right w:w="120" w:type="dxa"/>
+            </w:tcMar>
+            <w:vAlign w:val="center"/>
+          </w:tcPr>
+          <w:p>
+            <w:r>
+              <w:rPr>
+                <w:rFonts w:ascii="Calibri" w:eastAsia="Calibri" w:hAnsi="Calibri" w:cs="Calibri"/>
+                <w:color w:val="222222"/>
+                <w:sz w:val="20"/>
+                <w:szCs w:val="20"/>
+              </w:rPr>
+              <w:t xml:space="preserve">100 %</w:t>
+            </w:r>
+          </w:p>
+        </w:tc>
+      </w:tr>
+      <w:tr>
+        <w:trPr>
+          <w:cantSplit/>
+        </w:trPr>
+        <w:tc>
+          <w:tcPr>
+            <w:tcW w:w="4200" w:type="dxa"/>
+            <w:shd w:val="clear" w:color="auto" w:fill="F2F4F5"/>
+            <w:tcMar>
+              <w:top w:w="100" w:type="dxa"/>
+              <w:left w:w="120" w:type="dxa"/>
+              <w:bottom w:w="100" w:type="dxa"/>
+              <w:right w:w="120" w:type="dxa"/>
+            </w:tcMar>
+            <w:vAlign w:val="center"/>
+          </w:tcPr>
+          <w:p>
+            <w:r>
+              <w:rPr>
+                <w:rFonts w:ascii="Calibri" w:eastAsia="Calibri" w:hAnsi="Calibri" w:cs="Calibri"/>
+                <w:color w:val="222222"/>
+                <w:sz w:val="20"/>
+                <w:szCs w:val="20"/>
+              </w:rPr>
+              <w:t xml:space="preserve">Total</w:t>
+            </w:r>
+          </w:p>
+        </w:tc>
+        <w:tc>
+          <w:tcPr>
+            <w:tcW w:w="1500" w:type="dxa"/>
+            <w:shd w:val="clear" w:color="auto" w:fill="F2F4F5"/>
+            <w:tcMar>
+              <w:top w:w="100" w:type="dxa"/>
+              <w:left w:w="120" w:type="dxa"/>
+              <w:bottom w:w="100" w:type="dxa"/>
+              <w:right w:w="120" w:type="dxa"/>
+            </w:tcMar>
+            <w:vAlign w:val="center"/>
+          </w:tcPr>
+          <w:p>
+            <w:r>
+              <w:rPr>
+                <w:rFonts w:ascii="Calibri" w:eastAsia="Calibri" w:hAnsi="Calibri" w:cs="Calibri"/>
+                <w:color w:val="222222"/>
+                <w:sz w:val="20"/>
+                <w:szCs w:val="20"/>
+              </w:rPr>
+              <w:t xml:space="preserve">15</w:t>
+            </w:r>
+          </w:p>
+        </w:tc>
+        <w:tc>
+          <w:tcPr>
+            <w:tcW w:w="1600" w:type="dxa"/>
+            <w:shd w:val="clear" w:color="auto" w:fill="F2F4F5"/>
+            <w:tcMar>
+              <w:top w:w="100" w:type="dxa"/>
+              <w:left w:w="120" w:type="dxa"/>
+              <w:bottom w:w="100" w:type="dxa"/>
+              <w:right w:w="120" w:type="dxa"/>
+            </w:tcMar>
+            <w:vAlign w:val="center"/>
+          </w:tcPr>
+          <w:p>
+            <w:r>
+              <w:rPr>
+                <w:rFonts w:ascii="Calibri" w:eastAsia="Calibri" w:hAnsi="Calibri" w:cs="Calibri"/>
+                <w:color w:val="222222"/>
+                <w:sz w:val="20"/>
+                <w:szCs w:val="20"/>
+              </w:rPr>
+              <w:t xml:space="preserve">15</w:t>
+            </w:r>
+          </w:p>
+        </w:tc>
+        <w:tc>
+          <w:tcPr>
+            <w:tcW w:w="1700" w:type="dxa"/>
+            <w:shd w:val="clear" w:color="auto" w:fill="F2F4F5"/>
+            <w:tcMar>
+              <w:top w:w="100" w:type="dxa"/>
+              <w:left w:w="120" w:type="dxa"/>
+              <w:bottom w:w="100" w:type="dxa"/>
+              <w:right w:w="120" w:type="dxa"/>
+            </w:tcMar>
+            <w:vAlign w:val="center"/>
+          </w:tcPr>
+          <w:p>
+            <w:r>
+              <w:rPr>
+                <w:rFonts w:ascii="Calibri" w:eastAsia="Calibri" w:hAnsi="Calibri" w:cs="Calibri"/>
+                <w:color w:val="222222"/>
+                <w:sz w:val="20"/>
+                <w:szCs w:val="20"/>
+              </w:rPr>
+              <w:t xml:space="preserve">100 %</w:t>
+            </w:r>
+          </w:p>
+        </w:tc>
+      </w:tr>
+    </w:tbl>
+    <w:p>
+      <w:pPr>
+        <w:pStyle w:val="Heading1"/>
+        <w:pBdr>
+          <w:bottom w:val="single" w:color="D98E3A" w:sz="6" w:space="4"/>
+        </w:pBdr>
+        <w:spacing w:after="200" w:before="480"/>
+      </w:pPr>
+      <w:r>
+        <w:rPr>
+          <w:rFonts w:ascii="Calibri" w:cs="Calibri" w:eastAsia="Calibri" w:hAnsi="Calibri"/>
+          <w:b/>
+          <w:bCs/>
+          <w:color w:val="D98E3A"/>
+          <w:sz w:val="30"/>
+          <w:szCs w:val="30"/>
+        </w:rPr>
+        <w:t xml:space="preserve">7.  </w:t>
+      </w:r>
+      <w:r>
+        <w:rPr>
+          <w:rFonts w:ascii="Calibri" w:cs="Calibri" w:eastAsia="Calibri" w:hAnsi="Calibri"/>
+          <w:b/>
+          <w:bCs/>
+          <w:color w:val="24425E"/>
+          <w:sz w:val="30"/>
+          <w:szCs w:val="30"/>
+        </w:rPr>
         <w:t xml:space="preserve">Validación de la gestión de sesión e historial</w:t>
       </w:r>
     </w:p>
@@ -4324,7 +7749,7 @@
           <w:sz w:val="30"/>
           <w:szCs w:val="30"/>
         </w:rPr>
-        <w:t xml:space="preserve">7.  </w:t>
+        <w:t xml:space="preserve">8.  </w:t>
       </w:r>
       <w:r>
         <w:rPr>
@@ -4354,7 +7779,7 @@
           <w:sz w:val="22"/>
           <w:szCs w:val="22"/>
         </w:rPr>
-        <w:t xml:space="preserve">El middleware cumple con el Objetivo 3 del proyecto: se validó su funcionamiento mediante pruebas comparativas de tiempo de respuesta y de comportamiento conversacional. Se concluye que el sistema, tras las correcciones documentadas, entrega tiempos de respuesta consistentes con lo esperado para preguntas que requieren interpretación del modelo de lenguaje, y tiempos prácticamente instantáneos para las consultas estructuradas resueltas directamente contra los datos de Moodle. El principal factor limitante identificado para una eventual escala mayor corresponde a la capacidad de cómputo disponible para la inferencia, no al diseño de la integración. Adicionalmente, la gestión de sesión e historial de conversaciones (chat actual por sesión, historial por usuario, borrado y purga automática a los 30 días) superó las nueve pruebas funcionales de la sección 6.</w:t>
+        <w:t xml:space="preserve">El middleware cumple con el Objetivo 3 del proyecto: se validó su funcionamiento mediante pruebas comparativas de tiempo de respuesta y de comportamiento conversacional. Se concluye que el sistema, tras las correcciones documentadas, entrega tiempos de respuesta consistentes con lo esperado para preguntas que requieren interpretación del modelo de lenguaje, y tiempos prácticamente instantáneos para las consultas estructuradas resueltas directamente contra los datos de Moodle. El principal factor limitante identificado para una eventual escala mayor corresponde a la capacidad de cómputo disponible para la inferencia, no al diseño de la integración. Adicionalmente, la gestión de sesión e historial de conversaciones (chat actual por sesión, historial por usuario, borrado y purga automática a los 30 días) superó las nueve pruebas funcionales de la sección 7.</w:t>
       </w:r>
     </w:p>
     <w:sectPr>

</xml_diff>

<commit_message>
Comparacion manual vs Ada con catalogo de 1002 cursos (n=3), metodo, formula y alcance
Co-Authored-By: Claude Sonnet 5.5 <noreply@anthropic.com>
</commit_message>
<xml_diff>
--- a/anexos/3_Informe_Pruebas_Funcionales_Ada.docx
+++ b/anexos/3_Informe_Pruebas_Funcionales_Ada.docx
@@ -9334,6 +9334,1192 @@
           <w:szCs w:val="22"/>
         </w:rPr>
         <w:t xml:space="preserve">Los valores están en milisegundos, medidos desde que se envía el mensaje hasta que la respuesta aparece en pantalla.</w:t>
+      </w:r>
+    </w:p>
+    <w:p>
+      <w:pPr>
+        <w:pStyle w:val="Heading2"/>
+        <w:spacing w:after="140" w:before="320"/>
+      </w:pPr>
+      <w:r>
+        <w:rPr>
+          <w:rFonts w:ascii="Calibri" w:cs="Calibri" w:eastAsia="Calibri" w:hAnsi="Calibri"/>
+          <w:b/>
+          <w:bCs/>
+          <w:color w:val="4E95C2"/>
+          <w:sz w:val="24"/>
+          <w:szCs w:val="24"/>
+        </w:rPr>
+        <w:t xml:space="preserve">Comparación manual vs Ada con el catálogo de 1.002 cursos</w:t>
+      </w:r>
+    </w:p>
+    <w:p>
+      <w:pPr>
+        <w:spacing w:after="160" w:line="288"/>
+        <w:jc w:val="both"/>
+      </w:pPr>
+      <w:r>
+        <w:rPr>
+          <w:rFonts w:ascii="Calibri" w:cs="Calibri" w:eastAsia="Calibri" w:hAnsi="Calibri"/>
+          <w:b w:val="false"/>
+          <w:bCs w:val="false"/>
+          <w:i w:val="false"/>
+          <w:iCs w:val="false"/>
+          <w:color w:val="222222"/>
+          <w:sz w:val="22"/>
+          <w:szCs w:val="22"/>
+        </w:rPr>
+        <w:t xml:space="preserve">En cumplimiento del tercer objetivo específico, se comparó el tiempo de realizar tres tareas de consulta de cursos con el procedimiento manual en Moodle frente al tiempo con Ada, sobre el catálogo ampliado de 1.002 cursos (2 reales y 1.000 sintéticos). Método: una sola persona midió con cronómetro manual, siempre desde el mismo punto de partida (página principal de Moodle con la sesión iniciada). En el procedimiento manual se usó la navegación y el buscador de Moodle como lo haría un usuario; con Ada se midió el flujo completo (clic en el cuadro de texto, escritura de la pregunta con una frase fija, lectura de la respuesta y, en las tareas 1 y 2, apertura del curso con el enlace). La medición termina cuando el curso está abierto (tareas 1 y 2) o cuando se leyeron las cuatro unidades con sus porcentajes (tarea 3). Se hicieron tres repeticiones por tarea y método, salvo la tarea 3 manual, con una sola medición, porque consiste en leer siempre el mismo contenido de un curso y su duración no depende del tamaño del catálogo.</w:t>
+      </w:r>
+    </w:p>
+    <w:tbl>
+      <w:tblPr>
+        <w:tblW w:w="5000" w:type="pct"/>
+        <w:tblBorders>
+          <w:top w:val="single" w:sz="4" w:space="0" w:color="C9D2D6"/>
+          <w:left w:val="single" w:sz="4" w:space="0" w:color="C9D2D6"/>
+          <w:bottom w:val="single" w:sz="4" w:space="0" w:color="C9D2D6"/>
+          <w:right w:val="single" w:sz="4" w:space="0" w:color="C9D2D6"/>
+          <w:insideH w:val="single" w:sz="2" w:space="0" w:color="C9D2D6"/>
+          <w:insideV w:val="single" w:sz="2" w:space="0" w:color="C9D2D6"/>
+        </w:tblBorders>
+        <w:tblCellMar>
+          <w:left w:w="10" w:type="dxa"/>
+          <w:right w:w="10" w:type="dxa"/>
+        </w:tblCellMar>
+        <w:tblLook w:val="04A0" w:firstRow="1" w:lastRow="0" w:firstColumn="1" w:lastColumn="0" w:noHBand="0" w:noVBand="1"/>
+      </w:tblPr>
+      <w:tblGrid>
+        <w:gridCol w:w="2700"/>
+        <w:gridCol w:w="1100"/>
+        <w:gridCol w:w="900"/>
+        <w:gridCol w:w="900"/>
+        <w:gridCol w:w="900"/>
+        <w:gridCol w:w="2500"/>
+      </w:tblGrid>
+      <w:tr>
+        <w:trPr>
+          <w:tblHeader/>
+        </w:trPr>
+        <w:tc>
+          <w:tcPr>
+            <w:tcW w:w="2700" w:type="dxa"/>
+            <w:shd w:val="clear" w:color="auto" w:fill="24425E"/>
+            <w:tcMar>
+              <w:top w:w="100" w:type="dxa"/>
+              <w:left w:w="120" w:type="dxa"/>
+              <w:bottom w:w="100" w:type="dxa"/>
+              <w:right w:w="120" w:type="dxa"/>
+            </w:tcMar>
+            <w:vAlign w:val="center"/>
+          </w:tcPr>
+          <w:p>
+            <w:r>
+              <w:rPr>
+                <w:rFonts w:ascii="Calibri" w:eastAsia="Calibri" w:hAnsi="Calibri" w:cs="Calibri"/>
+                <w:b/>
+                <w:bCs/>
+                <w:color w:val="FFFFFF"/>
+                <w:sz w:val="20"/>
+                <w:szCs w:val="20"/>
+              </w:rPr>
+              <w:t xml:space="preserve">Tarea</w:t>
+            </w:r>
+          </w:p>
+        </w:tc>
+        <w:tc>
+          <w:tcPr>
+            <w:tcW w:w="1100" w:type="dxa"/>
+            <w:shd w:val="clear" w:color="auto" w:fill="24425E"/>
+            <w:tcMar>
+              <w:top w:w="100" w:type="dxa"/>
+              <w:left w:w="120" w:type="dxa"/>
+              <w:bottom w:w="100" w:type="dxa"/>
+              <w:right w:w="120" w:type="dxa"/>
+            </w:tcMar>
+            <w:vAlign w:val="center"/>
+          </w:tcPr>
+          <w:p>
+            <w:r>
+              <w:rPr>
+                <w:rFonts w:ascii="Calibri" w:eastAsia="Calibri" w:hAnsi="Calibri" w:cs="Calibri"/>
+                <w:b/>
+                <w:bCs/>
+                <w:color w:val="FFFFFF"/>
+                <w:sz w:val="20"/>
+                <w:szCs w:val="20"/>
+              </w:rPr>
+              <w:t xml:space="preserve">Método</w:t>
+            </w:r>
+          </w:p>
+        </w:tc>
+        <w:tc>
+          <w:tcPr>
+            <w:tcW w:w="900" w:type="dxa"/>
+            <w:shd w:val="clear" w:color="auto" w:fill="24425E"/>
+            <w:tcMar>
+              <w:top w:w="100" w:type="dxa"/>
+              <w:left w:w="120" w:type="dxa"/>
+              <w:bottom w:w="100" w:type="dxa"/>
+              <w:right w:w="120" w:type="dxa"/>
+            </w:tcMar>
+            <w:vAlign w:val="center"/>
+          </w:tcPr>
+          <w:p>
+            <w:r>
+              <w:rPr>
+                <w:rFonts w:ascii="Calibri" w:eastAsia="Calibri" w:hAnsi="Calibri" w:cs="Calibri"/>
+                <w:b/>
+                <w:bCs/>
+                <w:color w:val="FFFFFF"/>
+                <w:sz w:val="20"/>
+                <w:szCs w:val="20"/>
+              </w:rPr>
+              <w:t xml:space="preserve">Rep. 1</w:t>
+            </w:r>
+          </w:p>
+        </w:tc>
+        <w:tc>
+          <w:tcPr>
+            <w:tcW w:w="900" w:type="dxa"/>
+            <w:shd w:val="clear" w:color="auto" w:fill="24425E"/>
+            <w:tcMar>
+              <w:top w:w="100" w:type="dxa"/>
+              <w:left w:w="120" w:type="dxa"/>
+              <w:bottom w:w="100" w:type="dxa"/>
+              <w:right w:w="120" w:type="dxa"/>
+            </w:tcMar>
+            <w:vAlign w:val="center"/>
+          </w:tcPr>
+          <w:p>
+            <w:r>
+              <w:rPr>
+                <w:rFonts w:ascii="Calibri" w:eastAsia="Calibri" w:hAnsi="Calibri" w:cs="Calibri"/>
+                <w:b/>
+                <w:bCs/>
+                <w:color w:val="FFFFFF"/>
+                <w:sz w:val="20"/>
+                <w:szCs w:val="20"/>
+              </w:rPr>
+              <w:t xml:space="preserve">Rep. 2</w:t>
+            </w:r>
+          </w:p>
+        </w:tc>
+        <w:tc>
+          <w:tcPr>
+            <w:tcW w:w="900" w:type="dxa"/>
+            <w:shd w:val="clear" w:color="auto" w:fill="24425E"/>
+            <w:tcMar>
+              <w:top w:w="100" w:type="dxa"/>
+              <w:left w:w="120" w:type="dxa"/>
+              <w:bottom w:w="100" w:type="dxa"/>
+              <w:right w:w="120" w:type="dxa"/>
+            </w:tcMar>
+            <w:vAlign w:val="center"/>
+          </w:tcPr>
+          <w:p>
+            <w:r>
+              <w:rPr>
+                <w:rFonts w:ascii="Calibri" w:eastAsia="Calibri" w:hAnsi="Calibri" w:cs="Calibri"/>
+                <w:b/>
+                <w:bCs/>
+                <w:color w:val="FFFFFF"/>
+                <w:sz w:val="20"/>
+                <w:szCs w:val="20"/>
+              </w:rPr>
+              <w:t xml:space="preserve">Rep. 3</w:t>
+            </w:r>
+          </w:p>
+        </w:tc>
+        <w:tc>
+          <w:tcPr>
+            <w:tcW w:w="2500" w:type="dxa"/>
+            <w:shd w:val="clear" w:color="auto" w:fill="24425E"/>
+            <w:tcMar>
+              <w:top w:w="100" w:type="dxa"/>
+              <w:left w:w="120" w:type="dxa"/>
+              <w:bottom w:w="100" w:type="dxa"/>
+              <w:right w:w="120" w:type="dxa"/>
+            </w:tcMar>
+            <w:vAlign w:val="center"/>
+          </w:tcPr>
+          <w:p>
+            <w:r>
+              <w:rPr>
+                <w:rFonts w:ascii="Calibri" w:eastAsia="Calibri" w:hAnsi="Calibri" w:cs="Calibri"/>
+                <w:b/>
+                <w:bCs/>
+                <w:color w:val="FFFFFF"/>
+                <w:sz w:val="20"/>
+                <w:szCs w:val="20"/>
+              </w:rPr>
+              <w:t xml:space="preserve">Media ± desviación</w:t>
+            </w:r>
+          </w:p>
+        </w:tc>
+      </w:tr>
+      <w:tr>
+        <w:trPr>
+          <w:cantSplit/>
+        </w:trPr>
+        <w:tc>
+          <w:tcPr>
+            <w:tcW w:w="2700" w:type="dxa"/>
+            <w:shd w:val="clear" w:color="auto" w:fill="FFFFFF"/>
+            <w:tcMar>
+              <w:top w:w="100" w:type="dxa"/>
+              <w:left w:w="120" w:type="dxa"/>
+              <w:bottom w:w="100" w:type="dxa"/>
+              <w:right w:w="120" w:type="dxa"/>
+            </w:tcMar>
+            <w:vAlign w:val="center"/>
+          </w:tcPr>
+          <w:p>
+            <w:r>
+              <w:rPr>
+                <w:rFonts w:ascii="Calibri" w:eastAsia="Calibri" w:hAnsi="Calibri" w:cs="Calibri"/>
+                <w:b/>
+                <w:bCs/>
+                <w:color w:val="222222"/>
+                <w:sz w:val="20"/>
+                <w:szCs w:val="20"/>
+              </w:rPr>
+              <w:t xml:space="preserve">1. Fotosíntesis</w:t>
+            </w:r>
+          </w:p>
+        </w:tc>
+        <w:tc>
+          <w:tcPr>
+            <w:tcW w:w="1100" w:type="dxa"/>
+            <w:shd w:val="clear" w:color="auto" w:fill="FFFFFF"/>
+            <w:tcMar>
+              <w:top w:w="100" w:type="dxa"/>
+              <w:left w:w="120" w:type="dxa"/>
+              <w:bottom w:w="100" w:type="dxa"/>
+              <w:right w:w="120" w:type="dxa"/>
+            </w:tcMar>
+            <w:vAlign w:val="center"/>
+          </w:tcPr>
+          <w:p>
+            <w:r>
+              <w:rPr>
+                <w:rFonts w:ascii="Calibri" w:eastAsia="Calibri" w:hAnsi="Calibri" w:cs="Calibri"/>
+                <w:color w:val="222222"/>
+                <w:sz w:val="20"/>
+                <w:szCs w:val="20"/>
+              </w:rPr>
+              <w:t xml:space="preserve">Manual</w:t>
+            </w:r>
+          </w:p>
+        </w:tc>
+        <w:tc>
+          <w:tcPr>
+            <w:tcW w:w="900" w:type="dxa"/>
+            <w:shd w:val="clear" w:color="auto" w:fill="FFFFFF"/>
+            <w:tcMar>
+              <w:top w:w="100" w:type="dxa"/>
+              <w:left w:w="120" w:type="dxa"/>
+              <w:bottom w:w="100" w:type="dxa"/>
+              <w:right w:w="120" w:type="dxa"/>
+            </w:tcMar>
+            <w:vAlign w:val="center"/>
+          </w:tcPr>
+          <w:p>
+            <w:r>
+              <w:rPr>
+                <w:rFonts w:ascii="Calibri" w:eastAsia="Calibri" w:hAnsi="Calibri" w:cs="Calibri"/>
+                <w:color w:val="222222"/>
+                <w:sz w:val="20"/>
+                <w:szCs w:val="20"/>
+              </w:rPr>
+              <w:t xml:space="preserve">148 s</w:t>
+            </w:r>
+          </w:p>
+        </w:tc>
+        <w:tc>
+          <w:tcPr>
+            <w:tcW w:w="900" w:type="dxa"/>
+            <w:shd w:val="clear" w:color="auto" w:fill="FFFFFF"/>
+            <w:tcMar>
+              <w:top w:w="100" w:type="dxa"/>
+              <w:left w:w="120" w:type="dxa"/>
+              <w:bottom w:w="100" w:type="dxa"/>
+              <w:right w:w="120" w:type="dxa"/>
+            </w:tcMar>
+            <w:vAlign w:val="center"/>
+          </w:tcPr>
+          <w:p>
+            <w:r>
+              <w:rPr>
+                <w:rFonts w:ascii="Calibri" w:eastAsia="Calibri" w:hAnsi="Calibri" w:cs="Calibri"/>
+                <w:color w:val="222222"/>
+                <w:sz w:val="20"/>
+                <w:szCs w:val="20"/>
+              </w:rPr>
+              <w:t xml:space="preserve">180 s</w:t>
+            </w:r>
+          </w:p>
+        </w:tc>
+        <w:tc>
+          <w:tcPr>
+            <w:tcW w:w="900" w:type="dxa"/>
+            <w:shd w:val="clear" w:color="auto" w:fill="FFFFFF"/>
+            <w:tcMar>
+              <w:top w:w="100" w:type="dxa"/>
+              <w:left w:w="120" w:type="dxa"/>
+              <w:bottom w:w="100" w:type="dxa"/>
+              <w:right w:w="120" w:type="dxa"/>
+            </w:tcMar>
+            <w:vAlign w:val="center"/>
+          </w:tcPr>
+          <w:p>
+            <w:r>
+              <w:rPr>
+                <w:rFonts w:ascii="Calibri" w:eastAsia="Calibri" w:hAnsi="Calibri" w:cs="Calibri"/>
+                <w:color w:val="222222"/>
+                <w:sz w:val="20"/>
+                <w:szCs w:val="20"/>
+              </w:rPr>
+              <w:t xml:space="preserve">220 s</w:t>
+            </w:r>
+          </w:p>
+        </w:tc>
+        <w:tc>
+          <w:tcPr>
+            <w:tcW w:w="2500" w:type="dxa"/>
+            <w:shd w:val="clear" w:color="auto" w:fill="FFFFFF"/>
+            <w:tcMar>
+              <w:top w:w="100" w:type="dxa"/>
+              <w:left w:w="120" w:type="dxa"/>
+              <w:bottom w:w="100" w:type="dxa"/>
+              <w:right w:w="120" w:type="dxa"/>
+            </w:tcMar>
+            <w:vAlign w:val="center"/>
+          </w:tcPr>
+          <w:p>
+            <w:r>
+              <w:rPr>
+                <w:rFonts w:ascii="Calibri" w:eastAsia="Calibri" w:hAnsi="Calibri" w:cs="Calibri"/>
+                <w:color w:val="222222"/>
+                <w:sz w:val="20"/>
+                <w:szCs w:val="20"/>
+              </w:rPr>
+              <w:t xml:space="preserve">182,7 ± 36,1 s</w:t>
+            </w:r>
+          </w:p>
+        </w:tc>
+      </w:tr>
+      <w:tr>
+        <w:trPr>
+          <w:cantSplit/>
+        </w:trPr>
+        <w:tc>
+          <w:tcPr>
+            <w:tcW w:w="2700" w:type="dxa"/>
+            <w:shd w:val="clear" w:color="auto" w:fill="F2F4F5"/>
+            <w:tcMar>
+              <w:top w:w="100" w:type="dxa"/>
+              <w:left w:w="120" w:type="dxa"/>
+              <w:bottom w:w="100" w:type="dxa"/>
+              <w:right w:w="120" w:type="dxa"/>
+            </w:tcMar>
+            <w:vAlign w:val="center"/>
+          </w:tcPr>
+          <w:p>
+            <w:r>
+              <w:rPr>
+                <w:rFonts w:ascii="Calibri" w:eastAsia="Calibri" w:hAnsi="Calibri" w:cs="Calibri"/>
+                <w:b/>
+                <w:bCs/>
+                <w:color w:val="222222"/>
+                <w:sz w:val="20"/>
+                <w:szCs w:val="20"/>
+              </w:rPr>
+              <w:t xml:space="preserve">1. Fotosíntesis</w:t>
+            </w:r>
+          </w:p>
+        </w:tc>
+        <w:tc>
+          <w:tcPr>
+            <w:tcW w:w="1100" w:type="dxa"/>
+            <w:shd w:val="clear" w:color="auto" w:fill="F2F4F5"/>
+            <w:tcMar>
+              <w:top w:w="100" w:type="dxa"/>
+              <w:left w:w="120" w:type="dxa"/>
+              <w:bottom w:w="100" w:type="dxa"/>
+              <w:right w:w="120" w:type="dxa"/>
+            </w:tcMar>
+            <w:vAlign w:val="center"/>
+          </w:tcPr>
+          <w:p>
+            <w:r>
+              <w:rPr>
+                <w:rFonts w:ascii="Calibri" w:eastAsia="Calibri" w:hAnsi="Calibri" w:cs="Calibri"/>
+                <w:color w:val="222222"/>
+                <w:sz w:val="20"/>
+                <w:szCs w:val="20"/>
+              </w:rPr>
+              <w:t xml:space="preserve">Con Ada</w:t>
+            </w:r>
+          </w:p>
+        </w:tc>
+        <w:tc>
+          <w:tcPr>
+            <w:tcW w:w="900" w:type="dxa"/>
+            <w:shd w:val="clear" w:color="auto" w:fill="F2F4F5"/>
+            <w:tcMar>
+              <w:top w:w="100" w:type="dxa"/>
+              <w:left w:w="120" w:type="dxa"/>
+              <w:bottom w:w="100" w:type="dxa"/>
+              <w:right w:w="120" w:type="dxa"/>
+            </w:tcMar>
+            <w:vAlign w:val="center"/>
+          </w:tcPr>
+          <w:p>
+            <w:r>
+              <w:rPr>
+                <w:rFonts w:ascii="Calibri" w:eastAsia="Calibri" w:hAnsi="Calibri" w:cs="Calibri"/>
+                <w:color w:val="222222"/>
+                <w:sz w:val="20"/>
+                <w:szCs w:val="20"/>
+              </w:rPr>
+              <w:t xml:space="preserve">15 s</w:t>
+            </w:r>
+          </w:p>
+        </w:tc>
+        <w:tc>
+          <w:tcPr>
+            <w:tcW w:w="900" w:type="dxa"/>
+            <w:shd w:val="clear" w:color="auto" w:fill="F2F4F5"/>
+            <w:tcMar>
+              <w:top w:w="100" w:type="dxa"/>
+              <w:left w:w="120" w:type="dxa"/>
+              <w:bottom w:w="100" w:type="dxa"/>
+              <w:right w:w="120" w:type="dxa"/>
+            </w:tcMar>
+            <w:vAlign w:val="center"/>
+          </w:tcPr>
+          <w:p>
+            <w:r>
+              <w:rPr>
+                <w:rFonts w:ascii="Calibri" w:eastAsia="Calibri" w:hAnsi="Calibri" w:cs="Calibri"/>
+                <w:color w:val="222222"/>
+                <w:sz w:val="20"/>
+                <w:szCs w:val="20"/>
+              </w:rPr>
+              <w:t xml:space="preserve">14 s</w:t>
+            </w:r>
+          </w:p>
+        </w:tc>
+        <w:tc>
+          <w:tcPr>
+            <w:tcW w:w="900" w:type="dxa"/>
+            <w:shd w:val="clear" w:color="auto" w:fill="F2F4F5"/>
+            <w:tcMar>
+              <w:top w:w="100" w:type="dxa"/>
+              <w:left w:w="120" w:type="dxa"/>
+              <w:bottom w:w="100" w:type="dxa"/>
+              <w:right w:w="120" w:type="dxa"/>
+            </w:tcMar>
+            <w:vAlign w:val="center"/>
+          </w:tcPr>
+          <w:p>
+            <w:r>
+              <w:rPr>
+                <w:rFonts w:ascii="Calibri" w:eastAsia="Calibri" w:hAnsi="Calibri" w:cs="Calibri"/>
+                <w:color w:val="222222"/>
+                <w:sz w:val="20"/>
+                <w:szCs w:val="20"/>
+              </w:rPr>
+              <w:t xml:space="preserve">13 s</w:t>
+            </w:r>
+          </w:p>
+        </w:tc>
+        <w:tc>
+          <w:tcPr>
+            <w:tcW w:w="2500" w:type="dxa"/>
+            <w:shd w:val="clear" w:color="auto" w:fill="F2F4F5"/>
+            <w:tcMar>
+              <w:top w:w="100" w:type="dxa"/>
+              <w:left w:w="120" w:type="dxa"/>
+              <w:bottom w:w="100" w:type="dxa"/>
+              <w:right w:w="120" w:type="dxa"/>
+            </w:tcMar>
+            <w:vAlign w:val="center"/>
+          </w:tcPr>
+          <w:p>
+            <w:r>
+              <w:rPr>
+                <w:rFonts w:ascii="Calibri" w:eastAsia="Calibri" w:hAnsi="Calibri" w:cs="Calibri"/>
+                <w:color w:val="222222"/>
+                <w:sz w:val="20"/>
+                <w:szCs w:val="20"/>
+              </w:rPr>
+              <w:t xml:space="preserve">14,0 ± 1,0 s</w:t>
+            </w:r>
+          </w:p>
+        </w:tc>
+      </w:tr>
+      <w:tr>
+        <w:trPr>
+          <w:cantSplit/>
+        </w:trPr>
+        <w:tc>
+          <w:tcPr>
+            <w:tcW w:w="2700" w:type="dxa"/>
+            <w:shd w:val="clear" w:color="auto" w:fill="FFFFFF"/>
+            <w:tcMar>
+              <w:top w:w="100" w:type="dxa"/>
+              <w:left w:w="120" w:type="dxa"/>
+              <w:bottom w:w="100" w:type="dxa"/>
+              <w:right w:w="120" w:type="dxa"/>
+            </w:tcMar>
+            <w:vAlign w:val="center"/>
+          </w:tcPr>
+          <w:p>
+            <w:r>
+              <w:rPr>
+                <w:rFonts w:ascii="Calibri" w:eastAsia="Calibri" w:hAnsi="Calibri" w:cs="Calibri"/>
+                <w:b/>
+                <w:bCs/>
+                <w:color w:val="222222"/>
+                <w:sz w:val="20"/>
+                <w:szCs w:val="20"/>
+              </w:rPr>
+              <w:t xml:space="preserve">2. Lectura Crítica</w:t>
+            </w:r>
+          </w:p>
+        </w:tc>
+        <w:tc>
+          <w:tcPr>
+            <w:tcW w:w="1100" w:type="dxa"/>
+            <w:shd w:val="clear" w:color="auto" w:fill="FFFFFF"/>
+            <w:tcMar>
+              <w:top w:w="100" w:type="dxa"/>
+              <w:left w:w="120" w:type="dxa"/>
+              <w:bottom w:w="100" w:type="dxa"/>
+              <w:right w:w="120" w:type="dxa"/>
+            </w:tcMar>
+            <w:vAlign w:val="center"/>
+          </w:tcPr>
+          <w:p>
+            <w:r>
+              <w:rPr>
+                <w:rFonts w:ascii="Calibri" w:eastAsia="Calibri" w:hAnsi="Calibri" w:cs="Calibri"/>
+                <w:color w:val="222222"/>
+                <w:sz w:val="20"/>
+                <w:szCs w:val="20"/>
+              </w:rPr>
+              <w:t xml:space="preserve">Manual</w:t>
+            </w:r>
+          </w:p>
+        </w:tc>
+        <w:tc>
+          <w:tcPr>
+            <w:tcW w:w="900" w:type="dxa"/>
+            <w:shd w:val="clear" w:color="auto" w:fill="FFFFFF"/>
+            <w:tcMar>
+              <w:top w:w="100" w:type="dxa"/>
+              <w:left w:w="120" w:type="dxa"/>
+              <w:bottom w:w="100" w:type="dxa"/>
+              <w:right w:w="120" w:type="dxa"/>
+            </w:tcMar>
+            <w:vAlign w:val="center"/>
+          </w:tcPr>
+          <w:p>
+            <w:r>
+              <w:rPr>
+                <w:rFonts w:ascii="Calibri" w:eastAsia="Calibri" w:hAnsi="Calibri" w:cs="Calibri"/>
+                <w:color w:val="222222"/>
+                <w:sz w:val="20"/>
+                <w:szCs w:val="20"/>
+              </w:rPr>
+              <w:t xml:space="preserve">60 s</w:t>
+            </w:r>
+          </w:p>
+        </w:tc>
+        <w:tc>
+          <w:tcPr>
+            <w:tcW w:w="900" w:type="dxa"/>
+            <w:shd w:val="clear" w:color="auto" w:fill="FFFFFF"/>
+            <w:tcMar>
+              <w:top w:w="100" w:type="dxa"/>
+              <w:left w:w="120" w:type="dxa"/>
+              <w:bottom w:w="100" w:type="dxa"/>
+              <w:right w:w="120" w:type="dxa"/>
+            </w:tcMar>
+            <w:vAlign w:val="center"/>
+          </w:tcPr>
+          <w:p>
+            <w:r>
+              <w:rPr>
+                <w:rFonts w:ascii="Calibri" w:eastAsia="Calibri" w:hAnsi="Calibri" w:cs="Calibri"/>
+                <w:color w:val="222222"/>
+                <w:sz w:val="20"/>
+                <w:szCs w:val="20"/>
+              </w:rPr>
+              <w:t xml:space="preserve">80 s</w:t>
+            </w:r>
+          </w:p>
+        </w:tc>
+        <w:tc>
+          <w:tcPr>
+            <w:tcW w:w="900" w:type="dxa"/>
+            <w:shd w:val="clear" w:color="auto" w:fill="FFFFFF"/>
+            <w:tcMar>
+              <w:top w:w="100" w:type="dxa"/>
+              <w:left w:w="120" w:type="dxa"/>
+              <w:bottom w:w="100" w:type="dxa"/>
+              <w:right w:w="120" w:type="dxa"/>
+            </w:tcMar>
+            <w:vAlign w:val="center"/>
+          </w:tcPr>
+          <w:p>
+            <w:r>
+              <w:rPr>
+                <w:rFonts w:ascii="Calibri" w:eastAsia="Calibri" w:hAnsi="Calibri" w:cs="Calibri"/>
+                <w:color w:val="222222"/>
+                <w:sz w:val="20"/>
+                <w:szCs w:val="20"/>
+              </w:rPr>
+              <w:t xml:space="preserve">90 s</w:t>
+            </w:r>
+          </w:p>
+        </w:tc>
+        <w:tc>
+          <w:tcPr>
+            <w:tcW w:w="2500" w:type="dxa"/>
+            <w:shd w:val="clear" w:color="auto" w:fill="FFFFFF"/>
+            <w:tcMar>
+              <w:top w:w="100" w:type="dxa"/>
+              <w:left w:w="120" w:type="dxa"/>
+              <w:bottom w:w="100" w:type="dxa"/>
+              <w:right w:w="120" w:type="dxa"/>
+            </w:tcMar>
+            <w:vAlign w:val="center"/>
+          </w:tcPr>
+          <w:p>
+            <w:r>
+              <w:rPr>
+                <w:rFonts w:ascii="Calibri" w:eastAsia="Calibri" w:hAnsi="Calibri" w:cs="Calibri"/>
+                <w:color w:val="222222"/>
+                <w:sz w:val="20"/>
+                <w:szCs w:val="20"/>
+              </w:rPr>
+              <w:t xml:space="preserve">76,7 ± 15,3 s</w:t>
+            </w:r>
+          </w:p>
+        </w:tc>
+      </w:tr>
+      <w:tr>
+        <w:trPr>
+          <w:cantSplit/>
+        </w:trPr>
+        <w:tc>
+          <w:tcPr>
+            <w:tcW w:w="2700" w:type="dxa"/>
+            <w:shd w:val="clear" w:color="auto" w:fill="F2F4F5"/>
+            <w:tcMar>
+              <w:top w:w="100" w:type="dxa"/>
+              <w:left w:w="120" w:type="dxa"/>
+              <w:bottom w:w="100" w:type="dxa"/>
+              <w:right w:w="120" w:type="dxa"/>
+            </w:tcMar>
+            <w:vAlign w:val="center"/>
+          </w:tcPr>
+          <w:p>
+            <w:r>
+              <w:rPr>
+                <w:rFonts w:ascii="Calibri" w:eastAsia="Calibri" w:hAnsi="Calibri" w:cs="Calibri"/>
+                <w:b/>
+                <w:bCs/>
+                <w:color w:val="222222"/>
+                <w:sz w:val="20"/>
+                <w:szCs w:val="20"/>
+              </w:rPr>
+              <w:t xml:space="preserve">2. Lectura Crítica</w:t>
+            </w:r>
+          </w:p>
+        </w:tc>
+        <w:tc>
+          <w:tcPr>
+            <w:tcW w:w="1100" w:type="dxa"/>
+            <w:shd w:val="clear" w:color="auto" w:fill="F2F4F5"/>
+            <w:tcMar>
+              <w:top w:w="100" w:type="dxa"/>
+              <w:left w:w="120" w:type="dxa"/>
+              <w:bottom w:w="100" w:type="dxa"/>
+              <w:right w:w="120" w:type="dxa"/>
+            </w:tcMar>
+            <w:vAlign w:val="center"/>
+          </w:tcPr>
+          <w:p>
+            <w:r>
+              <w:rPr>
+                <w:rFonts w:ascii="Calibri" w:eastAsia="Calibri" w:hAnsi="Calibri" w:cs="Calibri"/>
+                <w:color w:val="222222"/>
+                <w:sz w:val="20"/>
+                <w:szCs w:val="20"/>
+              </w:rPr>
+              <w:t xml:space="preserve">Con Ada</w:t>
+            </w:r>
+          </w:p>
+        </w:tc>
+        <w:tc>
+          <w:tcPr>
+            <w:tcW w:w="900" w:type="dxa"/>
+            <w:shd w:val="clear" w:color="auto" w:fill="F2F4F5"/>
+            <w:tcMar>
+              <w:top w:w="100" w:type="dxa"/>
+              <w:left w:w="120" w:type="dxa"/>
+              <w:bottom w:w="100" w:type="dxa"/>
+              <w:right w:w="120" w:type="dxa"/>
+            </w:tcMar>
+            <w:vAlign w:val="center"/>
+          </w:tcPr>
+          <w:p>
+            <w:r>
+              <w:rPr>
+                <w:rFonts w:ascii="Calibri" w:eastAsia="Calibri" w:hAnsi="Calibri" w:cs="Calibri"/>
+                <w:color w:val="222222"/>
+                <w:sz w:val="20"/>
+                <w:szCs w:val="20"/>
+              </w:rPr>
+              <w:t xml:space="preserve">20 s</w:t>
+            </w:r>
+          </w:p>
+        </w:tc>
+        <w:tc>
+          <w:tcPr>
+            <w:tcW w:w="900" w:type="dxa"/>
+            <w:shd w:val="clear" w:color="auto" w:fill="F2F4F5"/>
+            <w:tcMar>
+              <w:top w:w="100" w:type="dxa"/>
+              <w:left w:w="120" w:type="dxa"/>
+              <w:bottom w:w="100" w:type="dxa"/>
+              <w:right w:w="120" w:type="dxa"/>
+            </w:tcMar>
+            <w:vAlign w:val="center"/>
+          </w:tcPr>
+          <w:p>
+            <w:r>
+              <w:rPr>
+                <w:rFonts w:ascii="Calibri" w:eastAsia="Calibri" w:hAnsi="Calibri" w:cs="Calibri"/>
+                <w:color w:val="222222"/>
+                <w:sz w:val="20"/>
+                <w:szCs w:val="20"/>
+              </w:rPr>
+              <w:t xml:space="preserve">19 s</w:t>
+            </w:r>
+          </w:p>
+        </w:tc>
+        <w:tc>
+          <w:tcPr>
+            <w:tcW w:w="900" w:type="dxa"/>
+            <w:shd w:val="clear" w:color="auto" w:fill="F2F4F5"/>
+            <w:tcMar>
+              <w:top w:w="100" w:type="dxa"/>
+              <w:left w:w="120" w:type="dxa"/>
+              <w:bottom w:w="100" w:type="dxa"/>
+              <w:right w:w="120" w:type="dxa"/>
+            </w:tcMar>
+            <w:vAlign w:val="center"/>
+          </w:tcPr>
+          <w:p>
+            <w:r>
+              <w:rPr>
+                <w:rFonts w:ascii="Calibri" w:eastAsia="Calibri" w:hAnsi="Calibri" w:cs="Calibri"/>
+                <w:color w:val="222222"/>
+                <w:sz w:val="20"/>
+                <w:szCs w:val="20"/>
+              </w:rPr>
+              <w:t xml:space="preserve">20 s</w:t>
+            </w:r>
+          </w:p>
+        </w:tc>
+        <w:tc>
+          <w:tcPr>
+            <w:tcW w:w="2500" w:type="dxa"/>
+            <w:shd w:val="clear" w:color="auto" w:fill="F2F4F5"/>
+            <w:tcMar>
+              <w:top w:w="100" w:type="dxa"/>
+              <w:left w:w="120" w:type="dxa"/>
+              <w:bottom w:w="100" w:type="dxa"/>
+              <w:right w:w="120" w:type="dxa"/>
+            </w:tcMar>
+            <w:vAlign w:val="center"/>
+          </w:tcPr>
+          <w:p>
+            <w:r>
+              <w:rPr>
+                <w:rFonts w:ascii="Calibri" w:eastAsia="Calibri" w:hAnsi="Calibri" w:cs="Calibri"/>
+                <w:color w:val="222222"/>
+                <w:sz w:val="20"/>
+                <w:szCs w:val="20"/>
+              </w:rPr>
+              <w:t xml:space="preserve">19,7 ± 0,6 s</w:t>
+            </w:r>
+          </w:p>
+        </w:tc>
+      </w:tr>
+      <w:tr>
+        <w:trPr>
+          <w:cantSplit/>
+        </w:trPr>
+        <w:tc>
+          <w:tcPr>
+            <w:tcW w:w="2700" w:type="dxa"/>
+            <w:shd w:val="clear" w:color="auto" w:fill="FFFFFF"/>
+            <w:tcMar>
+              <w:top w:w="100" w:type="dxa"/>
+              <w:left w:w="120" w:type="dxa"/>
+              <w:bottom w:w="100" w:type="dxa"/>
+              <w:right w:w="120" w:type="dxa"/>
+            </w:tcMar>
+            <w:vAlign w:val="center"/>
+          </w:tcPr>
+          <w:p>
+            <w:r>
+              <w:rPr>
+                <w:rFonts w:ascii="Calibri" w:eastAsia="Calibri" w:hAnsi="Calibri" w:cs="Calibri"/>
+                <w:b/>
+                <w:bCs/>
+                <w:color w:val="222222"/>
+                <w:sz w:val="20"/>
+                <w:szCs w:val="20"/>
+              </w:rPr>
+              <w:t xml:space="preserve">3. Unidades Ciencias Naturales</w:t>
+            </w:r>
+          </w:p>
+        </w:tc>
+        <w:tc>
+          <w:tcPr>
+            <w:tcW w:w="1100" w:type="dxa"/>
+            <w:shd w:val="clear" w:color="auto" w:fill="FFFFFF"/>
+            <w:tcMar>
+              <w:top w:w="100" w:type="dxa"/>
+              <w:left w:w="120" w:type="dxa"/>
+              <w:bottom w:w="100" w:type="dxa"/>
+              <w:right w:w="120" w:type="dxa"/>
+            </w:tcMar>
+            <w:vAlign w:val="center"/>
+          </w:tcPr>
+          <w:p>
+            <w:r>
+              <w:rPr>
+                <w:rFonts w:ascii="Calibri" w:eastAsia="Calibri" w:hAnsi="Calibri" w:cs="Calibri"/>
+                <w:color w:val="222222"/>
+                <w:sz w:val="20"/>
+                <w:szCs w:val="20"/>
+              </w:rPr>
+              <w:t xml:space="preserve">Manual</w:t>
+            </w:r>
+          </w:p>
+        </w:tc>
+        <w:tc>
+          <w:tcPr>
+            <w:tcW w:w="900" w:type="dxa"/>
+            <w:shd w:val="clear" w:color="auto" w:fill="FFFFFF"/>
+            <w:tcMar>
+              <w:top w:w="100" w:type="dxa"/>
+              <w:left w:w="120" w:type="dxa"/>
+              <w:bottom w:w="100" w:type="dxa"/>
+              <w:right w:w="120" w:type="dxa"/>
+            </w:tcMar>
+            <w:vAlign w:val="center"/>
+          </w:tcPr>
+          <w:p>
+            <w:r>
+              <w:rPr>
+                <w:rFonts w:ascii="Calibri" w:eastAsia="Calibri" w:hAnsi="Calibri" w:cs="Calibri"/>
+                <w:color w:val="222222"/>
+                <w:sz w:val="20"/>
+                <w:szCs w:val="20"/>
+              </w:rPr>
+              <w:t xml:space="preserve">60 s</w:t>
+            </w:r>
+          </w:p>
+        </w:tc>
+        <w:tc>
+          <w:tcPr>
+            <w:tcW w:w="900" w:type="dxa"/>
+            <w:shd w:val="clear" w:color="auto" w:fill="FFFFFF"/>
+            <w:tcMar>
+              <w:top w:w="100" w:type="dxa"/>
+              <w:left w:w="120" w:type="dxa"/>
+              <w:bottom w:w="100" w:type="dxa"/>
+              <w:right w:w="120" w:type="dxa"/>
+            </w:tcMar>
+            <w:vAlign w:val="center"/>
+          </w:tcPr>
+          <w:p>
+            <w:r>
+              <w:rPr>
+                <w:rFonts w:ascii="Calibri" w:eastAsia="Calibri" w:hAnsi="Calibri" w:cs="Calibri"/>
+                <w:color w:val="222222"/>
+                <w:sz w:val="20"/>
+                <w:szCs w:val="20"/>
+              </w:rPr>
+              <w:t xml:space="preserve">—</w:t>
+            </w:r>
+          </w:p>
+        </w:tc>
+        <w:tc>
+          <w:tcPr>
+            <w:tcW w:w="900" w:type="dxa"/>
+            <w:shd w:val="clear" w:color="auto" w:fill="FFFFFF"/>
+            <w:tcMar>
+              <w:top w:w="100" w:type="dxa"/>
+              <w:left w:w="120" w:type="dxa"/>
+              <w:bottom w:w="100" w:type="dxa"/>
+              <w:right w:w="120" w:type="dxa"/>
+            </w:tcMar>
+            <w:vAlign w:val="center"/>
+          </w:tcPr>
+          <w:p>
+            <w:r>
+              <w:rPr>
+                <w:rFonts w:ascii="Calibri" w:eastAsia="Calibri" w:hAnsi="Calibri" w:cs="Calibri"/>
+                <w:color w:val="222222"/>
+                <w:sz w:val="20"/>
+                <w:szCs w:val="20"/>
+              </w:rPr>
+              <w:t xml:space="preserve">—</w:t>
+            </w:r>
+          </w:p>
+        </w:tc>
+        <w:tc>
+          <w:tcPr>
+            <w:tcW w:w="2500" w:type="dxa"/>
+            <w:shd w:val="clear" w:color="auto" w:fill="FFFFFF"/>
+            <w:tcMar>
+              <w:top w:w="100" w:type="dxa"/>
+              <w:left w:w="120" w:type="dxa"/>
+              <w:bottom w:w="100" w:type="dxa"/>
+              <w:right w:w="120" w:type="dxa"/>
+            </w:tcMar>
+            <w:vAlign w:val="center"/>
+          </w:tcPr>
+          <w:p>
+            <w:r>
+              <w:rPr>
+                <w:rFonts w:ascii="Calibri" w:eastAsia="Calibri" w:hAnsi="Calibri" w:cs="Calibri"/>
+                <w:color w:val="222222"/>
+                <w:sz w:val="20"/>
+                <w:szCs w:val="20"/>
+              </w:rPr>
+              <w:t xml:space="preserve">60 s (n = 1)</w:t>
+            </w:r>
+          </w:p>
+        </w:tc>
+      </w:tr>
+      <w:tr>
+        <w:trPr>
+          <w:cantSplit/>
+        </w:trPr>
+        <w:tc>
+          <w:tcPr>
+            <w:tcW w:w="2700" w:type="dxa"/>
+            <w:shd w:val="clear" w:color="auto" w:fill="F2F4F5"/>
+            <w:tcMar>
+              <w:top w:w="100" w:type="dxa"/>
+              <w:left w:w="120" w:type="dxa"/>
+              <w:bottom w:w="100" w:type="dxa"/>
+              <w:right w:w="120" w:type="dxa"/>
+            </w:tcMar>
+            <w:vAlign w:val="center"/>
+          </w:tcPr>
+          <w:p>
+            <w:r>
+              <w:rPr>
+                <w:rFonts w:ascii="Calibri" w:eastAsia="Calibri" w:hAnsi="Calibri" w:cs="Calibri"/>
+                <w:b/>
+                <w:bCs/>
+                <w:color w:val="222222"/>
+                <w:sz w:val="20"/>
+                <w:szCs w:val="20"/>
+              </w:rPr>
+              <w:t xml:space="preserve">3. Unidades Ciencias Naturales</w:t>
+            </w:r>
+          </w:p>
+        </w:tc>
+        <w:tc>
+          <w:tcPr>
+            <w:tcW w:w="1100" w:type="dxa"/>
+            <w:shd w:val="clear" w:color="auto" w:fill="F2F4F5"/>
+            <w:tcMar>
+              <w:top w:w="100" w:type="dxa"/>
+              <w:left w:w="120" w:type="dxa"/>
+              <w:bottom w:w="100" w:type="dxa"/>
+              <w:right w:w="120" w:type="dxa"/>
+            </w:tcMar>
+            <w:vAlign w:val="center"/>
+          </w:tcPr>
+          <w:p>
+            <w:r>
+              <w:rPr>
+                <w:rFonts w:ascii="Calibri" w:eastAsia="Calibri" w:hAnsi="Calibri" w:cs="Calibri"/>
+                <w:color w:val="222222"/>
+                <w:sz w:val="20"/>
+                <w:szCs w:val="20"/>
+              </w:rPr>
+              <w:t xml:space="preserve">Con Ada</w:t>
+            </w:r>
+          </w:p>
+        </w:tc>
+        <w:tc>
+          <w:tcPr>
+            <w:tcW w:w="900" w:type="dxa"/>
+            <w:shd w:val="clear" w:color="auto" w:fill="F2F4F5"/>
+            <w:tcMar>
+              <w:top w:w="100" w:type="dxa"/>
+              <w:left w:w="120" w:type="dxa"/>
+              <w:bottom w:w="100" w:type="dxa"/>
+              <w:right w:w="120" w:type="dxa"/>
+            </w:tcMar>
+            <w:vAlign w:val="center"/>
+          </w:tcPr>
+          <w:p>
+            <w:r>
+              <w:rPr>
+                <w:rFonts w:ascii="Calibri" w:eastAsia="Calibri" w:hAnsi="Calibri" w:cs="Calibri"/>
+                <w:color w:val="222222"/>
+                <w:sz w:val="20"/>
+                <w:szCs w:val="20"/>
+              </w:rPr>
+              <w:t xml:space="preserve">15 s</w:t>
+            </w:r>
+          </w:p>
+        </w:tc>
+        <w:tc>
+          <w:tcPr>
+            <w:tcW w:w="900" w:type="dxa"/>
+            <w:shd w:val="clear" w:color="auto" w:fill="F2F4F5"/>
+            <w:tcMar>
+              <w:top w:w="100" w:type="dxa"/>
+              <w:left w:w="120" w:type="dxa"/>
+              <w:bottom w:w="100" w:type="dxa"/>
+              <w:right w:w="120" w:type="dxa"/>
+            </w:tcMar>
+            <w:vAlign w:val="center"/>
+          </w:tcPr>
+          <w:p>
+            <w:r>
+              <w:rPr>
+                <w:rFonts w:ascii="Calibri" w:eastAsia="Calibri" w:hAnsi="Calibri" w:cs="Calibri"/>
+                <w:color w:val="222222"/>
+                <w:sz w:val="20"/>
+                <w:szCs w:val="20"/>
+              </w:rPr>
+              <w:t xml:space="preserve">14 s</w:t>
+            </w:r>
+          </w:p>
+        </w:tc>
+        <w:tc>
+          <w:tcPr>
+            <w:tcW w:w="900" w:type="dxa"/>
+            <w:shd w:val="clear" w:color="auto" w:fill="F2F4F5"/>
+            <w:tcMar>
+              <w:top w:w="100" w:type="dxa"/>
+              <w:left w:w="120" w:type="dxa"/>
+              <w:bottom w:w="100" w:type="dxa"/>
+              <w:right w:w="120" w:type="dxa"/>
+            </w:tcMar>
+            <w:vAlign w:val="center"/>
+          </w:tcPr>
+          <w:p>
+            <w:r>
+              <w:rPr>
+                <w:rFonts w:ascii="Calibri" w:eastAsia="Calibri" w:hAnsi="Calibri" w:cs="Calibri"/>
+                <w:color w:val="222222"/>
+                <w:sz w:val="20"/>
+                <w:szCs w:val="20"/>
+              </w:rPr>
+              <w:t xml:space="preserve">15 s</w:t>
+            </w:r>
+          </w:p>
+        </w:tc>
+        <w:tc>
+          <w:tcPr>
+            <w:tcW w:w="2500" w:type="dxa"/>
+            <w:shd w:val="clear" w:color="auto" w:fill="F2F4F5"/>
+            <w:tcMar>
+              <w:top w:w="100" w:type="dxa"/>
+              <w:left w:w="120" w:type="dxa"/>
+              <w:bottom w:w="100" w:type="dxa"/>
+              <w:right w:w="120" w:type="dxa"/>
+            </w:tcMar>
+            <w:vAlign w:val="center"/>
+          </w:tcPr>
+          <w:p>
+            <w:r>
+              <w:rPr>
+                <w:rFonts w:ascii="Calibri" w:eastAsia="Calibri" w:hAnsi="Calibri" w:cs="Calibri"/>
+                <w:color w:val="222222"/>
+                <w:sz w:val="20"/>
+                <w:szCs w:val="20"/>
+              </w:rPr>
+              <w:t xml:space="preserve">14,7 ± 0,6 s</w:t>
+            </w:r>
+          </w:p>
+        </w:tc>
+      </w:tr>
+    </w:tbl>
+    <w:p>
+      <w:pPr>
+        <w:spacing w:after="160" w:line="288"/>
+        <w:jc w:val="both"/>
+      </w:pPr>
+      <w:r>
+        <w:rPr>
+          <w:rFonts w:ascii="Calibri" w:cs="Calibri" w:eastAsia="Calibri" w:hAnsi="Calibri"/>
+          <w:b w:val="false"/>
+          <w:bCs w:val="false"/>
+          <w:i w:val="false"/>
+          <w:iCs w:val="false"/>
+          <w:color w:val="222222"/>
+          <w:sz w:val="22"/>
+          <w:szCs w:val="22"/>
+        </w:rPr>
+        <w:t xml:space="preserve">Reducción = (tiempo manual medio − tiempo medio con Ada) ÷ tiempo manual medio × 100: tarea 1, (182,7 − 14,0) ÷ 182,7 = 92,3 %; tarea 2, (76,7 − 19,7) ÷ 76,7 = 74,3 %; tarea 3, (60,0 − 14,7) ÷ 60,0 = 75,6 %. Una medición previa con Ada de 1 s solo había medido la respuesta del sistema y se reemplazó por la medición de punta a punta (escribir, leer y abrir el curso).</w:t>
+      </w:r>
+    </w:p>
+    <w:p>
+      <w:pPr>
+        <w:spacing w:after="160" w:line="288"/>
+        <w:jc w:val="both"/>
+      </w:pPr>
+      <w:r>
+        <w:rPr>
+          <w:rFonts w:ascii="Calibri" w:cs="Calibri" w:eastAsia="Calibri" w:hAnsi="Calibri"/>
+          <w:b w:val="false"/>
+          <w:bCs w:val="false"/>
+          <w:i w:val="false"/>
+          <w:iCs w:val="false"/>
+          <w:color w:val="222222"/>
+          <w:sz w:val="22"/>
+          <w:szCs w:val="22"/>
+        </w:rPr>
+        <w:t xml:space="preserve">Alcance de la comparación. Dentro del alcance comparable con el procedimiento manual están las consultas de datos que Ada resuelve sin el modelo de lenguaje: listado o resumen del catálogo, búsqueda de cursos por tema, enlace a un curso y detalle de unidades. Fuera de ese alcance están las preguntas abiertas, las recomendaciones y las solicitudes ajenas a la plataforma (categorías 4 y 5), que dependen de la generación del modelo, tardan entre uno y varios minutos y no tienen un equivalente de búsqueda manual comparable, porque corresponden a comportamientos conversacionales.</w:t>
+      </w:r>
+    </w:p>
+    <w:p>
+      <w:pPr>
+        <w:spacing w:after="160" w:line="288"/>
+        <w:jc w:val="both"/>
+      </w:pPr>
+      <w:r>
+        <w:rPr>
+          <w:rFonts w:ascii="Calibri" w:cs="Calibri" w:eastAsia="Calibri" w:hAnsi="Calibri"/>
+          <w:b w:val="false"/>
+          <w:bCs w:val="false"/>
+          <w:i w:val="false"/>
+          <w:iCs w:val="false"/>
+          <w:color w:val="222222"/>
+          <w:sz w:val="22"/>
+          <w:szCs w:val="22"/>
+        </w:rPr>
+        <w:t xml:space="preserve">Limitaciones. Las mediciones las realizó una sola persona con cronómetro manual, con tres repeticiones por celda (una en la tarea 3 manual) y sobre un catálogo sintético; la dispersión del tiempo manual es alta (desviación de hasta 36 s). Los resultados indican la magnitud del ahorro, pero deben confirmarse con más participantes y con el catálogo real de la empresa.</w:t>
       </w:r>
     </w:p>
     <w:p>

</xml_diff>

<commit_message>
Casos reales en Moodle: widget consulta el resumen en cada pregunta; matriz y Anexo D actualizados
Co-Authored-By: Claude Sonnet 5.5 <noreply@anthropic.com>
</commit_message>
<xml_diff>
--- a/anexos/3_Informe_Pruebas_Funcionales_Ada.docx
+++ b/anexos/3_Informe_Pruebas_Funcionales_Ada.docx
@@ -2184,7 +2184,7 @@
           <w:sz w:val="22"/>
           <w:szCs w:val="22"/>
         </w:rPr>
-        <w:t xml:space="preserve">Esta sección amplía la matriz del informe final. Para cada caso se registran la consulta realizada, la respuesta esperada (derivada de la información real almacenada en Moodle), la respuesta obtenida, el criterio de aceptación aplicado, el resultado, el tiempo de respuesta y la evidencia, que corresponde a las capturas de pantalla del Anexo D (Caso n).</w:t>
+        <w:t xml:space="preserve">Esta sección amplía la matriz del informe final. Para cada caso se registran la consulta realizada, la respuesta esperada (derivada de la información real almacenada en Moodle), la respuesta obtenida, el criterio de aceptación aplicado, el resultado, el tiempo de respuesta y la evidencia, que corresponde a las capturas de pantalla del Anexo D (Caso n). Los 15 casos se ejecutaron de nuevo en la instancia real de Moodle del piloto (dos cursos), con el widget en su versión final; en los casos 4 a 9 la respuesta incluye ahora el enlace «Abrir curso» de cada curso.</w:t>
       </w:r>
     </w:p>
     <w:p>
@@ -3003,7 +3003,7 @@
                 <w:sz w:val="20"/>
                 <w:szCs w:val="20"/>
               </w:rPr>
-              <w:t xml:space="preserve">C1: Correcto · &lt; 1 s · Anexo D, Caso 1</w:t>
+              <w:t xml:space="preserve">C1: Correcto · sistema &lt; 1 s; total 5 s · Anexo D, Caso 1</w:t>
             </w:r>
           </w:p>
         </w:tc>
@@ -3130,7 +3130,7 @@
                 <w:sz w:val="20"/>
                 <w:szCs w:val="20"/>
               </w:rPr>
-              <w:t xml:space="preserve">C1: Correcto · &lt; 1 s · Anexo D, Caso 2</w:t>
+              <w:t xml:space="preserve">C1: Correcto · sistema &lt; 1 s; total 10 s · Anexo D, Caso 2</w:t>
             </w:r>
           </w:p>
         </w:tc>
@@ -3257,7 +3257,7 @@
                 <w:sz w:val="20"/>
                 <w:szCs w:val="20"/>
               </w:rPr>
-              <w:t xml:space="preserve">C1: Correcto · &lt; 1 s · Anexo D, Caso 3</w:t>
+              <w:t xml:space="preserve">C1: Correcto · sistema &lt; 1 s; total 5 s · Anexo D, Caso 3</w:t>
             </w:r>
           </w:p>
         </w:tc>
@@ -3360,7 +3360,7 @@
                 <w:sz w:val="20"/>
                 <w:szCs w:val="20"/>
               </w:rPr>
-              <w:t xml:space="preserve">«Tenemos 2 cursos disponibles: Ciencias Naturales — Saber 11 y Lectura Crítica — Saber 11. ¿Sobre cuál te gustaría saber más?» (construida con datos del bridge).</w:t>
+              <w:t xml:space="preserve">«Tenemos 2 cursos disponibles: Ciencias Naturales — Saber 11 y Lectura Crítica — Saber 11. ¿Sobre cuál te gustaría saber más?», seguido de «Enlaces:» con el enlace «Abrir curso» de cada curso (construida con datos del bridge).</w:t>
             </w:r>
           </w:p>
         </w:tc>
@@ -3384,7 +3384,7 @@
                 <w:sz w:val="20"/>
                 <w:szCs w:val="20"/>
               </w:rPr>
-              <w:t xml:space="preserve">C2: Correcto · &lt; 1 s · Anexo D, Caso 4</w:t>
+              <w:t xml:space="preserve">C2: Correcto · sistema &lt; 1 s; total 20 s · Anexo D, Caso 4</w:t>
             </w:r>
           </w:p>
         </w:tc>
@@ -3511,7 +3511,7 @@
                 <w:sz w:val="20"/>
                 <w:szCs w:val="20"/>
               </w:rPr>
-              <w:t xml:space="preserve">C2: Correcto · &lt; 1 s · Anexo D, Caso 5</w:t>
+              <w:t xml:space="preserve">C2: Correcto · sistema &lt; 1 s; total 18 s · Anexo D, Caso 5</w:t>
             </w:r>
           </w:p>
         </w:tc>
@@ -3638,7 +3638,7 @@
                 <w:sz w:val="20"/>
                 <w:szCs w:val="20"/>
               </w:rPr>
-              <w:t xml:space="preserve">C2: Correcto · &lt; 1 s · Anexo D, Caso 6</w:t>
+              <w:t xml:space="preserve">C2: Correcto · sistema &lt; 1 s; total 14 s · Anexo D, Caso 6</w:t>
             </w:r>
           </w:p>
         </w:tc>
@@ -3741,7 +3741,7 @@
                 <w:sz w:val="20"/>
                 <w:szCs w:val="20"/>
               </w:rPr>
-              <w:t xml:space="preserve">«El curso Ciencias Naturales — Saber 11 tiene 4 unidades:» 1. Biología: Entorno Vivo (35 %): célula, genética, evolución, ecosistemas y fisiología humana. 2. Química: Materia y Transformaciones (30 %): átomo, tabla periódica, enlace químico, reacciones, soluciones y química orgánica. 3. Física: Fuerzas y Energía (30 %): mecánica, leyes de Newton, energía, termodinámica y ondas. 4. Ciencias de la Tierra y CTS (25 %). La captura muestra las tres primeras unidades; la cuarta queda debajo del área visible del chat.</w:t>
+              <w:t xml:space="preserve">«El curso Ciencias Naturales — Saber 11 tiene 4 unidades:» 1. Biología: Entorno Vivo (35 %). 2. Química: Materia y Transformaciones (30 %): átomo, tabla periódica, enlace químico, reacciones, soluciones y química orgánica. 3. Física: Fuerzas y Energía (30 %): mecánica, leyes de Newton, energía, termodinámica y ondas. 4. Ciencias de la Tierra y CTS (25 %): estructura interna, tectónica de placas, atmósfera, cambio climático y método científico. Termina con «Enlace del curso: Abrir curso». Las dos capturas del Anexo D muestran la respuesta completa.</w:t>
             </w:r>
           </w:p>
         </w:tc>
@@ -3765,7 +3765,7 @@
                 <w:sz w:val="20"/>
                 <w:szCs w:val="20"/>
               </w:rPr>
-              <w:t xml:space="preserve">C3: Correcto · &lt; 1 s · Anexo D, Caso 7</w:t>
+              <w:t xml:space="preserve">C3: Correcto · sistema &lt; 1 s; total 16 s · Anexo D, Caso 7</w:t>
             </w:r>
           </w:p>
         </w:tc>
@@ -3868,7 +3868,7 @@
                 <w:sz w:val="20"/>
                 <w:szCs w:val="20"/>
               </w:rPr>
-              <w:t xml:space="preserve">«El curso Lectura Crítica — Saber 11 tiene 4 unidades:» 1. Comprensión Textual (35 %): niveles de lectura, tipos de texto, coherencia, cohesión y textos discontinuos. 2. Argumentación y Retórica (30 %). 3. Literatura y Contexto (20 %). 4. Pensamiento Crítico (15 %). La captura muestra las primeras unidades; el resto queda debajo del área visible.</w:t>
+              <w:t xml:space="preserve">«El curso Lectura Crítica — Saber 11 tiene 4 unidades:» Comprensión Textual (35 %), Argumentación y Retórica (30 %), Literatura y Contexto (20 %) y Pensamiento Crítico (15 %), cada una con sus contenidos, y el enlace del curso. Las dos capturas del Anexo D muestran la respuesta completa.</w:t>
             </w:r>
           </w:p>
         </w:tc>
@@ -3892,7 +3892,7 @@
                 <w:sz w:val="20"/>
                 <w:szCs w:val="20"/>
               </w:rPr>
-              <w:t xml:space="preserve">C3: Correcto · &lt; 1 s · Anexo D, Caso 8</w:t>
+              <w:t xml:space="preserve">C3: Correcto · sistema &lt; 1 s; total 16 s · Anexo D, Caso 8</w:t>
             </w:r>
           </w:p>
         </w:tc>
@@ -4019,7 +4019,7 @@
                 <w:sz w:val="20"/>
                 <w:szCs w:val="20"/>
               </w:rPr>
-              <w:t xml:space="preserve">C3: Correcto · &lt; 1 s · Anexo D, Caso 9</w:t>
+              <w:t xml:space="preserve">C3: Correcto · sistema &lt; 1 s; total 16 s · Anexo D, Caso 9</w:t>
             </w:r>
           </w:p>
         </w:tc>
@@ -4122,7 +4122,7 @@
                 <w:sz w:val="20"/>
                 <w:szCs w:val="20"/>
               </w:rPr>
-              <w:t xml:space="preserve">«Lo siento, pero no puedo ayudarte con recetas de pizza. ¿Hay algo más sobre los cursos que necesitas saber? ¿Quieres información sobre el curso Ciencias Naturales — Saber 11 o Lectura Crítica — Saber 11?»</w:t>
+              <w:t xml:space="preserve">«Lo siento, pero no puedo ayudarte con eso. ¿Quieres saber más sobre los cursos que tenemos disponibles?»</w:t>
             </w:r>
           </w:p>
         </w:tc>
@@ -4146,7 +4146,7 @@
                 <w:sz w:val="20"/>
                 <w:szCs w:val="20"/>
               </w:rPr>
-              <w:t xml:space="preserve">C4: Correcto · 1:23 · Anexo D, Caso 10</w:t>
+              <w:t xml:space="preserve">C4: Correcto · 1:02 · Anexo D, Caso 10</w:t>
             </w:r>
           </w:p>
         </w:tc>
@@ -4249,7 +4249,7 @@
                 <w:sz w:val="20"/>
                 <w:szCs w:val="20"/>
               </w:rPr>
-              <w:t xml:space="preserve">«Lo siento, pero no puedo ayudarte con preguntas fuera del contexto de los cursos disponibles en la plataforma. ¿Quieres saber qué cursos tenemos disponibles o necesitas ayuda con algo relacionado a ellos?»</w:t>
+              <w:t xml:space="preserve">«Lo siento, pero no puedo ayudarte a encontrar la capital de Francia. ¿Quieres saber más sobre los cursos que tenemos disponibles? ¿Te gustaría saber algo específico sobre Ciencias Naturales o Lectura Crítica?»</w:t>
             </w:r>
           </w:p>
         </w:tc>
@@ -4273,7 +4273,7 @@
                 <w:sz w:val="20"/>
                 <w:szCs w:val="20"/>
               </w:rPr>
-              <w:t xml:space="preserve">C4: Correcto · 1:02 · Anexo D, Caso 11</w:t>
+              <w:t xml:space="preserve">C4: Correcto · 0:57 · Anexo D, Caso 11</w:t>
             </w:r>
           </w:p>
         </w:tc>
@@ -4376,7 +4376,7 @@
                 <w:sz w:val="20"/>
                 <w:szCs w:val="20"/>
               </w:rPr>
-              <w:t xml:space="preserve">«Lo siento, pero la plataforma es para cursos académicos como Ciencias Naturales — Saber 11 y Lectura Crítica — Saber 11, no para matemáticas. ¿Quieres saber más sobre alguno de estos cursos o necesitas ayuda con algo específico en ellos?»</w:t>
+              <w:t xml:space="preserve">«Lo siento, pero no puedo ayudarte con la tarea de matemáticas. ¿Quieres saber más sobre los cursos que tenemos disponibles? … ¿O prefieres que te explique cómo encontrar recursos para apoyar tus estudios de matemáticas en general?»</w:t>
             </w:r>
           </w:p>
         </w:tc>
@@ -4400,7 +4400,7 @@
                 <w:sz w:val="20"/>
                 <w:szCs w:val="20"/>
               </w:rPr>
-              <w:t xml:space="preserve">C4: Correcto · 1:12 · Anexo D, Caso 12</w:t>
+              <w:t xml:space="preserve">C4: Correcto · 1:17 · Anexo D, Caso 12</w:t>
             </w:r>
           </w:p>
         </w:tc>
@@ -4503,7 +4503,7 @@
                 <w:sz w:val="20"/>
                 <w:szCs w:val="20"/>
               </w:rPr>
-              <w:t xml:space="preserve">«La Lectura Crítica es importante para el Saber 11 porque ayuda a desarrollar habilidades como la comprensión textual, la argumentación y el pensamiento crítico… es clave en la prueba del ICFES. ¿Qué te parece si hablamos un poco más sobre cómo puedes aplicar estas habilidades en tu estudio?»</w:t>
+              <w:t xml:space="preserve">«La Lectura Crítica es importante para el Saber 11 porque ayuda a desarrollar habilidades como la comprensión textual, la argumentación y el pensamiento crítico, que son fundamentales para poder analizar e interpretar textos de manera efectiva. ¿Te gustaría saber algo específico sobre las unidades o actividades del curso de Lectura Crítica?»</w:t>
             </w:r>
           </w:p>
         </w:tc>
@@ -4527,7 +4527,7 @@
                 <w:sz w:val="20"/>
                 <w:szCs w:val="20"/>
               </w:rPr>
-              <w:t xml:space="preserve">C5: Correcto · 1:34 · Anexo D, Caso 13</w:t>
+              <w:t xml:space="preserve">C5: Correcto · 1:50 · Anexo D, Caso 13</w:t>
             </w:r>
           </w:p>
         </w:tc>
@@ -4630,7 +4630,7 @@
                 <w:sz w:val="20"/>
                 <w:szCs w:val="20"/>
               </w:rPr>
-              <w:t xml:space="preserve">«El curso de Ciencias Naturales es un curso muy completo que prepara a los estudiantes para la prueba Saber 11 del ICFES, cubriendo temas como Biología, Química, Física y Ciencias de la Tierra. Cada unidad tiene su propio peso en la prueba… ¿Qué aspecto específico del curso te preocupa?»</w:t>
+              <w:t xml:space="preserve">«El curso de Ciencias Naturales es bastante completo, cubre Biología, Química, Física y Ciencias de la Tierra, lo que puede ser un poco desafiante para algunos estudiantes… el curso está organizado en 4 unidades claras y concretas… ¿Qué unidad te gustaría saber más sobre?»</w:t>
             </w:r>
           </w:p>
         </w:tc>
@@ -4654,7 +4654,7 @@
                 <w:sz w:val="20"/>
                 <w:szCs w:val="20"/>
               </w:rPr>
-              <w:t xml:space="preserve">C5: Correcto · 2:32 · Anexo D, Caso 14</w:t>
+              <w:t xml:space="preserve">C5: Correcto · 2:02 · Anexo D, Caso 14</w:t>
             </w:r>
           </w:p>
         </w:tc>
@@ -4757,7 +4757,7 @@
                 <w:sz w:val="20"/>
                 <w:szCs w:val="20"/>
               </w:rPr>
-              <w:t xml:space="preserve">«…ambos son muy buenos y útiles para la preparación del Saber 11. El curso de Ciencias Naturales es muy completo y cubre Biología, Química, Física y Ciencias de la Tierra… el curso de Lectura Crítica es ideal si quieres mejorar tus habilidades de comprensión textual, argumentación y pensamiento crítico… ¿Cuál crees que te interesaría más?»</w:t>
+              <w:t xml:space="preserve">«Bueno, tenemos dos cursos disponibles… Ambos están diseñados para ayudarte a prepararte para la prueba Saber 11 del ICFES.» Describe Ciencias Naturales (cuatro unidades; la de mayor peso es Biología: Entorno Vivo, 35 %) y Lectura Crítica (comprensión, argumentación y pensamiento crítico, también en cuatro unidades) y pregunta por cuál tiene preferencia.</w:t>
             </w:r>
           </w:p>
         </w:tc>
@@ -4781,7 +4781,7 @@
                 <w:sz w:val="20"/>
                 <w:szCs w:val="20"/>
               </w:rPr>
-              <w:t xml:space="preserve">C5: Correcto · 3:23 · Anexo D, Caso 15</w:t>
+              <w:t xml:space="preserve">C5: Correcto · 3:04 · Anexo D, Caso 15</w:t>
             </w:r>
           </w:p>
         </w:tc>
@@ -4820,7 +4820,7 @@
           <w:sz w:val="22"/>
           <w:szCs w:val="22"/>
         </w:rPr>
-        <w:t xml:space="preserve">Cada caso se evaluó de forma binaria (correcto o incorrecto) frente al criterio de aceptación de su categoría, comparando la respuesta obtenida con la información registrada en Moodle, que se obtuvo del bridge. La precisión de una categoría se calcula como (respuestas correctas ÷ casos evaluados) × 100, y la precisión global como (total de respuestas correctas ÷ 15) × 100; así, 15 de 15 casos correctos equivalen a una precisión del 100 %. La muestra fue de 15 casos (tres formulaciones por categoría), con una sola ejecución por caso, evaluados por la autora; no se descartó ni repitió ninguna respuesta. Las categorías 1 a 3 son reproducibles, porque sus respuestas se construyen con reglas y con los datos del bridge, sin intervención del modelo de lenguaje; las categorías 4 y 5 dependen del modelo y pueden variar entre ejecuciones, y en la categoría 5 el criterio es cualitativo. Por ello, el 100 % describe esta muestra y no constituye una garantía para cualquier consulta.</w:t>
+        <w:t xml:space="preserve">Cada caso se evaluó de forma binaria (correcto o incorrecto) frente al criterio de aceptación de su categoría, comparando la respuesta obtenida con la información registrada en Moodle, que se obtuvo del bridge. La precisión de una categoría se calcula como (respuestas correctas ÷ casos evaluados) × 100, y la precisión global como (total de respuestas correctas ÷ 15) × 100; así, 15 de 15 casos correctos equivalen a una precisión del 100 %. La muestra fue de 15 casos (tres formulaciones por categoría), con una sola ejecución por caso, realizada en la instancia real de Moodle del piloto (dos cursos) y evaluada por la autora; no se descartó ni repitió ninguna respuesta. El tiempo de cada caso es el de punta a punta, medido con cronómetro: incluye escribir la consulta, esperar la respuesta y leerla. En las categorías 1 a 3 la respuesta del propio sistema tarda menos de un segundo, por lo que ese tiempo corresponde casi por completo al usuario; en las categorías 4 y 5 la mayor parte es la generación del modelo de lenguaje. Las categorías 1 a 3 son reproducibles, porque sus respuestas se construyen con reglas y con los datos del bridge, sin intervención del modelo; las categorías 4 y 5 dependen del modelo y pueden variar entre ejecuciones, y en la categoría 5 el criterio es cualitativo. Por ello, el 100 % describe esta muestra y no constituye una garantía para cualquier consulta.</w:t>
       </w:r>
     </w:p>
     <w:tbl>

</xml_diff>